<commit_message>
fix: update completion status in README and correct team member details in report
</commit_message>
<xml_diff>
--- a/report/doc/Bao_cao_cuoi_ky_python_DA.docx
+++ b/report/doc/Bao_cao_cuoi_ky_python_DA.docx
@@ -287,64 +287,71 @@
           <w:color w:val="000000" w:themeColor="text1"/>
           <w:sz w:val="28"/>
         </w:rPr>
-        <w:t xml:space="preserve">: </w:t>
-      </w:r>
-    </w:p>
-    <w:p>
-      <w:pPr>
-        <w:rPr>
-          <w:color w:val="000000" w:themeColor="text1"/>
-          <w:sz w:val="28"/>
-        </w:rPr>
-      </w:pPr>
-    </w:p>
-    <w:p>
-      <w:pPr>
+        <w:t>:</w:t>
+      </w:r>
+      <w:r>
         <w:rPr>
           <w:color w:val="000000" w:themeColor="text1"/>
           <w:sz w:val="28"/>
           <w:lang w:val="en-US"/>
         </w:rPr>
-      </w:pPr>
+        <w:t xml:space="preserve"> </w:t>
+      </w:r>
       <w:r>
         <w:rPr>
           <w:color w:val="000000" w:themeColor="text1"/>
           <w:sz w:val="28"/>
         </w:rPr>
-        <w:t>Sinh viên thực hiện: Ưng Nguyễn Tiến Thành – 3120225</w:t>
-      </w:r>
-      <w:r>
+        <w:t>Đoàn Duy Bình</w:t>
+      </w:r>
+    </w:p>
+    <w:p>
+      <w:pPr>
+        <w:rPr>
+          <w:color w:val="000000" w:themeColor="text1"/>
+          <w:sz w:val="28"/>
+        </w:rPr>
+      </w:pPr>
+    </w:p>
+    <w:p>
+      <w:pPr>
         <w:rPr>
           <w:color w:val="000000" w:themeColor="text1"/>
           <w:sz w:val="28"/>
           <w:lang w:val="en-US"/>
         </w:rPr>
-        <w:t>1</w:t>
-      </w:r>
+      </w:pPr>
       <w:r>
         <w:rPr>
           <w:color w:val="000000" w:themeColor="text1"/>
           <w:sz w:val="28"/>
         </w:rPr>
-        <w:t>43 – 25CNTT2</w:t>
-      </w:r>
-    </w:p>
-    <w:p>
-      <w:pPr>
+        <w:t>Sinh viên thực hiện: Ưng Nguyễn Tiến Thành – 3120225</w:t>
+      </w:r>
+      <w:r>
         <w:rPr>
           <w:color w:val="000000" w:themeColor="text1"/>
           <w:sz w:val="28"/>
           <w:lang w:val="en-US"/>
         </w:rPr>
-      </w:pPr>
-      <w:r>
+        <w:t>1</w:t>
+      </w:r>
+      <w:r>
+        <w:rPr>
+          <w:color w:val="000000" w:themeColor="text1"/>
+          <w:sz w:val="28"/>
+        </w:rPr>
+        <w:t>43 – 25CNTT2</w:t>
+      </w:r>
+    </w:p>
+    <w:p>
+      <w:pPr>
         <w:rPr>
           <w:color w:val="000000" w:themeColor="text1"/>
           <w:sz w:val="28"/>
           <w:lang w:val="en-US"/>
         </w:rPr>
-        <w:tab/>
-      </w:r>
+      </w:pPr>
       <w:r>
         <w:rPr>
           <w:color w:val="000000" w:themeColor="text1"/>
@@ -360,14 +367,6 @@
           <w:lang w:val="en-US"/>
         </w:rPr>
         <w:tab/>
-        <w:t xml:space="preserve">   Trương Việt Hưng </w:t>
-      </w:r>
-      <w:r>
-        <w:rPr>
-          <w:color w:val="000000" w:themeColor="text1"/>
-          <w:sz w:val="28"/>
-        </w:rPr>
-        <w:t>–</w:t>
       </w:r>
       <w:r>
         <w:rPr>
@@ -375,14 +374,15 @@
           <w:sz w:val="28"/>
           <w:lang w:val="en-US"/>
         </w:rPr>
-        <w:t xml:space="preserve"> </w:t>
+        <w:tab/>
+        <w:t xml:space="preserve">   Trương Việt Hưng </w:t>
       </w:r>
       <w:r>
         <w:rPr>
           <w:color w:val="000000" w:themeColor="text1"/>
           <w:sz w:val="28"/>
         </w:rPr>
-        <w:t>3120225</w:t>
+        <w:t>–</w:t>
       </w:r>
       <w:r>
         <w:rPr>
@@ -390,14 +390,14 @@
           <w:sz w:val="28"/>
           <w:lang w:val="en-US"/>
         </w:rPr>
-        <w:t>061</w:t>
+        <w:t xml:space="preserve"> </w:t>
       </w:r>
       <w:r>
         <w:rPr>
           <w:color w:val="000000" w:themeColor="text1"/>
           <w:sz w:val="28"/>
         </w:rPr>
-        <w:t xml:space="preserve"> – 25CNTT</w:t>
+        <w:t>3120225</w:t>
       </w:r>
       <w:r>
         <w:rPr>
@@ -405,25 +405,32 @@
           <w:sz w:val="28"/>
           <w:lang w:val="en-US"/>
         </w:rPr>
-        <w:t>1</w:t>
-      </w:r>
-    </w:p>
-    <w:p>
-      <w:pPr>
+        <w:t>061</w:t>
+      </w:r>
+      <w:r>
+        <w:rPr>
+          <w:color w:val="000000" w:themeColor="text1"/>
+          <w:sz w:val="28"/>
+        </w:rPr>
+        <w:t xml:space="preserve"> – 25CNTT</w:t>
+      </w:r>
+      <w:r>
         <w:rPr>
           <w:color w:val="000000" w:themeColor="text1"/>
           <w:sz w:val="28"/>
           <w:lang w:val="en-US"/>
         </w:rPr>
-      </w:pPr>
-      <w:r>
+        <w:t>1</w:t>
+      </w:r>
+    </w:p>
+    <w:p>
+      <w:pPr>
         <w:rPr>
           <w:color w:val="000000" w:themeColor="text1"/>
           <w:sz w:val="28"/>
           <w:lang w:val="en-US"/>
         </w:rPr>
-        <w:tab/>
-      </w:r>
+      </w:pPr>
       <w:r>
         <w:rPr>
           <w:color w:val="000000" w:themeColor="text1"/>
@@ -439,7 +446,6 @@
           <w:lang w:val="en-US"/>
         </w:rPr>
         <w:tab/>
-        <w:t xml:space="preserve">   </w:t>
       </w:r>
       <w:r>
         <w:rPr>
@@ -447,14 +453,8 @@
           <w:sz w:val="28"/>
           <w:lang w:val="en-US"/>
         </w:rPr>
-        <w:t xml:space="preserve">Nguyễn Hải Lâm </w:t>
-      </w:r>
-      <w:r>
-        <w:rPr>
-          <w:color w:val="000000" w:themeColor="text1"/>
-          <w:sz w:val="28"/>
-        </w:rPr>
-        <w:t>3120225</w:t>
+        <w:tab/>
+        <w:t xml:space="preserve">   </w:t>
       </w:r>
       <w:r>
         <w:rPr>
@@ -462,7 +462,14 @@
           <w:sz w:val="28"/>
           <w:lang w:val="en-US"/>
         </w:rPr>
-        <w:t>0</w:t>
+        <w:t xml:space="preserve">Nguyễn Hải Lâm </w:t>
+      </w:r>
+      <w:r>
+        <w:rPr>
+          <w:color w:val="000000" w:themeColor="text1"/>
+          <w:sz w:val="28"/>
+        </w:rPr>
+        <w:t>3120225</w:t>
       </w:r>
       <w:r>
         <w:rPr>
@@ -470,7 +477,7 @@
           <w:sz w:val="28"/>
           <w:lang w:val="en-US"/>
         </w:rPr>
-        <w:t xml:space="preserve">79 </w:t>
+        <w:t xml:space="preserve">079 </w:t>
       </w:r>
       <w:r>
         <w:rPr>
@@ -511,6 +518,40 @@
           <w:lang w:val="en-US"/>
         </w:rPr>
       </w:pPr>
+      <w:r>
+        <w:rPr>
+          <w:color w:val="000000" w:themeColor="text1"/>
+          <w:sz w:val="28"/>
+          <w:lang w:val="en-US"/>
+        </w:rPr>
+        <w:tab/>
+      </w:r>
+      <w:r>
+        <w:rPr>
+          <w:color w:val="000000" w:themeColor="text1"/>
+          <w:sz w:val="28"/>
+          <w:lang w:val="en-US"/>
+        </w:rPr>
+        <w:tab/>
+      </w:r>
+      <w:r>
+        <w:rPr>
+          <w:color w:val="000000" w:themeColor="text1"/>
+          <w:sz w:val="28"/>
+          <w:lang w:val="en-US"/>
+        </w:rPr>
+        <w:tab/>
+        <w:t xml:space="preserve">   Dụng Văn Nhật Tân 3120225134 – 25CNTT1</w:t>
+      </w:r>
+    </w:p>
+    <w:p>
+      <w:pPr>
+        <w:rPr>
+          <w:color w:val="000000" w:themeColor="text1"/>
+          <w:sz w:val="28"/>
+          <w:lang w:val="en-US"/>
+        </w:rPr>
+      </w:pPr>
     </w:p>
     <w:p>
       <w:pPr>
@@ -537,7 +578,23 @@
           <w:color w:val="000000" w:themeColor="text1"/>
           <w:sz w:val="28"/>
         </w:rPr>
-        <w:t>Đà Nẵng, ngày 9 tháng 8 năm 2026</w:t>
+        <w:lastRenderedPageBreak/>
+        <w:t xml:space="preserve">Đà Nẵng, ngày </w:t>
+      </w:r>
+      <w:r>
+        <w:rPr>
+          <w:color w:val="000000" w:themeColor="text1"/>
+          <w:sz w:val="28"/>
+          <w:lang w:val="en-US"/>
+        </w:rPr>
+        <w:t>18</w:t>
+      </w:r>
+      <w:r>
+        <w:rPr>
+          <w:color w:val="000000" w:themeColor="text1"/>
+          <w:sz w:val="28"/>
+        </w:rPr>
+        <w:t xml:space="preserve"> tháng 8 năm 2026</w:t>
       </w:r>
       <w:bookmarkEnd w:id="0"/>
     </w:p>
@@ -545,6 +602,8 @@
       <w:pPr>
         <w:pStyle w:val="Heading1"/>
         <w:rPr>
+          <w:b w:val="0"/>
+          <w:bCs w:val="0"/>
           <w:color w:val="auto"/>
         </w:rPr>
       </w:pPr>
@@ -554,10 +613,11 @@
       <w:r>
         <w:rPr>
           <w:rStyle w:val="Strong"/>
+          <w:b/>
+          <w:bCs/>
           <w:sz w:val="56"/>
           <w:szCs w:val="56"/>
         </w:rPr>
-        <w:lastRenderedPageBreak/>
         <w:t>MỤC LỤC</w:t>
       </w:r>
       <w:bookmarkEnd w:id="1"/>
@@ -569,6 +629,7 @@
         <w:rPr>
           <w:b w:val="0"/>
           <w:bCs w:val="0"/>
+          <w:noProof w:val="0"/>
         </w:rPr>
         <w:id w:val="1368567280"/>
         <w:docPartObj>
@@ -5834,15 +5895,9 @@
     <w:p>
       <w:pPr>
         <w:pStyle w:val="Heading3"/>
-        <w:rPr>
-          <w:color w:val="2F5496" w:themeColor="accent1" w:themeShade="BF"/>
-        </w:rPr>
       </w:pPr>
       <w:bookmarkStart w:id="11" w:name="_Toc237780403"/>
       <w:r>
-        <w:rPr>
-          <w:color w:val="2F5496" w:themeColor="accent1" w:themeShade="BF"/>
-        </w:rPr>
         <w:t>1.6.1 Nguyên tắc phân chia</w:t>
       </w:r>
       <w:bookmarkEnd w:id="11"/>
@@ -6023,15 +6078,9 @@
     <w:p>
       <w:pPr>
         <w:pStyle w:val="Heading3"/>
-        <w:rPr>
-          <w:color w:val="2F5496" w:themeColor="accent1" w:themeShade="BF"/>
-        </w:rPr>
       </w:pPr>
       <w:bookmarkStart w:id="12" w:name="_Toc237780404"/>
       <w:r>
-        <w:rPr>
-          <w:color w:val="2F5496" w:themeColor="accent1" w:themeShade="BF"/>
-        </w:rPr>
         <w:t>1.6.2 Bảng phân công</w:t>
       </w:r>
       <w:bookmarkEnd w:id="12"/>
@@ -6192,21 +6241,10 @@
             </w:pPr>
             <w:r>
               <w:rPr>
-                <w:i/>
-              </w:rPr>
-              <w:t xml:space="preserve">[Họ tên thành viên </w:t>
-            </w:r>
-            <w:r>
-              <w:rPr>
-                <w:i/>
-              </w:rPr>
-              <w:t>1</w:t>
-            </w:r>
-            <w:r>
-              <w:rPr>
-                <w:i/>
-              </w:rPr>
-              <w:t>]</w:t>
+                <w:color w:val="000000" w:themeColor="text1"/>
+                <w:szCs w:val="20"/>
+              </w:rPr>
+              <w:t>Dụng Văn Nhật Tân</w:t>
             </w:r>
           </w:p>
         </w:tc>
@@ -6376,9 +6414,10 @@
             </w:pPr>
             <w:r>
               <w:rPr>
-                <w:i/>
-              </w:rPr>
-              <w:t>[Họ tên thành viên 2]</w:t>
+                <w:color w:val="000000" w:themeColor="text1"/>
+                <w:szCs w:val="20"/>
+              </w:rPr>
+              <w:t>Nguyễn Hải Lâm</w:t>
             </w:r>
           </w:p>
         </w:tc>
@@ -6497,12 +6536,16 @@
           <w:p>
             <w:pPr>
               <w:pStyle w:val="TableContents"/>
-            </w:pPr>
-            <w:r>
-              <w:rPr>
-                <w:i/>
-              </w:rPr>
-              <w:t>[Họ tên thành viên 3]</w:t>
+              <w:rPr>
+                <w:szCs w:val="20"/>
+              </w:rPr>
+            </w:pPr>
+            <w:r>
+              <w:rPr>
+                <w:color w:val="000000" w:themeColor="text1"/>
+                <w:szCs w:val="20"/>
+              </w:rPr>
+              <w:t>Trương Việt Hưng</w:t>
             </w:r>
           </w:p>
         </w:tc>
@@ -6610,10 +6653,7 @@
               <w:pStyle w:val="TableContents"/>
             </w:pPr>
             <w:r>
-              <w:rPr>
-                <w:i/>
-              </w:rPr>
-              <w:t>[Họ tên thành viên 4]</w:t>
+              <w:t>Ưng Nguyễn Tiến Thành</w:t>
             </w:r>
           </w:p>
         </w:tc>
@@ -6709,15 +6749,9 @@
     <w:p>
       <w:pPr>
         <w:pStyle w:val="Heading3"/>
-        <w:rPr>
-          <w:color w:val="2F5496" w:themeColor="accent1" w:themeShade="BF"/>
-        </w:rPr>
       </w:pPr>
       <w:bookmarkStart w:id="13" w:name="_Toc237780405"/>
       <w:r>
-        <w:rPr>
-          <w:color w:val="2F5496" w:themeColor="accent1" w:themeShade="BF"/>
-        </w:rPr>
         <w:t>1.6.3 Phần công việc chung của cả nhóm</w:t>
       </w:r>
       <w:bookmarkEnd w:id="13"/>
@@ -7051,15 +7085,9 @@
     <w:p>
       <w:pPr>
         <w:pStyle w:val="Heading3"/>
-        <w:rPr>
-          <w:color w:val="2F5496" w:themeColor="accent1" w:themeShade="BF"/>
-        </w:rPr>
       </w:pPr>
       <w:bookmarkStart w:id="14" w:name="_Toc237780406"/>
       <w:r>
-        <w:rPr>
-          <w:color w:val="2F5496" w:themeColor="accent1" w:themeShade="BF"/>
-        </w:rPr>
         <w:t>1.6.4 Bảng tỷ lệ đóng góp</w:t>
       </w:r>
       <w:bookmarkEnd w:id="14"/>
@@ -7090,7 +7118,7 @@
         </w:trPr>
         <w:tc>
           <w:tcPr>
-            <w:tcW w:w="1927" w:type="dxa"/>
+            <w:tcW w:w="1925" w:type="dxa"/>
             <w:tcBorders>
               <w:top w:val="single" w:sz="4" w:space="0" w:color="000000"/>
               <w:left w:val="single" w:sz="4" w:space="0" w:color="000000"/>
@@ -7110,7 +7138,7 @@
         </w:tc>
         <w:tc>
           <w:tcPr>
-            <w:tcW w:w="1928" w:type="dxa"/>
+            <w:tcW w:w="1926" w:type="dxa"/>
             <w:tcBorders>
               <w:top w:val="single" w:sz="4" w:space="0" w:color="000000"/>
               <w:left w:val="single" w:sz="4" w:space="0" w:color="000000"/>
@@ -7129,7 +7157,7 @@
         </w:tc>
         <w:tc>
           <w:tcPr>
-            <w:tcW w:w="1927" w:type="dxa"/>
+            <w:tcW w:w="1925" w:type="dxa"/>
             <w:tcBorders>
               <w:top w:val="single" w:sz="4" w:space="0" w:color="000000"/>
               <w:left w:val="single" w:sz="4" w:space="0" w:color="000000"/>
@@ -7148,7 +7176,7 @@
         </w:tc>
         <w:tc>
           <w:tcPr>
-            <w:tcW w:w="1928" w:type="dxa"/>
+            <w:tcW w:w="1926" w:type="dxa"/>
             <w:tcBorders>
               <w:top w:val="single" w:sz="4" w:space="0" w:color="000000"/>
               <w:left w:val="single" w:sz="4" w:space="0" w:color="000000"/>
@@ -7167,7 +7195,7 @@
         </w:tc>
         <w:tc>
           <w:tcPr>
-            <w:tcW w:w="1928" w:type="dxa"/>
+            <w:tcW w:w="1926" w:type="dxa"/>
             <w:tcBorders>
               <w:top w:val="single" w:sz="4" w:space="0" w:color="000000"/>
               <w:left w:val="single" w:sz="4" w:space="0" w:color="000000"/>
@@ -7189,39 +7217,28 @@
       <w:tr>
         <w:tc>
           <w:tcPr>
-            <w:tcW w:w="1927" w:type="dxa"/>
-            <w:tcBorders>
-              <w:left w:val="single" w:sz="4" w:space="0" w:color="000000"/>
-              <w:bottom w:val="single" w:sz="4" w:space="0" w:color="000000"/>
-            </w:tcBorders>
-          </w:tcPr>
-          <w:p>
-            <w:pPr>
-              <w:pStyle w:val="TableContents"/>
-            </w:pPr>
-            <w:r>
-              <w:rPr>
-                <w:i/>
-              </w:rPr>
-              <w:t xml:space="preserve">[Thành viên </w:t>
-            </w:r>
-            <w:r>
-              <w:rPr>
-                <w:i/>
-              </w:rPr>
-              <w:t>1</w:t>
-            </w:r>
-            <w:r>
-              <w:rPr>
-                <w:i/>
-              </w:rPr>
-              <w:t>]</w:t>
-            </w:r>
-          </w:p>
-        </w:tc>
-        <w:tc>
-          <w:tcPr>
-            <w:tcW w:w="1928" w:type="dxa"/>
+            <w:tcW w:w="1925" w:type="dxa"/>
+            <w:tcBorders>
+              <w:left w:val="single" w:sz="4" w:space="0" w:color="000000"/>
+              <w:bottom w:val="single" w:sz="4" w:space="0" w:color="000000"/>
+            </w:tcBorders>
+          </w:tcPr>
+          <w:p>
+            <w:pPr>
+              <w:pStyle w:val="TableContents"/>
+            </w:pPr>
+            <w:r>
+              <w:rPr>
+                <w:color w:val="000000" w:themeColor="text1"/>
+                <w:szCs w:val="20"/>
+              </w:rPr>
+              <w:t>Dụng Văn Nhật Tân</w:t>
+            </w:r>
+          </w:p>
+        </w:tc>
+        <w:tc>
+          <w:tcPr>
+            <w:tcW w:w="1926" w:type="dxa"/>
             <w:tcBorders>
               <w:left w:val="single" w:sz="4" w:space="0" w:color="000000"/>
               <w:bottom w:val="single" w:sz="4" w:space="0" w:color="000000"/>
@@ -7238,41 +7255,44 @@
         </w:tc>
         <w:tc>
           <w:tcPr>
-            <w:tcW w:w="1927" w:type="dxa"/>
-            <w:tcBorders>
-              <w:left w:val="single" w:sz="4" w:space="0" w:color="000000"/>
-              <w:bottom w:val="single" w:sz="4" w:space="0" w:color="000000"/>
-            </w:tcBorders>
-          </w:tcPr>
-          <w:p>
-            <w:pPr>
-              <w:pStyle w:val="TableContents"/>
-            </w:pPr>
-            <w:r>
-              <w:t>Báo cáo, kiểm thử, tích hợp, thuyết trình</w:t>
-            </w:r>
-          </w:p>
-        </w:tc>
-        <w:tc>
-          <w:tcPr>
-            <w:tcW w:w="1928" w:type="dxa"/>
-            <w:tcBorders>
-              <w:left w:val="single" w:sz="4" w:space="0" w:color="000000"/>
-              <w:bottom w:val="single" w:sz="4" w:space="0" w:color="000000"/>
-            </w:tcBorders>
-          </w:tcPr>
-          <w:p>
-            <w:pPr>
-              <w:pStyle w:val="TableContents"/>
-            </w:pPr>
-            <w:r>
-              <w:t>......%</w:t>
-            </w:r>
-          </w:p>
-        </w:tc>
-        <w:tc>
-          <w:tcPr>
-            <w:tcW w:w="1928" w:type="dxa"/>
+            <w:tcW w:w="1925" w:type="dxa"/>
+            <w:tcBorders>
+              <w:left w:val="single" w:sz="4" w:space="0" w:color="000000"/>
+              <w:bottom w:val="single" w:sz="4" w:space="0" w:color="000000"/>
+            </w:tcBorders>
+          </w:tcPr>
+          <w:p>
+            <w:pPr>
+              <w:pStyle w:val="TableContents"/>
+            </w:pPr>
+            <w:r>
+              <w:t>Báo cáo, kiểm thử, thuyết trình</w:t>
+            </w:r>
+          </w:p>
+        </w:tc>
+        <w:tc>
+          <w:tcPr>
+            <w:tcW w:w="1926" w:type="dxa"/>
+            <w:tcBorders>
+              <w:left w:val="single" w:sz="4" w:space="0" w:color="000000"/>
+              <w:bottom w:val="single" w:sz="4" w:space="0" w:color="000000"/>
+            </w:tcBorders>
+          </w:tcPr>
+          <w:p>
+            <w:pPr>
+              <w:pStyle w:val="TableContents"/>
+            </w:pPr>
+            <w:r>
+              <w:t>20</w:t>
+            </w:r>
+            <w:r>
+              <w:t>%</w:t>
+            </w:r>
+          </w:p>
+        </w:tc>
+        <w:tc>
+          <w:tcPr>
+            <w:tcW w:w="1926" w:type="dxa"/>
             <w:tcBorders>
               <w:left w:val="single" w:sz="4" w:space="0" w:color="000000"/>
               <w:bottom w:val="single" w:sz="4" w:space="0" w:color="000000"/>
@@ -7289,27 +7309,28 @@
       <w:tr>
         <w:tc>
           <w:tcPr>
-            <w:tcW w:w="1927" w:type="dxa"/>
-            <w:tcBorders>
-              <w:left w:val="single" w:sz="4" w:space="0" w:color="000000"/>
-              <w:bottom w:val="single" w:sz="4" w:space="0" w:color="000000"/>
-            </w:tcBorders>
-          </w:tcPr>
-          <w:p>
-            <w:pPr>
-              <w:pStyle w:val="TableContents"/>
-            </w:pPr>
-            <w:r>
-              <w:rPr>
-                <w:i/>
-              </w:rPr>
-              <w:t>[Thành viên 2]</w:t>
-            </w:r>
-          </w:p>
-        </w:tc>
-        <w:tc>
-          <w:tcPr>
-            <w:tcW w:w="1928" w:type="dxa"/>
+            <w:tcW w:w="1925" w:type="dxa"/>
+            <w:tcBorders>
+              <w:left w:val="single" w:sz="4" w:space="0" w:color="000000"/>
+              <w:bottom w:val="single" w:sz="4" w:space="0" w:color="000000"/>
+            </w:tcBorders>
+          </w:tcPr>
+          <w:p>
+            <w:pPr>
+              <w:pStyle w:val="TableContents"/>
+            </w:pPr>
+            <w:r>
+              <w:rPr>
+                <w:color w:val="000000" w:themeColor="text1"/>
+                <w:szCs w:val="20"/>
+              </w:rPr>
+              <w:t>Nguyễn Hải Lâm</w:t>
+            </w:r>
+          </w:p>
+        </w:tc>
+        <w:tc>
+          <w:tcPr>
+            <w:tcW w:w="1926" w:type="dxa"/>
             <w:tcBorders>
               <w:left w:val="single" w:sz="4" w:space="0" w:color="000000"/>
               <w:bottom w:val="single" w:sz="4" w:space="0" w:color="000000"/>
@@ -7326,7 +7347,7 @@
         </w:tc>
         <w:tc>
           <w:tcPr>
-            <w:tcW w:w="1927" w:type="dxa"/>
+            <w:tcW w:w="1925" w:type="dxa"/>
             <w:tcBorders>
               <w:left w:val="single" w:sz="4" w:space="0" w:color="000000"/>
               <w:bottom w:val="single" w:sz="4" w:space="0" w:color="000000"/>
@@ -7343,24 +7364,27 @@
         </w:tc>
         <w:tc>
           <w:tcPr>
-            <w:tcW w:w="1928" w:type="dxa"/>
-            <w:tcBorders>
-              <w:left w:val="single" w:sz="4" w:space="0" w:color="000000"/>
-              <w:bottom w:val="single" w:sz="4" w:space="0" w:color="000000"/>
-            </w:tcBorders>
-          </w:tcPr>
-          <w:p>
-            <w:pPr>
-              <w:pStyle w:val="TableContents"/>
-            </w:pPr>
-            <w:r>
-              <w:t>......%</w:t>
-            </w:r>
-          </w:p>
-        </w:tc>
-        <w:tc>
-          <w:tcPr>
-            <w:tcW w:w="1928" w:type="dxa"/>
+            <w:tcW w:w="1926" w:type="dxa"/>
+            <w:tcBorders>
+              <w:left w:val="single" w:sz="4" w:space="0" w:color="000000"/>
+              <w:bottom w:val="single" w:sz="4" w:space="0" w:color="000000"/>
+            </w:tcBorders>
+          </w:tcPr>
+          <w:p>
+            <w:pPr>
+              <w:pStyle w:val="TableContents"/>
+            </w:pPr>
+            <w:r>
+              <w:t>20</w:t>
+            </w:r>
+            <w:r>
+              <w:t>%</w:t>
+            </w:r>
+          </w:p>
+        </w:tc>
+        <w:tc>
+          <w:tcPr>
+            <w:tcW w:w="1926" w:type="dxa"/>
             <w:tcBorders>
               <w:left w:val="single" w:sz="4" w:space="0" w:color="000000"/>
               <w:bottom w:val="single" w:sz="4" w:space="0" w:color="000000"/>
@@ -7377,27 +7401,28 @@
       <w:tr>
         <w:tc>
           <w:tcPr>
-            <w:tcW w:w="1927" w:type="dxa"/>
-            <w:tcBorders>
-              <w:left w:val="single" w:sz="4" w:space="0" w:color="000000"/>
-              <w:bottom w:val="single" w:sz="4" w:space="0" w:color="000000"/>
-            </w:tcBorders>
-          </w:tcPr>
-          <w:p>
-            <w:pPr>
-              <w:pStyle w:val="TableContents"/>
-            </w:pPr>
-            <w:r>
-              <w:rPr>
-                <w:i/>
-              </w:rPr>
-              <w:t>[Thành viên 3]</w:t>
-            </w:r>
-          </w:p>
-        </w:tc>
-        <w:tc>
-          <w:tcPr>
-            <w:tcW w:w="1928" w:type="dxa"/>
+            <w:tcW w:w="1925" w:type="dxa"/>
+            <w:tcBorders>
+              <w:left w:val="single" w:sz="4" w:space="0" w:color="000000"/>
+              <w:bottom w:val="single" w:sz="4" w:space="0" w:color="000000"/>
+            </w:tcBorders>
+          </w:tcPr>
+          <w:p>
+            <w:pPr>
+              <w:pStyle w:val="TableContents"/>
+            </w:pPr>
+            <w:r>
+              <w:rPr>
+                <w:color w:val="000000" w:themeColor="text1"/>
+                <w:szCs w:val="20"/>
+              </w:rPr>
+              <w:t>Trương Việt Hưng</w:t>
+            </w:r>
+          </w:p>
+        </w:tc>
+        <w:tc>
+          <w:tcPr>
+            <w:tcW w:w="1926" w:type="dxa"/>
             <w:tcBorders>
               <w:left w:val="single" w:sz="4" w:space="0" w:color="000000"/>
               <w:bottom w:val="single" w:sz="4" w:space="0" w:color="000000"/>
@@ -7414,7 +7439,7 @@
         </w:tc>
         <w:tc>
           <w:tcPr>
-            <w:tcW w:w="1927" w:type="dxa"/>
+            <w:tcW w:w="1925" w:type="dxa"/>
             <w:tcBorders>
               <w:left w:val="single" w:sz="4" w:space="0" w:color="000000"/>
               <w:bottom w:val="single" w:sz="4" w:space="0" w:color="000000"/>
@@ -7431,24 +7456,27 @@
         </w:tc>
         <w:tc>
           <w:tcPr>
-            <w:tcW w:w="1928" w:type="dxa"/>
-            <w:tcBorders>
-              <w:left w:val="single" w:sz="4" w:space="0" w:color="000000"/>
-              <w:bottom w:val="single" w:sz="4" w:space="0" w:color="000000"/>
-            </w:tcBorders>
-          </w:tcPr>
-          <w:p>
-            <w:pPr>
-              <w:pStyle w:val="TableContents"/>
-            </w:pPr>
-            <w:r>
-              <w:t>......%</w:t>
-            </w:r>
-          </w:p>
-        </w:tc>
-        <w:tc>
-          <w:tcPr>
-            <w:tcW w:w="1928" w:type="dxa"/>
+            <w:tcW w:w="1926" w:type="dxa"/>
+            <w:tcBorders>
+              <w:left w:val="single" w:sz="4" w:space="0" w:color="000000"/>
+              <w:bottom w:val="single" w:sz="4" w:space="0" w:color="000000"/>
+            </w:tcBorders>
+          </w:tcPr>
+          <w:p>
+            <w:pPr>
+              <w:pStyle w:val="TableContents"/>
+            </w:pPr>
+            <w:r>
+              <w:t>20</w:t>
+            </w:r>
+            <w:r>
+              <w:t>%</w:t>
+            </w:r>
+          </w:p>
+        </w:tc>
+        <w:tc>
+          <w:tcPr>
+            <w:tcW w:w="1926" w:type="dxa"/>
             <w:tcBorders>
               <w:left w:val="single" w:sz="4" w:space="0" w:color="000000"/>
               <w:bottom w:val="single" w:sz="4" w:space="0" w:color="000000"/>
@@ -7465,27 +7493,24 @@
       <w:tr>
         <w:tc>
           <w:tcPr>
-            <w:tcW w:w="1927" w:type="dxa"/>
-            <w:tcBorders>
-              <w:left w:val="single" w:sz="4" w:space="0" w:color="000000"/>
-              <w:bottom w:val="single" w:sz="4" w:space="0" w:color="000000"/>
-            </w:tcBorders>
-          </w:tcPr>
-          <w:p>
-            <w:pPr>
-              <w:pStyle w:val="TableContents"/>
-            </w:pPr>
-            <w:r>
-              <w:rPr>
-                <w:i/>
-              </w:rPr>
-              <w:t>[Thành viên 4]</w:t>
-            </w:r>
-          </w:p>
-        </w:tc>
-        <w:tc>
-          <w:tcPr>
-            <w:tcW w:w="1928" w:type="dxa"/>
+            <w:tcW w:w="1925" w:type="dxa"/>
+            <w:tcBorders>
+              <w:left w:val="single" w:sz="4" w:space="0" w:color="000000"/>
+              <w:bottom w:val="single" w:sz="4" w:space="0" w:color="000000"/>
+            </w:tcBorders>
+          </w:tcPr>
+          <w:p>
+            <w:pPr>
+              <w:pStyle w:val="TableContents"/>
+            </w:pPr>
+            <w:r>
+              <w:t>Ưng Nguyễn Tiến Thành</w:t>
+            </w:r>
+          </w:p>
+        </w:tc>
+        <w:tc>
+          <w:tcPr>
+            <w:tcW w:w="1926" w:type="dxa"/>
             <w:tcBorders>
               <w:left w:val="single" w:sz="4" w:space="0" w:color="000000"/>
               <w:bottom w:val="single" w:sz="4" w:space="0" w:color="000000"/>
@@ -7502,41 +7527,44 @@
         </w:tc>
         <w:tc>
           <w:tcPr>
-            <w:tcW w:w="1927" w:type="dxa"/>
-            <w:tcBorders>
-              <w:left w:val="single" w:sz="4" w:space="0" w:color="000000"/>
-              <w:bottom w:val="single" w:sz="4" w:space="0" w:color="000000"/>
-            </w:tcBorders>
-          </w:tcPr>
-          <w:p>
-            <w:pPr>
-              <w:pStyle w:val="TableContents"/>
-            </w:pPr>
-            <w:r>
-              <w:t>Báo cáo, kiểm thử, thuyết trình</w:t>
-            </w:r>
-          </w:p>
-        </w:tc>
-        <w:tc>
-          <w:tcPr>
-            <w:tcW w:w="1928" w:type="dxa"/>
-            <w:tcBorders>
-              <w:left w:val="single" w:sz="4" w:space="0" w:color="000000"/>
-              <w:bottom w:val="single" w:sz="4" w:space="0" w:color="000000"/>
-            </w:tcBorders>
-          </w:tcPr>
-          <w:p>
-            <w:pPr>
-              <w:pStyle w:val="TableContents"/>
-            </w:pPr>
-            <w:r>
-              <w:t>......%</w:t>
-            </w:r>
-          </w:p>
-        </w:tc>
-        <w:tc>
-          <w:tcPr>
-            <w:tcW w:w="1928" w:type="dxa"/>
+            <w:tcW w:w="1925" w:type="dxa"/>
+            <w:tcBorders>
+              <w:left w:val="single" w:sz="4" w:space="0" w:color="000000"/>
+              <w:bottom w:val="single" w:sz="4" w:space="0" w:color="000000"/>
+            </w:tcBorders>
+          </w:tcPr>
+          <w:p>
+            <w:pPr>
+              <w:pStyle w:val="TableContents"/>
+            </w:pPr>
+            <w:r>
+              <w:t>Báo cáo, kiểm thử, tích hợp, thuyết trình</w:t>
+            </w:r>
+          </w:p>
+        </w:tc>
+        <w:tc>
+          <w:tcPr>
+            <w:tcW w:w="1926" w:type="dxa"/>
+            <w:tcBorders>
+              <w:left w:val="single" w:sz="4" w:space="0" w:color="000000"/>
+              <w:bottom w:val="single" w:sz="4" w:space="0" w:color="000000"/>
+            </w:tcBorders>
+          </w:tcPr>
+          <w:p>
+            <w:pPr>
+              <w:pStyle w:val="TableContents"/>
+            </w:pPr>
+            <w:r>
+              <w:t>35</w:t>
+            </w:r>
+            <w:r>
+              <w:t>%</w:t>
+            </w:r>
+          </w:p>
+        </w:tc>
+        <w:tc>
+          <w:tcPr>
+            <w:tcW w:w="1926" w:type="dxa"/>
             <w:tcBorders>
               <w:left w:val="single" w:sz="4" w:space="0" w:color="000000"/>
               <w:bottom w:val="single" w:sz="4" w:space="0" w:color="000000"/>
@@ -7553,35 +7581,35 @@
       <w:tr>
         <w:tc>
           <w:tcPr>
-            <w:tcW w:w="1927" w:type="dxa"/>
-            <w:tcBorders>
-              <w:left w:val="single" w:sz="4" w:space="0" w:color="000000"/>
-              <w:bottom w:val="single" w:sz="4" w:space="0" w:color="000000"/>
-            </w:tcBorders>
-          </w:tcPr>
-          <w:p>
-            <w:pPr>
-              <w:pStyle w:val="TableContents"/>
-            </w:pPr>
-          </w:p>
-        </w:tc>
-        <w:tc>
-          <w:tcPr>
-            <w:tcW w:w="1928" w:type="dxa"/>
-            <w:tcBorders>
-              <w:left w:val="single" w:sz="4" w:space="0" w:color="000000"/>
-              <w:bottom w:val="single" w:sz="4" w:space="0" w:color="000000"/>
-            </w:tcBorders>
-          </w:tcPr>
-          <w:p>
-            <w:pPr>
-              <w:pStyle w:val="TableContents"/>
-            </w:pPr>
-          </w:p>
-        </w:tc>
-        <w:tc>
-          <w:tcPr>
-            <w:tcW w:w="1927" w:type="dxa"/>
+            <w:tcW w:w="1925" w:type="dxa"/>
+            <w:tcBorders>
+              <w:left w:val="single" w:sz="4" w:space="0" w:color="000000"/>
+              <w:bottom w:val="single" w:sz="4" w:space="0" w:color="000000"/>
+            </w:tcBorders>
+          </w:tcPr>
+          <w:p>
+            <w:pPr>
+              <w:pStyle w:val="TableContents"/>
+            </w:pPr>
+          </w:p>
+        </w:tc>
+        <w:tc>
+          <w:tcPr>
+            <w:tcW w:w="1926" w:type="dxa"/>
+            <w:tcBorders>
+              <w:left w:val="single" w:sz="4" w:space="0" w:color="000000"/>
+              <w:bottom w:val="single" w:sz="4" w:space="0" w:color="000000"/>
+            </w:tcBorders>
+          </w:tcPr>
+          <w:p>
+            <w:pPr>
+              <w:pStyle w:val="TableContents"/>
+            </w:pPr>
+          </w:p>
+        </w:tc>
+        <w:tc>
+          <w:tcPr>
+            <w:tcW w:w="1925" w:type="dxa"/>
             <w:tcBorders>
               <w:left w:val="single" w:sz="4" w:space="0" w:color="000000"/>
               <w:bottom w:val="single" w:sz="4" w:space="0" w:color="000000"/>
@@ -7601,7 +7629,7 @@
         </w:tc>
         <w:tc>
           <w:tcPr>
-            <w:tcW w:w="1928" w:type="dxa"/>
+            <w:tcW w:w="1926" w:type="dxa"/>
             <w:tcBorders>
               <w:left w:val="single" w:sz="4" w:space="0" w:color="000000"/>
               <w:bottom w:val="single" w:sz="4" w:space="0" w:color="000000"/>
@@ -7621,7 +7649,7 @@
         </w:tc>
         <w:tc>
           <w:tcPr>
-            <w:tcW w:w="1928" w:type="dxa"/>
+            <w:tcW w:w="1926" w:type="dxa"/>
             <w:tcBorders>
               <w:left w:val="single" w:sz="4" w:space="0" w:color="000000"/>
               <w:bottom w:val="single" w:sz="4" w:space="0" w:color="000000"/>
@@ -7677,7 +7705,6 @@
       </w:pPr>
       <w:bookmarkStart w:id="15" w:name="_Toc237780407"/>
       <w:r>
-        <w:lastRenderedPageBreak/>
         <w:t>CHƯƠNG 2: THIẾT KẾ MÔ HÌNH HƯỚNG ĐỐI TƯỢNG</w:t>
       </w:r>
       <w:bookmarkEnd w:id="15"/>
@@ -7707,7 +7734,7 @@
           <w:lang w:val="en-US"/>
         </w:rPr>
         <w:drawing>
-          <wp:inline distT="0" distB="0" distL="0" distR="0" wp14:anchorId="46CB45DA" wp14:editId="2E435B98">
+          <wp:inline distT="0" distB="0" distL="0" distR="0" wp14:anchorId="46CB45DA" wp14:editId="5C4BC47D">
             <wp:extent cx="6120130" cy="3672205"/>
             <wp:effectExtent l="0" t="0" r="0" b="4445"/>
             <wp:docPr id="2" name="Picture 2"/>
@@ -7760,6 +7787,7 @@
         <w:rPr>
           <w:rFonts w:ascii="Times New Roman" w:hAnsi="Times New Roman" w:cs="Times New Roman"/>
         </w:rPr>
+        <w:lastRenderedPageBreak/>
         <w:t>Hệ thống gồm hai nhánh kế thừa độc lập và một lớp điều phối trung tâm:</w:t>
       </w:r>
     </w:p>
@@ -8338,7 +8366,6 @@
         <w:rPr>
           <w:rFonts w:ascii="Times New Roman" w:hAnsi="Times New Roman" w:cs="Times New Roman"/>
         </w:rPr>
-        <w:lastRenderedPageBreak/>
         <w:t>Lớp Club quản lý ba thuộc tính nội bộ ở mức private: _members (dict), _events (dict) và _attendance (list). Nếu các tầng bên ngoài truy cập trực tiếp vào các thuộc tính này, chúng có thể vô tình làm biến đổi trạng thái nội bộ và phá vỡ các bất biến mà Club đảm bảo (ví dụ: quy tắc không cho phép điểm danh trùng). Để ngăn điều đó, Club chỉ công khai ba property chỉ đọc:</w:t>
       </w:r>
     </w:p>
@@ -8848,6 +8875,7 @@
               <w:rPr>
                 <w:rFonts w:ascii="Times New Roman" w:hAnsi="Times New Roman" w:cs="Times New Roman"/>
               </w:rPr>
+              <w:lastRenderedPageBreak/>
               <w:t>Lớp</w:t>
             </w:r>
           </w:p>
@@ -9433,7 +9461,6 @@
           <w:sz w:val="28"/>
           <w:szCs w:val="28"/>
         </w:rPr>
-        <w:lastRenderedPageBreak/>
         <w:t>engagement_score = Σ(trọng số các sự kiện đã tham gia) × hệ số nhân của thành viên</w:t>
       </w:r>
     </w:p>
@@ -9586,6 +9613,7 @@
           <w:sz w:val="24"/>
           <w:szCs w:val="24"/>
         </w:rPr>
+        <w:lastRenderedPageBreak/>
         <w:t>Exception</w:t>
       </w:r>
       <w:r>
@@ -9693,7 +9721,6 @@
           <w:rFonts w:ascii="Times New Roman" w:hAnsi="Times New Roman" w:cs="Times New Roman"/>
           <w:b/>
         </w:rPr>
-        <w:lastRenderedPageBreak/>
         <w:t>Xử lý ô rỗng.</w:t>
       </w:r>
       <w:r>
@@ -9895,7 +9922,6 @@
           <w:szCs w:val="24"/>
         </w:rPr>
         <w:br/>
-        <w:t xml:space="preserve">    class_name NVARCHAR(50)  NULL,</w:t>
       </w:r>
       <w:r>
         <w:rPr>
@@ -9903,6 +9929,15 @@
           <w:sz w:val="24"/>
           <w:szCs w:val="24"/>
         </w:rPr>
+        <w:lastRenderedPageBreak/>
+        <w:t xml:space="preserve">    class_name NVARCHAR(50)  NULL,</w:t>
+      </w:r>
+      <w:r>
+        <w:rPr>
+          <w:rFonts w:ascii="Times New Roman" w:hAnsi="Times New Roman" w:cs="Times New Roman"/>
+          <w:sz w:val="24"/>
+          <w:szCs w:val="24"/>
+        </w:rPr>
         <w:br/>
         <w:t xml:space="preserve">    join_date  DATE          NOT NULL,</w:t>
       </w:r>
@@ -10087,14 +10122,7 @@
         <w:rPr>
           <w:rFonts w:ascii="Times New Roman" w:hAnsi="Times New Roman" w:cs="Times New Roman"/>
         </w:rPr>
-        <w:t xml:space="preserve">Ràng buộc UNIQUE (member_id, event_id) là bản sao ở tầng cơ sở dữ liệu của quy tắc chống trùng </w:t>
-      </w:r>
-      <w:r>
-        <w:rPr>
-          <w:rFonts w:ascii="Times New Roman" w:hAnsi="Times New Roman" w:cs="Times New Roman"/>
-        </w:rPr>
-        <w:lastRenderedPageBreak/>
-        <w:t>đã được Club.check_in() đảm bảo ở tầng Python. Việc đặt ràng buộc ở cả hai nơi bảo vệ tính toàn vẹn ngay cả khi dữ liệu được ghi vào bằng con đường khác.</w:t>
+        <w:t>Ràng buộc UNIQUE (member_id, event_id) là bản sao ở tầng cơ sở dữ liệu của quy tắc chống trùng đã được Club.check_in() đảm bảo ở tầng Python. Việc đặt ràng buộc ở cả hai nơi bảo vệ tính toàn vẹn ngay cả khi dữ liệu được ghi vào bằng con đường khác.</w:t>
       </w:r>
     </w:p>
     <w:p>
@@ -10268,6 +10296,14 @@
           <w:szCs w:val="24"/>
         </w:rPr>
         <w:br/>
+      </w:r>
+      <w:r>
+        <w:rPr>
+          <w:rFonts w:ascii="Times New Roman" w:hAnsi="Times New Roman" w:cs="Times New Roman"/>
+          <w:sz w:val="24"/>
+          <w:szCs w:val="24"/>
+        </w:rPr>
+        <w:lastRenderedPageBreak/>
         <w:t xml:space="preserve">        ), 0)</w:t>
       </w:r>
       <w:r>
@@ -10442,14 +10478,7 @@
         <w:rPr>
           <w:rFonts w:ascii="Times New Roman" w:hAnsi="Times New Roman" w:cs="Times New Roman"/>
         </w:rPr>
-        <w:t xml:space="preserve">Ngoài truy vấn trên, sql_loader.py còn ba truy vấn khác: chi tiết từng lượt điểm danh (JOIN ba </w:t>
-      </w:r>
-      <w:r>
-        <w:rPr>
-          <w:rFonts w:ascii="Times New Roman" w:hAnsi="Times New Roman" w:cs="Times New Roman"/>
-        </w:rPr>
-        <w:lastRenderedPageBreak/>
-        <w:t>bảng), số người tham dự theo sự kiện (GROUP BY với LEFT JOIN để sự kiện không ai tham gia vẫn hiển thị 0), và tỉ lệ tham gia theo lớp.</w:t>
+        <w:t>Ngoài truy vấn trên, sql_loader.py còn ba truy vấn khác: chi tiết từng lượt điểm danh (JOIN ba bảng), số người tham dự theo sự kiện (GROUP BY với LEFT JOIN để sự kiện không ai tham gia vẫn hiển thị 0), và tỉ lệ tham gia theo lớp.</w:t>
       </w:r>
     </w:p>
     <w:p>
@@ -10613,6 +10642,7 @@
               <w:rPr>
                 <w:rFonts w:ascii="Times New Roman" w:hAnsi="Times New Roman" w:cs="Times New Roman"/>
               </w:rPr>
+              <w:lastRenderedPageBreak/>
               <w:t>Đại lượng</w:t>
             </w:r>
           </w:p>
@@ -10885,24 +10915,57 @@
     </w:p>
     <w:p>
       <w:pPr>
-        <w:pStyle w:val="BodyText"/>
-        <w:rPr>
-          <w:rFonts w:ascii="Times New Roman" w:hAnsi="Times New Roman" w:cs="Times New Roman"/>
-        </w:rPr>
-      </w:pPr>
-      <w:r>
-        <w:rPr>
-          <w:rFonts w:ascii="Times New Roman" w:hAnsi="Times New Roman" w:cs="Times New Roman"/>
+        <w:pStyle w:val="Heading2"/>
+      </w:pPr>
+      <w:bookmarkStart w:id="28" w:name="_Toc237780420"/>
+      <w:r>
+        <w:rPr>
+          <w:rFonts w:eastAsia="AR PL SungtiL GB"/>
+          <w:b w:val="0"/>
+          <w:bCs w:val="0"/>
           <w:i/>
-        </w:rPr>
-        <w:t>[HÌNH 2 — member_growth.png]</w:t>
-      </w:r>
-    </w:p>
-    <w:p>
-      <w:pPr>
-        <w:pStyle w:val="Heading2"/>
-      </w:pPr>
-      <w:bookmarkStart w:id="28" w:name="_Toc237780420"/>
+          <w:noProof/>
+          <w:color w:val="auto"/>
+          <w:sz w:val="24"/>
+          <w:szCs w:val="24"/>
+          <w:lang w:val="en-US" w:eastAsia="zh-CN" w:bidi="hi-IN"/>
+        </w:rPr>
+        <w:drawing>
+          <wp:inline distT="0" distB="0" distL="0" distR="0" wp14:anchorId="070B752C" wp14:editId="3A864BE1">
+            <wp:extent cx="6120130" cy="3825240"/>
+            <wp:effectExtent l="0" t="0" r="0" b="3810"/>
+            <wp:docPr id="1" name="Picture 1"/>
+            <wp:cNvGraphicFramePr>
+              <a:graphicFrameLocks xmlns:a="http://schemas.openxmlformats.org/drawingml/2006/main" noChangeAspect="1"/>
+            </wp:cNvGraphicFramePr>
+            <a:graphic xmlns:a="http://schemas.openxmlformats.org/drawingml/2006/main">
+              <a:graphicData uri="http://schemas.openxmlformats.org/drawingml/2006/picture">
+                <pic:pic xmlns:pic="http://schemas.openxmlformats.org/drawingml/2006/picture">
+                  <pic:nvPicPr>
+                    <pic:cNvPr id="1" name=""/>
+                    <pic:cNvPicPr/>
+                  </pic:nvPicPr>
+                  <pic:blipFill>
+                    <a:blip r:embed="rId10"/>
+                    <a:stretch>
+                      <a:fillRect/>
+                    </a:stretch>
+                  </pic:blipFill>
+                  <pic:spPr>
+                    <a:xfrm>
+                      <a:off x="0" y="0"/>
+                      <a:ext cx="6120130" cy="3825240"/>
+                    </a:xfrm>
+                    <a:prstGeom prst="rect">
+                      <a:avLst/>
+                    </a:prstGeom>
+                  </pic:spPr>
+                </pic:pic>
+              </a:graphicData>
+            </a:graphic>
+          </wp:inline>
+        </w:drawing>
+      </w:r>
       <w:r>
         <w:t>4.2. Chuẩn hóa z-score và phân loại bách phân vị</w:t>
       </w:r>
@@ -10999,7 +11062,6 @@
               <w:rPr>
                 <w:rFonts w:ascii="Times New Roman" w:hAnsi="Times New Roman" w:cs="Times New Roman"/>
               </w:rPr>
-              <w:lastRenderedPageBreak/>
               <w:t>Phân loại</w:t>
             </w:r>
           </w:p>
@@ -12252,6 +12314,65 @@
     </w:p>
     <w:p>
       <w:pPr>
+        <w:pStyle w:val="Heading2"/>
+      </w:pPr>
+      <w:bookmarkStart w:id="30" w:name="_Toc237780422"/>
+      <w:r>
+        <w:rPr>
+          <w:rFonts w:eastAsia="AR PL SungtiL GB"/>
+          <w:b w:val="0"/>
+          <w:bCs w:val="0"/>
+          <w:i/>
+          <w:noProof/>
+          <w:color w:val="auto"/>
+          <w:sz w:val="24"/>
+          <w:szCs w:val="24"/>
+          <w:lang w:val="en-US" w:eastAsia="zh-CN" w:bidi="hi-IN"/>
+        </w:rPr>
+        <w:lastRenderedPageBreak/>
+        <w:drawing>
+          <wp:inline distT="0" distB="0" distL="0" distR="0" wp14:anchorId="4F90A7C9" wp14:editId="269DAA37">
+            <wp:extent cx="6120130" cy="3825240"/>
+            <wp:effectExtent l="0" t="0" r="0" b="3810"/>
+            <wp:docPr id="5" name="Picture 5"/>
+            <wp:cNvGraphicFramePr>
+              <a:graphicFrameLocks xmlns:a="http://schemas.openxmlformats.org/drawingml/2006/main" noChangeAspect="1"/>
+            </wp:cNvGraphicFramePr>
+            <a:graphic xmlns:a="http://schemas.openxmlformats.org/drawingml/2006/main">
+              <a:graphicData uri="http://schemas.openxmlformats.org/drawingml/2006/picture">
+                <pic:pic xmlns:pic="http://schemas.openxmlformats.org/drawingml/2006/picture">
+                  <pic:nvPicPr>
+                    <pic:cNvPr id="1" name=""/>
+                    <pic:cNvPicPr/>
+                  </pic:nvPicPr>
+                  <pic:blipFill>
+                    <a:blip r:embed="rId11"/>
+                    <a:stretch>
+                      <a:fillRect/>
+                    </a:stretch>
+                  </pic:blipFill>
+                  <pic:spPr>
+                    <a:xfrm>
+                      <a:off x="0" y="0"/>
+                      <a:ext cx="6120130" cy="3825240"/>
+                    </a:xfrm>
+                    <a:prstGeom prst="rect">
+                      <a:avLst/>
+                    </a:prstGeom>
+                  </pic:spPr>
+                </pic:pic>
+              </a:graphicData>
+            </a:graphic>
+          </wp:inline>
+        </w:drawing>
+      </w:r>
+      <w:r>
+        <w:t>4.4. Kiểm định giả thuyết thống kê</w:t>
+      </w:r>
+      <w:bookmarkEnd w:id="30"/>
+    </w:p>
+    <w:p>
+      <w:pPr>
         <w:pStyle w:val="BodyText"/>
         <w:rPr>
           <w:rFonts w:ascii="Times New Roman" w:hAnsi="Times New Roman" w:cs="Times New Roman"/>
@@ -12260,32 +12381,6 @@
       <w:r>
         <w:rPr>
           <w:rFonts w:ascii="Times New Roman" w:hAnsi="Times New Roman" w:cs="Times New Roman"/>
-          <w:i/>
-        </w:rPr>
-        <w:t>[HÌNH 3 — churn_risk.png]</w:t>
-      </w:r>
-    </w:p>
-    <w:p>
-      <w:pPr>
-        <w:pStyle w:val="Heading2"/>
-      </w:pPr>
-      <w:bookmarkStart w:id="30" w:name="_Toc237780422"/>
-      <w:r>
-        <w:lastRenderedPageBreak/>
-        <w:t>4.4. Kiểm định giả thuyết thống kê</w:t>
-      </w:r>
-      <w:bookmarkEnd w:id="30"/>
-    </w:p>
-    <w:p>
-      <w:pPr>
-        <w:pStyle w:val="BodyText"/>
-        <w:rPr>
-          <w:rFonts w:ascii="Times New Roman" w:hAnsi="Times New Roman" w:cs="Times New Roman"/>
-        </w:rPr>
-      </w:pPr>
-      <w:r>
-        <w:rPr>
-          <w:rFonts w:ascii="Times New Roman" w:hAnsi="Times New Roman" w:cs="Times New Roman"/>
         </w:rPr>
         <w:t xml:space="preserve">Ba mục trên đều là thống kê </w:t>
       </w:r>
@@ -12306,15 +12401,9 @@
     <w:p>
       <w:pPr>
         <w:pStyle w:val="Heading3"/>
-        <w:rPr>
-          <w:color w:val="2F5496" w:themeColor="accent1" w:themeShade="BF"/>
-        </w:rPr>
       </w:pPr>
       <w:bookmarkStart w:id="31" w:name="_Toc237780423"/>
       <w:r>
-        <w:rPr>
-          <w:color w:val="2F5496" w:themeColor="accent1" w:themeShade="BF"/>
-        </w:rPr>
         <w:t>Kiểm định 1 — Chênh lệch giữa các lớp (Kruskal–Wallis)</w:t>
       </w:r>
       <w:bookmarkEnd w:id="31"/>
@@ -13059,6 +13148,7 @@
           <w:rFonts w:ascii="Times New Roman" w:hAnsi="Times New Roman" w:cs="Times New Roman"/>
           <w:b/>
         </w:rPr>
+        <w:lastRenderedPageBreak/>
         <w:t>Kết luận:</w:t>
       </w:r>
       <w:r>
@@ -13098,15 +13188,9 @@
     <w:p>
       <w:pPr>
         <w:pStyle w:val="Heading3"/>
-        <w:rPr>
-          <w:color w:val="2F5496" w:themeColor="accent1" w:themeShade="BF"/>
-        </w:rPr>
       </w:pPr>
       <w:bookmarkStart w:id="32" w:name="_Toc237780424"/>
       <w:r>
-        <w:rPr>
-          <w:color w:val="2F5496" w:themeColor="accent1" w:themeShade="BF"/>
-        </w:rPr>
         <w:t>Kiểm định 2 — Sự kiện bắt buộc và sự kiện tự chọn (chi-square)</w:t>
       </w:r>
       <w:bookmarkEnd w:id="32"/>
@@ -13254,16 +13338,9 @@
     <w:p>
       <w:pPr>
         <w:pStyle w:val="Heading3"/>
-        <w:rPr>
-          <w:color w:val="2F5496" w:themeColor="accent1" w:themeShade="BF"/>
-        </w:rPr>
       </w:pPr>
       <w:bookmarkStart w:id="33" w:name="_Toc237780425"/>
       <w:r>
-        <w:rPr>
-          <w:color w:val="2F5496" w:themeColor="accent1" w:themeShade="BF"/>
-        </w:rPr>
-        <w:lastRenderedPageBreak/>
         <w:t>Kiểm định 3 — Mức tham gia có suy giảm theo thời gian không (Wilcoxon ghép cặp)</w:t>
       </w:r>
       <w:bookmarkEnd w:id="33"/>
@@ -13615,6 +13692,7 @@
           <w:rFonts w:ascii="Times New Roman" w:hAnsi="Times New Roman" w:cs="Times New Roman"/>
           <w:b/>
         </w:rPr>
+        <w:lastRenderedPageBreak/>
         <w:t>Hiệu chỉnh cửa sổ hoạt động.</w:t>
       </w:r>
       <w:r>
@@ -14227,14 +14305,7 @@
               <w:rPr>
                 <w:rFonts w:ascii="Times New Roman" w:hAnsi="Times New Roman" w:cs="Times New Roman"/>
               </w:rPr>
-              <w:t xml:space="preserve">Sinh hoạt </w:t>
-            </w:r>
-            <w:r>
-              <w:rPr>
-                <w:rFonts w:ascii="Times New Roman" w:hAnsi="Times New Roman" w:cs="Times New Roman"/>
-              </w:rPr>
-              <w:lastRenderedPageBreak/>
-              <w:t>định kỳ tháng 11</w:t>
+              <w:t>Sinh hoạt định kỳ tháng 11</w:t>
             </w:r>
           </w:p>
         </w:tc>
@@ -14257,7 +14328,6 @@
               <w:rPr>
                 <w:rFonts w:ascii="Times New Roman" w:hAnsi="Times New Roman" w:cs="Times New Roman"/>
               </w:rPr>
-              <w:lastRenderedPageBreak/>
               <w:t>Bắt buộc</w:t>
             </w:r>
           </w:p>
@@ -15689,6 +15759,7 @@
               <w:rPr>
                 <w:rFonts w:ascii="Times New Roman" w:hAnsi="Times New Roman" w:cs="Times New Roman"/>
               </w:rPr>
+              <w:lastRenderedPageBreak/>
               <w:t>E012</w:t>
             </w:r>
           </w:p>
@@ -15858,6 +15929,64 @@
     </w:p>
     <w:p>
       <w:pPr>
+        <w:pStyle w:val="Heading2"/>
+      </w:pPr>
+      <w:bookmarkStart w:id="35" w:name="_Toc237780427"/>
+      <w:r>
+        <w:rPr>
+          <w:rFonts w:eastAsia="AR PL SungtiL GB"/>
+          <w:b w:val="0"/>
+          <w:bCs w:val="0"/>
+          <w:i/>
+          <w:noProof/>
+          <w:color w:val="auto"/>
+          <w:sz w:val="24"/>
+          <w:szCs w:val="24"/>
+          <w:lang w:val="en-US" w:eastAsia="zh-CN" w:bidi="hi-IN"/>
+        </w:rPr>
+        <w:drawing>
+          <wp:inline distT="0" distB="0" distL="0" distR="0" wp14:anchorId="342E6CE6" wp14:editId="2BA11354">
+            <wp:extent cx="6120130" cy="4079875"/>
+            <wp:effectExtent l="0" t="0" r="0" b="0"/>
+            <wp:docPr id="7" name="Picture 7"/>
+            <wp:cNvGraphicFramePr>
+              <a:graphicFrameLocks xmlns:a="http://schemas.openxmlformats.org/drawingml/2006/main" noChangeAspect="1"/>
+            </wp:cNvGraphicFramePr>
+            <a:graphic xmlns:a="http://schemas.openxmlformats.org/drawingml/2006/main">
+              <a:graphicData uri="http://schemas.openxmlformats.org/drawingml/2006/picture">
+                <pic:pic xmlns:pic="http://schemas.openxmlformats.org/drawingml/2006/picture">
+                  <pic:nvPicPr>
+                    <pic:cNvPr id="1" name=""/>
+                    <pic:cNvPicPr/>
+                  </pic:nvPicPr>
+                  <pic:blipFill>
+                    <a:blip r:embed="rId12"/>
+                    <a:stretch>
+                      <a:fillRect/>
+                    </a:stretch>
+                  </pic:blipFill>
+                  <pic:spPr>
+                    <a:xfrm>
+                      <a:off x="0" y="0"/>
+                      <a:ext cx="6120130" cy="4079875"/>
+                    </a:xfrm>
+                    <a:prstGeom prst="rect">
+                      <a:avLst/>
+                    </a:prstGeom>
+                  </pic:spPr>
+                </pic:pic>
+              </a:graphicData>
+            </a:graphic>
+          </wp:inline>
+        </w:drawing>
+      </w:r>
+      <w:r>
+        <w:t>4.6. Tổng hợp phát hiện</w:t>
+      </w:r>
+      <w:bookmarkEnd w:id="35"/>
+    </w:p>
+    <w:p>
+      <w:pPr>
         <w:pStyle w:val="BodyText"/>
         <w:rPr>
           <w:rFonts w:ascii="Times New Roman" w:hAnsi="Times New Roman" w:cs="Times New Roman"/>
@@ -15866,20 +15995,9 @@
       <w:r>
         <w:rPr>
           <w:rFonts w:ascii="Times New Roman" w:hAnsi="Times New Roman" w:cs="Times New Roman"/>
-          <w:i/>
-        </w:rPr>
-        <w:t>[HÌNH 4 — event_retention.png]</w:t>
-      </w:r>
-    </w:p>
-    <w:p>
-      <w:pPr>
-        <w:pStyle w:val="Heading2"/>
-      </w:pPr>
-      <w:bookmarkStart w:id="35" w:name="_Toc237780427"/>
-      <w:r>
-        <w:t>4.6. Tổng hợp phát hiện</w:t>
-      </w:r>
-      <w:bookmarkEnd w:id="35"/>
+        </w:rPr>
+        <w:t>Ba kết quả ở các mục trên, khi đặt cạnh nhau, tạo thành phát hiện chính của đồ án.</w:t>
+      </w:r>
     </w:p>
     <w:p>
       <w:pPr>
@@ -15891,8 +16009,9 @@
       <w:r>
         <w:rPr>
           <w:rFonts w:ascii="Times New Roman" w:hAnsi="Times New Roman" w:cs="Times New Roman"/>
-        </w:rPr>
-        <w:t>Ba kết quả ở các mục trên, khi đặt cạnh nhau, tạo thành phát hiện chính của đồ án.</w:t>
+          <w:b/>
+        </w:rPr>
+        <w:t>Thứ nhất: số liệu tổng gộp che giấu vấn đề ở mức cá nhân.</w:t>
       </w:r>
     </w:p>
     <w:p>
@@ -15905,9 +16024,21 @@
       <w:r>
         <w:rPr>
           <w:rFonts w:ascii="Times New Roman" w:hAnsi="Times New Roman" w:cs="Times New Roman"/>
+        </w:rPr>
+        <w:t xml:space="preserve">Kiểm định Wilcoxon cho thấy toàn câu lạc bộ </w:t>
+      </w:r>
+      <w:r>
+        <w:rPr>
+          <w:rFonts w:ascii="Times New Roman" w:hAnsi="Times New Roman" w:cs="Times New Roman"/>
           <w:b/>
         </w:rPr>
-        <w:t>Thứ nhất: số liệu tổng gộp che giấu vấn đề ở mức cá nhân.</w:t>
+        <w:t>không</w:t>
+      </w:r>
+      <w:r>
+        <w:rPr>
+          <w:rFonts w:ascii="Times New Roman" w:hAnsi="Times New Roman" w:cs="Times New Roman"/>
+        </w:rPr>
+        <w:t xml:space="preserve"> suy giảm (p = 0.6329; trung bình nửa đầu 0.524, nửa sau 0.533). Trong khi đó, thuật toán churn_risk() vẫn xác định được 5 thành viên có nguy cơ rời bỏ rõ rệt.</w:t>
       </w:r>
     </w:p>
     <w:p>
@@ -15921,20 +16052,14 @@
         <w:rPr>
           <w:rFonts w:ascii="Times New Roman" w:hAnsi="Times New Roman" w:cs="Times New Roman"/>
         </w:rPr>
-        <w:t xml:space="preserve">Kiểm định Wilcoxon cho thấy toàn câu lạc bộ </w:t>
+        <w:t xml:space="preserve">Hai kết quả này không mâu thuẫn. Nguyên nhân là trong 30 thành viên có 13 người giảm và 17 người tăng — hai nhóm triệt tiêu lẫn nhau khi cộng gộp, khiến chỉ số tổng thể trông ổn định. Nếu ban chủ nhiệm chỉ theo dõi tỉ lệ tham gia trung bình của câu lạc bộ, họ sẽ không bao giờ phát hiện ra 5 thành viên đang rời đi. </w:t>
       </w:r>
       <w:r>
         <w:rPr>
           <w:rFonts w:ascii="Times New Roman" w:hAnsi="Times New Roman" w:cs="Times New Roman"/>
           <w:b/>
         </w:rPr>
-        <w:t>không</w:t>
-      </w:r>
-      <w:r>
-        <w:rPr>
-          <w:rFonts w:ascii="Times New Roman" w:hAnsi="Times New Roman" w:cs="Times New Roman"/>
-        </w:rPr>
-        <w:t xml:space="preserve"> suy giảm (p = 0.6329; trung bình nửa đầu 0.524, nửa sau 0.533). Trong khi đó, thuật toán churn_risk() vẫn xác định được 5 thành viên có nguy cơ rời bỏ rõ rệt.</w:t>
+        <w:t>Đây là lý do tầng phân tích ở mức cá nhân là cần thiết chứ không phải bổ sung trang trí.</w:t>
       </w:r>
     </w:p>
     <w:p>
@@ -15948,29 +16073,14 @@
         <w:rPr>
           <w:rFonts w:ascii="Times New Roman" w:hAnsi="Times New Roman" w:cs="Times New Roman"/>
         </w:rPr>
+        <w:t xml:space="preserve">Kiểm định Kruskal–Wallis ở mục 4.4 minh họa cùng bài học theo chiều ngược lại: một bảng xếp </w:t>
+      </w:r>
+      <w:r>
+        <w:rPr>
+          <w:rFonts w:ascii="Times New Roman" w:hAnsi="Times New Roman" w:cs="Times New Roman"/>
+        </w:rPr>
         <w:lastRenderedPageBreak/>
-        <w:t xml:space="preserve">Hai kết quả này không mâu thuẫn. Nguyên nhân là trong 30 thành viên có 13 người giảm và 17 người tăng — hai nhóm triệt tiêu lẫn nhau khi cộng gộp, khiến chỉ số tổng thể trông ổn định. Nếu ban chủ nhiệm chỉ theo dõi tỉ lệ tham gia trung bình của câu lạc bộ, họ sẽ không bao giờ phát hiện ra 5 thành viên đang rời đi. </w:t>
-      </w:r>
-      <w:r>
-        <w:rPr>
-          <w:rFonts w:ascii="Times New Roman" w:hAnsi="Times New Roman" w:cs="Times New Roman"/>
-          <w:b/>
-        </w:rPr>
-        <w:t>Đây là lý do tầng phân tích ở mức cá nhân là cần thiết chứ không phải bổ sung trang trí.</w:t>
-      </w:r>
-    </w:p>
-    <w:p>
-      <w:pPr>
-        <w:pStyle w:val="BodyText"/>
-        <w:rPr>
-          <w:rFonts w:ascii="Times New Roman" w:hAnsi="Times New Roman" w:cs="Times New Roman"/>
-        </w:rPr>
-      </w:pPr>
-      <w:r>
-        <w:rPr>
-          <w:rFonts w:ascii="Times New Roman" w:hAnsi="Times New Roman" w:cs="Times New Roman"/>
-        </w:rPr>
-        <w:t>Kiểm định Kruskal–Wallis ở mục 4.4 minh họa cùng bài học theo chiều ngược lại: một bảng xếp hạng theo lớp trông như có sự khác biệt rõ ràng, nhưng kiểm định cho thấy đó chỉ là nhiễu. Trong cả hai trường hợp, việc đọc số liệu bằng trực giác đều dẫn đến kết luận sai — theo hai hướng đối lập.</w:t>
+        <w:t>hạng theo lớp trông như có sự khác biệt rõ ràng, nhưng kiểm định cho thấy đó chỉ là nhiễu. Trong cả hai trường hợp, việc đọc số liệu bằng trực giác đều dẫn đến kết luận sai — theo hai hướng đối lập.</w:t>
       </w:r>
     </w:p>
     <w:p>
@@ -16427,20 +16537,44 @@
       </w:pPr>
       <w:bookmarkStart w:id="36" w:name="_Toc237780428"/>
       <w:r>
+        <w:t>CHƯƠNG 5: TRỰC QUAN HÓA DỮ LIỆU VÀ GIAO DIỆN TƯƠNG TÁC</w:t>
+      </w:r>
+      <w:bookmarkEnd w:id="36"/>
+    </w:p>
+    <w:p>
+      <w:pPr>
+        <w:pStyle w:val="Heading2"/>
+      </w:pPr>
+      <w:bookmarkStart w:id="37" w:name="_Toc237780429"/>
+      <w:r>
+        <w:t>5.1. Hệ thống sáu biểu đồ Matplotlib</w:t>
+      </w:r>
+      <w:bookmarkEnd w:id="37"/>
+    </w:p>
+    <w:p>
+      <w:pPr>
+        <w:pStyle w:val="BodyText"/>
+        <w:rPr>
+          <w:rFonts w:ascii="Times New Roman" w:hAnsi="Times New Roman" w:cs="Times New Roman"/>
+        </w:rPr>
+      </w:pPr>
+      <w:r>
+        <w:rPr>
+          <w:rFonts w:ascii="Times New Roman" w:hAnsi="Times New Roman" w:cs="Times New Roman"/>
+        </w:rPr>
+        <w:t>Toàn bộ biểu đồ được kết xuất tại src/visualization/charts.py với độ phân giải 150 dpi, lưu vào report/figures/.</w:t>
+      </w:r>
+    </w:p>
+    <w:p>
+      <w:pPr>
+        <w:pStyle w:val="Heading3"/>
+      </w:pPr>
+      <w:bookmarkStart w:id="38" w:name="_Toc237780430"/>
+      <w:r>
         <w:lastRenderedPageBreak/>
-        <w:t>CHƯƠNG 5: TRỰC QUAN HÓA DỮ LIỆU VÀ GIAO DIỆN TƯƠNG TÁC</w:t>
-      </w:r>
-      <w:bookmarkEnd w:id="36"/>
-    </w:p>
-    <w:p>
-      <w:pPr>
-        <w:pStyle w:val="Heading2"/>
-      </w:pPr>
-      <w:bookmarkStart w:id="37" w:name="_Toc237780429"/>
-      <w:r>
-        <w:t>5.1. Hệ thống sáu biểu đồ Matplotlib</w:t>
-      </w:r>
-      <w:bookmarkEnd w:id="37"/>
+        <w:t>5.1.1. Tỉ lệ tham gia theo sự kiện</w:t>
+      </w:r>
+      <w:bookmarkEnd w:id="38"/>
     </w:p>
     <w:p>
       <w:pPr>
@@ -16452,25 +16586,95 @@
       <w:r>
         <w:rPr>
           <w:rFonts w:ascii="Times New Roman" w:hAnsi="Times New Roman" w:cs="Times New Roman"/>
-        </w:rPr>
-        <w:t>Toàn bộ biểu đồ được kết xuất tại src/visualization/charts.py với độ phân giải 150 dpi, lưu vào report/figures/.</w:t>
+          <w:b/>
+        </w:rPr>
+        <w:t>Kỹ thuật:</w:t>
+      </w:r>
+      <w:r>
+        <w:rPr>
+          <w:rFonts w:ascii="Times New Roman" w:hAnsi="Times New Roman" w:cs="Times New Roman"/>
+        </w:rPr>
+        <w:t xml:space="preserve"> biểu đồ cột đứng (ax.bar), nhãn trục X xoay 30°, tự động gắn nhãn phần trăm lên đỉnh mỗi cột.</w:t>
+      </w:r>
+    </w:p>
+    <w:p>
+      <w:pPr>
+        <w:pStyle w:val="BodyText"/>
+        <w:rPr>
+          <w:rFonts w:ascii="Times New Roman" w:hAnsi="Times New Roman" w:cs="Times New Roman"/>
+        </w:rPr>
+      </w:pPr>
+      <w:r>
+        <w:rPr>
+          <w:rFonts w:ascii="Times New Roman" w:hAnsi="Times New Roman" w:cs="Times New Roman"/>
+          <w:b/>
+        </w:rPr>
+        <w:t>Nhận xét:</w:t>
+      </w:r>
+      <w:r>
+        <w:rPr>
+          <w:rFonts w:ascii="Times New Roman" w:hAnsi="Times New Roman" w:cs="Times New Roman"/>
+        </w:rPr>
+        <w:t xml:space="preserve"> Gala tổng kết học kỳ 1 đạt tỉ lệ cao nhất (83.3%, 25/30 người), tiếp theo là Kiểm tra kỹ năng lập trình giữa kỳ (80.0%). Thấp nhất là Workshop Git &amp; GitHub cơ bản (23.3%, 7/30 người). Nhóm sự kiện bắt buộc nhìn chung tập trung ở nửa trên của biểu đồ, phù hợp với kết quả kiểm định chi-square ở mục 4.4.</w:t>
       </w:r>
     </w:p>
     <w:p>
       <w:pPr>
         <w:pStyle w:val="Heading3"/>
-        <w:rPr>
-          <w:color w:val="2F5496" w:themeColor="accent1" w:themeShade="BF"/>
-        </w:rPr>
-      </w:pPr>
-      <w:bookmarkStart w:id="38" w:name="_Toc237780430"/>
-      <w:r>
-        <w:rPr>
-          <w:color w:val="2F5496" w:themeColor="accent1" w:themeShade="BF"/>
-        </w:rPr>
-        <w:t>5.1.1. Tỉ lệ tham gia theo sự kiện</w:t>
-      </w:r>
-      <w:bookmarkEnd w:id="38"/>
+      </w:pPr>
+      <w:bookmarkStart w:id="39" w:name="_Toc237780431"/>
+      <w:r>
+        <w:rPr>
+          <w:rFonts w:eastAsia="AR PL SungtiL GB"/>
+          <w:b w:val="0"/>
+          <w:bCs w:val="0"/>
+          <w:i/>
+          <w:noProof/>
+          <w:color w:val="auto"/>
+          <w:sz w:val="24"/>
+          <w:szCs w:val="24"/>
+          <w:lang w:val="en-US" w:eastAsia="zh-CN" w:bidi="hi-IN"/>
+        </w:rPr>
+        <w:drawing>
+          <wp:inline distT="0" distB="0" distL="0" distR="0" wp14:anchorId="37DD1AE6" wp14:editId="73BAFCB8">
+            <wp:extent cx="6120130" cy="3825240"/>
+            <wp:effectExtent l="0" t="0" r="0" b="3810"/>
+            <wp:docPr id="9" name="Picture 9"/>
+            <wp:cNvGraphicFramePr>
+              <a:graphicFrameLocks xmlns:a="http://schemas.openxmlformats.org/drawingml/2006/main" noChangeAspect="1"/>
+            </wp:cNvGraphicFramePr>
+            <a:graphic xmlns:a="http://schemas.openxmlformats.org/drawingml/2006/main">
+              <a:graphicData uri="http://schemas.openxmlformats.org/drawingml/2006/picture">
+                <pic:pic xmlns:pic="http://schemas.openxmlformats.org/drawingml/2006/picture">
+                  <pic:nvPicPr>
+                    <pic:cNvPr id="1" name=""/>
+                    <pic:cNvPicPr/>
+                  </pic:nvPicPr>
+                  <pic:blipFill>
+                    <a:blip r:embed="rId13"/>
+                    <a:stretch>
+                      <a:fillRect/>
+                    </a:stretch>
+                  </pic:blipFill>
+                  <pic:spPr>
+                    <a:xfrm>
+                      <a:off x="0" y="0"/>
+                      <a:ext cx="6120130" cy="3825240"/>
+                    </a:xfrm>
+                    <a:prstGeom prst="rect">
+                      <a:avLst/>
+                    </a:prstGeom>
+                  </pic:spPr>
+                </pic:pic>
+              </a:graphicData>
+            </a:graphic>
+          </wp:inline>
+        </w:drawing>
+      </w:r>
+      <w:r>
+        <w:t>5.1.2. Tăng trưởng thành viên và đường xu hướng</w:t>
+      </w:r>
+      <w:bookmarkEnd w:id="39"/>
     </w:p>
     <w:p>
       <w:pPr>
@@ -16490,7 +16694,7 @@
         <w:rPr>
           <w:rFonts w:ascii="Times New Roman" w:hAnsi="Times New Roman" w:cs="Times New Roman"/>
         </w:rPr>
-        <w:t xml:space="preserve"> biểu đồ cột đứng (ax.bar), nhãn trục X xoay 30°, tự động gắn nhãn phần trăm lên đỉnh mỗi cột.</w:t>
+        <w:t xml:space="preserve"> biểu đồ đường kết hợp điểm mốc (marker="o") và đường hồi quy nét đứt chồng lên.</w:t>
       </w:r>
     </w:p>
     <w:p>
@@ -16511,7 +16715,7 @@
         <w:rPr>
           <w:rFonts w:ascii="Times New Roman" w:hAnsi="Times New Roman" w:cs="Times New Roman"/>
         </w:rPr>
-        <w:t xml:space="preserve"> Gala tổng kết học kỳ 1 đạt tỉ lệ cao nhất (83.3%, 25/30 người), tiếp theo là Kiểm tra kỹ năng lập trình giữa kỳ (80.0%). Thấp nhất là Workshop Git &amp; GitHub cơ bản (23.3%, 7/30 người). Nhóm sự kiện bắt buộc nhìn chung tập trung ở nửa trên của biểu đồ, phù hợp với kết quả kiểm định chi-square ở mục 4.4.</w:t>
+        <w:t xml:space="preserve"> giai đoạn gia nhập tập trung vào tháng 09/2025 (đầu năm học), sau đó đường tích lũy đi ngang ở mức 30 thành viên từ khoảng tháng 12/2025. Đường hồi quy với hệ số góc 0.211 thành viên/ngày phản ánh tốc độ giai đoạn tuyển quân; phần đi ngang phía sau cho thấy giới hạn của mô hình tuyến tính khi áp dụng cho toàn chuỗi (xem mục 4.1).</w:t>
       </w:r>
     </w:p>
     <w:p>
@@ -16526,24 +16730,46 @@
           <w:rFonts w:ascii="Times New Roman" w:hAnsi="Times New Roman" w:cs="Times New Roman"/>
           <w:i/>
         </w:rPr>
-        <w:t>[HÌNH 5 — participation_by_event.png]</w:t>
+        <w:t xml:space="preserve">[HÌNH </w:t>
+      </w:r>
+      <w:r>
+        <w:rPr>
+          <w:rFonts w:ascii="Times New Roman" w:hAnsi="Times New Roman" w:cs="Times New Roman"/>
+          <w:i/>
+        </w:rPr>
+        <w:t>2</w:t>
+      </w:r>
+      <w:r>
+        <w:rPr>
+          <w:rFonts w:ascii="Times New Roman" w:hAnsi="Times New Roman" w:cs="Times New Roman"/>
+          <w:i/>
+        </w:rPr>
+        <w:t xml:space="preserve"> đã dẫn ở mục 4.</w:t>
+      </w:r>
+      <w:r>
+        <w:rPr>
+          <w:rFonts w:ascii="Times New Roman" w:hAnsi="Times New Roman" w:cs="Times New Roman"/>
+          <w:i/>
+        </w:rPr>
+        <w:t>1</w:t>
+      </w:r>
+      <w:r>
+        <w:rPr>
+          <w:rFonts w:ascii="Times New Roman" w:hAnsi="Times New Roman" w:cs="Times New Roman"/>
+          <w:i/>
+        </w:rPr>
+        <w:t>]</w:t>
       </w:r>
     </w:p>
     <w:p>
       <w:pPr>
         <w:pStyle w:val="Heading3"/>
-        <w:rPr>
-          <w:color w:val="2F5496" w:themeColor="accent1" w:themeShade="BF"/>
-        </w:rPr>
-      </w:pPr>
-      <w:bookmarkStart w:id="39" w:name="_Toc237780431"/>
-      <w:r>
-        <w:rPr>
-          <w:color w:val="2F5496" w:themeColor="accent1" w:themeShade="BF"/>
-        </w:rPr>
-        <w:t>5.1.2. Tăng trưởng thành viên và đường xu hướng</w:t>
-      </w:r>
-      <w:bookmarkEnd w:id="39"/>
+      </w:pPr>
+      <w:bookmarkStart w:id="40" w:name="_Toc237780432"/>
+      <w:r>
+        <w:t>5.1.3. Xếp hạng thành viên tích cực</w:t>
+      </w:r>
+      <w:bookmarkEnd w:id="40"/>
     </w:p>
     <w:p>
       <w:pPr>
@@ -16563,7 +16789,7 @@
         <w:rPr>
           <w:rFonts w:ascii="Times New Roman" w:hAnsi="Times New Roman" w:cs="Times New Roman"/>
         </w:rPr>
-        <w:t xml:space="preserve"> biểu đồ đường kết hợp điểm mốc (marker="o") và đường hồi quy nét đứt chồng lên.</w:t>
+        <w:t xml:space="preserve"> biểu đồ thanh ngang (ax.barh), mã màu phân biệt Ban chủ nhiệm và thành viên thường.</w:t>
       </w:r>
     </w:p>
     <w:p>
@@ -16584,8 +16810,73 @@
         <w:rPr>
           <w:rFonts w:ascii="Times New Roman" w:hAnsi="Times New Roman" w:cs="Times New Roman"/>
         </w:rPr>
-        <w:t xml:space="preserve"> giai đoạn gia nhập tập trung vào tháng 09/2025 (đầu năm học), sau đó đường tích lũy đi ngang ở mức 30 thành viên từ khoảng tháng 12/2025. Đường hồi quy với hệ số góc 0.211 thành viên/ngày phản ánh tốc độ giai đoạn tuyển quân; phần đi ngang phía sau cho thấy giới hạn của mô hình tuyến tính khi áp dụng cho toàn chuỗi (xem mục 4.1).</w:t>
-      </w:r>
+        <w:t xml:space="preserve"> M002 Hoang Cong Bao dẫn đầu với 14.52 điểm, đạt được nhờ tham gia 9/12 sự kiện kết hợp hệ số vai trò 1.2. Tuy nhiên hai vị trí kế tiếp thuộc về M006 Le Kim Kien và M020 Pham Huu Trang — cả hai là thành viên thường, đạt 14.40 điểm nhờ tham gia 11/12 sự kiện. Khoảng cách chỉ 0.12 điểm cho thấy hệ số vai trò không tạo lợi thế áp đảo, và thành viên thường hoàn toàn có thể </w:t>
+      </w:r>
+      <w:r>
+        <w:rPr>
+          <w:rFonts w:ascii="Times New Roman" w:hAnsi="Times New Roman" w:cs="Times New Roman"/>
+        </w:rPr>
+        <w:lastRenderedPageBreak/>
+        <w:t>vượt lên bằng mức độ chuyên cần.</w:t>
+      </w:r>
+    </w:p>
+    <w:p>
+      <w:pPr>
+        <w:pStyle w:val="Heading3"/>
+      </w:pPr>
+      <w:bookmarkStart w:id="41" w:name="_Toc237780433"/>
+      <w:r>
+        <w:rPr>
+          <w:rFonts w:eastAsia="AR PL SungtiL GB"/>
+          <w:b w:val="0"/>
+          <w:bCs w:val="0"/>
+          <w:i/>
+          <w:noProof/>
+          <w:color w:val="auto"/>
+          <w:sz w:val="24"/>
+          <w:szCs w:val="24"/>
+          <w:lang w:val="en-US" w:eastAsia="zh-CN" w:bidi="hi-IN"/>
+        </w:rPr>
+        <w:drawing>
+          <wp:inline distT="0" distB="0" distL="0" distR="0" wp14:anchorId="403770C3" wp14:editId="344BCC69">
+            <wp:extent cx="6120130" cy="3825240"/>
+            <wp:effectExtent l="0" t="0" r="0" b="3810"/>
+            <wp:docPr id="11" name="Picture 11"/>
+            <wp:cNvGraphicFramePr>
+              <a:graphicFrameLocks xmlns:a="http://schemas.openxmlformats.org/drawingml/2006/main" noChangeAspect="1"/>
+            </wp:cNvGraphicFramePr>
+            <a:graphic xmlns:a="http://schemas.openxmlformats.org/drawingml/2006/main">
+              <a:graphicData uri="http://schemas.openxmlformats.org/drawingml/2006/picture">
+                <pic:pic xmlns:pic="http://schemas.openxmlformats.org/drawingml/2006/picture">
+                  <pic:nvPicPr>
+                    <pic:cNvPr id="1" name=""/>
+                    <pic:cNvPicPr/>
+                  </pic:nvPicPr>
+                  <pic:blipFill>
+                    <a:blip r:embed="rId14"/>
+                    <a:stretch>
+                      <a:fillRect/>
+                    </a:stretch>
+                  </pic:blipFill>
+                  <pic:spPr>
+                    <a:xfrm>
+                      <a:off x="0" y="0"/>
+                      <a:ext cx="6120130" cy="3825240"/>
+                    </a:xfrm>
+                    <a:prstGeom prst="rect">
+                      <a:avLst/>
+                    </a:prstGeom>
+                  </pic:spPr>
+                </pic:pic>
+              </a:graphicData>
+            </a:graphic>
+          </wp:inline>
+        </w:drawing>
+      </w:r>
+      <w:r>
+        <w:t>5.1.4. Cảnh báo nguy cơ ngừng tham gia</w:t>
+      </w:r>
+      <w:bookmarkEnd w:id="41"/>
     </w:p>
     <w:p>
       <w:pPr>
@@ -16597,176 +16888,59 @@
       <w:r>
         <w:rPr>
           <w:rFonts w:ascii="Times New Roman" w:hAnsi="Times New Roman" w:cs="Times New Roman"/>
+          <w:b/>
+        </w:rPr>
+        <w:t>Kỹ thuật:</w:t>
+      </w:r>
+      <w:r>
+        <w:rPr>
+          <w:rFonts w:ascii="Times New Roman" w:hAnsi="Times New Roman" w:cs="Times New Roman"/>
+        </w:rPr>
+        <w:t xml:space="preserve"> biểu đồ thanh ngang, mã màu theo ba mức rủi ro.</w:t>
+      </w:r>
+    </w:p>
+    <w:p>
+      <w:pPr>
+        <w:pStyle w:val="BodyText"/>
+        <w:rPr>
+          <w:rFonts w:ascii="Times New Roman" w:hAnsi="Times New Roman" w:cs="Times New Roman"/>
+        </w:rPr>
+      </w:pPr>
+      <w:r>
+        <w:rPr>
+          <w:rFonts w:ascii="Times New Roman" w:hAnsi="Times New Roman" w:cs="Times New Roman"/>
+          <w:b/>
+        </w:rPr>
+        <w:t>Nhận xét:</w:t>
+      </w:r>
+      <w:r>
+        <w:rPr>
+          <w:rFonts w:ascii="Times New Roman" w:hAnsi="Times New Roman" w:cs="Times New Roman"/>
+        </w:rPr>
+        <w:t xml:space="preserve"> 5 cá nhân vượt ngưỡng cảnh báo. Biểu đồ cho thấy phân bố churn_score khá liên tục, không có khoảng trống rõ rệt giữa nhóm nguy cơ cao và nhóm bình thường — nghĩa là ngưỡng z = 1.0 là một lựa chọn quy ước, và các thành viên ngay dưới ngưỡng (như M022 với score 0.770) cũng đáng được theo dõi.</w:t>
+      </w:r>
+    </w:p>
+    <w:p>
+      <w:pPr>
+        <w:pStyle w:val="BodyText"/>
+        <w:rPr>
+          <w:rFonts w:ascii="Times New Roman" w:hAnsi="Times New Roman" w:cs="Times New Roman"/>
+        </w:rPr>
+      </w:pPr>
+      <w:r>
+        <w:rPr>
+          <w:rFonts w:ascii="Times New Roman" w:hAnsi="Times New Roman" w:cs="Times New Roman"/>
           <w:i/>
         </w:rPr>
-        <w:t>[HÌNH 2 đã dẫn ở mục 4.1]</w:t>
+        <w:t>[HÌNH 3 đã dẫn ở mục 4.3]</w:t>
       </w:r>
     </w:p>
     <w:p>
       <w:pPr>
         <w:pStyle w:val="Heading3"/>
-        <w:rPr>
-          <w:color w:val="2F5496" w:themeColor="accent1" w:themeShade="BF"/>
-        </w:rPr>
-      </w:pPr>
-      <w:bookmarkStart w:id="40" w:name="_Toc237780432"/>
-      <w:r>
-        <w:rPr>
-          <w:color w:val="2F5496" w:themeColor="accent1" w:themeShade="BF"/>
-        </w:rPr>
-        <w:t>5.1.3. Xếp hạng thành viên tích cực</w:t>
-      </w:r>
-      <w:bookmarkEnd w:id="40"/>
-    </w:p>
-    <w:p>
-      <w:pPr>
-        <w:pStyle w:val="BodyText"/>
-        <w:rPr>
-          <w:rFonts w:ascii="Times New Roman" w:hAnsi="Times New Roman" w:cs="Times New Roman"/>
-        </w:rPr>
-      </w:pPr>
-      <w:r>
-        <w:rPr>
-          <w:rFonts w:ascii="Times New Roman" w:hAnsi="Times New Roman" w:cs="Times New Roman"/>
-          <w:b/>
-        </w:rPr>
-        <w:t>Kỹ thuật:</w:t>
-      </w:r>
-      <w:r>
-        <w:rPr>
-          <w:rFonts w:ascii="Times New Roman" w:hAnsi="Times New Roman" w:cs="Times New Roman"/>
-        </w:rPr>
-        <w:t xml:space="preserve"> biểu đồ thanh ngang (ax.barh), mã màu phân biệt Ban chủ nhiệm và thành viên thường.</w:t>
-      </w:r>
-    </w:p>
-    <w:p>
-      <w:pPr>
-        <w:pStyle w:val="BodyText"/>
-        <w:rPr>
-          <w:rFonts w:ascii="Times New Roman" w:hAnsi="Times New Roman" w:cs="Times New Roman"/>
-        </w:rPr>
-      </w:pPr>
-      <w:r>
-        <w:rPr>
-          <w:rFonts w:ascii="Times New Roman" w:hAnsi="Times New Roman" w:cs="Times New Roman"/>
-          <w:b/>
-        </w:rPr>
-        <w:t>Nhận xét:</w:t>
-      </w:r>
-      <w:r>
-        <w:rPr>
-          <w:rFonts w:ascii="Times New Roman" w:hAnsi="Times New Roman" w:cs="Times New Roman"/>
-        </w:rPr>
-        <w:t xml:space="preserve"> M002 Hoang Cong Bao dẫn đầu với 14.52 điểm, đạt được nhờ tham gia 9/12 sự kiện kết hợp hệ số vai trò 1.2. Tuy nhiên hai vị trí kế tiếp thuộc về M006 Le Kim Kien và M020 Pham Huu Trang — cả hai là thành viên thường, đạt 14.40 điểm nhờ tham gia 11/12 sự kiện. Khoảng cách chỉ 0.12 điểm cho thấy hệ số vai trò không tạo lợi thế áp đảo, và thành viên thường hoàn toàn có thể vượt lên bằng mức độ chuyên cần.</w:t>
-      </w:r>
-    </w:p>
-    <w:p>
-      <w:pPr>
-        <w:pStyle w:val="BodyText"/>
-        <w:rPr>
-          <w:rFonts w:ascii="Times New Roman" w:hAnsi="Times New Roman" w:cs="Times New Roman"/>
-        </w:rPr>
-      </w:pPr>
-      <w:r>
-        <w:rPr>
-          <w:rFonts w:ascii="Times New Roman" w:hAnsi="Times New Roman" w:cs="Times New Roman"/>
-          <w:i/>
-        </w:rPr>
-        <w:t>[HÌNH 6 — top_members.png]</w:t>
-      </w:r>
-    </w:p>
-    <w:p>
-      <w:pPr>
-        <w:pStyle w:val="Heading3"/>
-        <w:rPr>
-          <w:color w:val="2F5496" w:themeColor="accent1" w:themeShade="BF"/>
-        </w:rPr>
-      </w:pPr>
-      <w:bookmarkStart w:id="41" w:name="_Toc237780433"/>
-      <w:r>
-        <w:rPr>
-          <w:color w:val="2F5496" w:themeColor="accent1" w:themeShade="BF"/>
-        </w:rPr>
-        <w:t>5.1.4. Cảnh báo nguy cơ ngừng tham gia</w:t>
-      </w:r>
-      <w:bookmarkEnd w:id="41"/>
-    </w:p>
-    <w:p>
-      <w:pPr>
-        <w:pStyle w:val="BodyText"/>
-        <w:rPr>
-          <w:rFonts w:ascii="Times New Roman" w:hAnsi="Times New Roman" w:cs="Times New Roman"/>
-        </w:rPr>
-      </w:pPr>
-      <w:r>
-        <w:rPr>
-          <w:rFonts w:ascii="Times New Roman" w:hAnsi="Times New Roman" w:cs="Times New Roman"/>
-          <w:b/>
-        </w:rPr>
-        <w:t>Kỹ thuật:</w:t>
-      </w:r>
-      <w:r>
-        <w:rPr>
-          <w:rFonts w:ascii="Times New Roman" w:hAnsi="Times New Roman" w:cs="Times New Roman"/>
-        </w:rPr>
-        <w:t xml:space="preserve"> biểu đồ thanh ngang, mã màu theo ba mức rủi ro.</w:t>
-      </w:r>
-    </w:p>
-    <w:p>
-      <w:pPr>
-        <w:pStyle w:val="BodyText"/>
-        <w:rPr>
-          <w:rFonts w:ascii="Times New Roman" w:hAnsi="Times New Roman" w:cs="Times New Roman"/>
-        </w:rPr>
-      </w:pPr>
-      <w:r>
-        <w:rPr>
-          <w:rFonts w:ascii="Times New Roman" w:hAnsi="Times New Roman" w:cs="Times New Roman"/>
-          <w:b/>
-        </w:rPr>
-        <w:t>Nhận xét:</w:t>
-      </w:r>
-      <w:r>
-        <w:rPr>
-          <w:rFonts w:ascii="Times New Roman" w:hAnsi="Times New Roman" w:cs="Times New Roman"/>
-        </w:rPr>
-        <w:t xml:space="preserve"> 5 cá nhân vượt ngưỡng cảnh báo. Biểu đồ cho thấy phân bố churn_score khá liên tục, </w:t>
-      </w:r>
-      <w:r>
-        <w:rPr>
-          <w:rFonts w:ascii="Times New Roman" w:hAnsi="Times New Roman" w:cs="Times New Roman"/>
-        </w:rPr>
-        <w:lastRenderedPageBreak/>
-        <w:t>không có khoảng trống rõ rệt giữa nhóm nguy cơ cao và nhóm bình thường — nghĩa là ngưỡng z = 1.0 là một lựa chọn quy ước, và các thành viên ngay dưới ngưỡng (như M022 với score 0.770) cũng đáng được theo dõi.</w:t>
-      </w:r>
-    </w:p>
-    <w:p>
-      <w:pPr>
-        <w:pStyle w:val="BodyText"/>
-        <w:rPr>
-          <w:rFonts w:ascii="Times New Roman" w:hAnsi="Times New Roman" w:cs="Times New Roman"/>
-        </w:rPr>
-      </w:pPr>
-      <w:r>
-        <w:rPr>
-          <w:rFonts w:ascii="Times New Roman" w:hAnsi="Times New Roman" w:cs="Times New Roman"/>
-          <w:i/>
-        </w:rPr>
-        <w:t>[HÌNH 3 đã dẫn ở mục 4.3]</w:t>
-      </w:r>
-    </w:p>
-    <w:p>
-      <w:pPr>
-        <w:pStyle w:val="Heading3"/>
-        <w:rPr>
-          <w:color w:val="2F5496" w:themeColor="accent1" w:themeShade="BF"/>
-        </w:rPr>
       </w:pPr>
       <w:bookmarkStart w:id="42" w:name="_Toc237780434"/>
       <w:r>
-        <w:rPr>
-          <w:color w:val="2F5496" w:themeColor="accent1" w:themeShade="BF"/>
-        </w:rPr>
         <w:t>5.1.5. Bản đồ nhiệt điểm danh hai chiều</w:t>
       </w:r>
       <w:bookmarkEnd w:id="42"/>
@@ -16908,36 +17082,71 @@
         <w:rPr>
           <w:rFonts w:ascii="Times New Roman" w:hAnsi="Times New Roman" w:cs="Times New Roman"/>
         </w:rPr>
-        <w:t>Biểu đồ này thay thế cho phương án phân tích đồ thị đồng tham gia đã bị loại bỏ (xem mục 7.2), và đóng vai trò bằng chứng trực quan cho các kết luận định lượng ở chương 4.</w:t>
-      </w:r>
-    </w:p>
-    <w:p>
-      <w:pPr>
-        <w:pStyle w:val="BodyText"/>
-        <w:rPr>
-          <w:rFonts w:ascii="Times New Roman" w:hAnsi="Times New Roman" w:cs="Times New Roman"/>
-        </w:rPr>
-      </w:pPr>
-      <w:r>
-        <w:rPr>
-          <w:rFonts w:ascii="Times New Roman" w:hAnsi="Times New Roman" w:cs="Times New Roman"/>
+        <w:t xml:space="preserve">Biểu đồ này thay thế cho phương án phân tích đồ thị đồng tham gia đã bị loại bỏ (xem mục 7.2), và </w:t>
+      </w:r>
+      <w:r>
+        <w:rPr>
+          <w:rFonts w:ascii="Times New Roman" w:hAnsi="Times New Roman" w:cs="Times New Roman"/>
+        </w:rPr>
+        <w:lastRenderedPageBreak/>
+        <w:t>đóng vai trò bằng chứng trực quan cho các kết luận định lượng ở chương 4.</w:t>
+      </w:r>
+    </w:p>
+    <w:p>
+      <w:pPr>
+        <w:pStyle w:val="Heading3"/>
+        <w:ind w:left="720"/>
+      </w:pPr>
+      <w:bookmarkStart w:id="43" w:name="_Toc237780435"/>
+      <w:r>
+        <w:rPr>
+          <w:rFonts w:eastAsia="AR PL SungtiL GB"/>
+          <w:b w:val="0"/>
+          <w:bCs w:val="0"/>
           <w:i/>
-        </w:rPr>
-        <w:t>[HÌNH 7 — attendance_heatmap.png]</w:t>
-      </w:r>
-    </w:p>
-    <w:p>
-      <w:pPr>
-        <w:pStyle w:val="Heading3"/>
-        <w:rPr>
-          <w:color w:val="2F5496" w:themeColor="accent1" w:themeShade="BF"/>
-        </w:rPr>
-      </w:pPr>
-      <w:bookmarkStart w:id="43" w:name="_Toc237780435"/>
-      <w:r>
-        <w:rPr>
-          <w:color w:val="2F5496" w:themeColor="accent1" w:themeShade="BF"/>
-        </w:rPr>
+          <w:noProof/>
+          <w:color w:val="auto"/>
+          <w:sz w:val="24"/>
+          <w:szCs w:val="24"/>
+          <w:lang w:val="en-US" w:eastAsia="zh-CN" w:bidi="hi-IN"/>
+        </w:rPr>
+        <w:drawing>
+          <wp:inline distT="0" distB="0" distL="0" distR="0" wp14:anchorId="273D777E" wp14:editId="5B805E37">
+            <wp:extent cx="6120130" cy="4895850"/>
+            <wp:effectExtent l="0" t="0" r="0" b="0"/>
+            <wp:docPr id="12" name="Picture 12"/>
+            <wp:cNvGraphicFramePr>
+              <a:graphicFrameLocks xmlns:a="http://schemas.openxmlformats.org/drawingml/2006/main" noChangeAspect="1"/>
+            </wp:cNvGraphicFramePr>
+            <a:graphic xmlns:a="http://schemas.openxmlformats.org/drawingml/2006/main">
+              <a:graphicData uri="http://schemas.openxmlformats.org/drawingml/2006/picture">
+                <pic:pic xmlns:pic="http://schemas.openxmlformats.org/drawingml/2006/picture">
+                  <pic:nvPicPr>
+                    <pic:cNvPr id="1" name=""/>
+                    <pic:cNvPicPr/>
+                  </pic:nvPicPr>
+                  <pic:blipFill>
+                    <a:blip r:embed="rId15"/>
+                    <a:stretch>
+                      <a:fillRect/>
+                    </a:stretch>
+                  </pic:blipFill>
+                  <pic:spPr>
+                    <a:xfrm>
+                      <a:off x="0" y="0"/>
+                      <a:ext cx="6120130" cy="4895850"/>
+                    </a:xfrm>
+                    <a:prstGeom prst="rect">
+                      <a:avLst/>
+                    </a:prstGeom>
+                  </pic:spPr>
+                </pic:pic>
+              </a:graphicData>
+            </a:graphic>
+          </wp:inline>
+        </w:drawing>
+      </w:r>
+      <w:r>
         <w:t>5.1.6. Sức giữ chân của sự kiện</w:t>
       </w:r>
       <w:bookmarkEnd w:id="43"/>
@@ -17312,6 +17521,7 @@
               <w:rPr>
                 <w:rFonts w:ascii="Times New Roman" w:hAnsi="Times New Roman" w:cs="Times New Roman"/>
               </w:rPr>
+              <w:lastRenderedPageBreak/>
               <w:t>5. Bản đồ nhiệt</w:t>
             </w:r>
           </w:p>
@@ -17440,6 +17650,7 @@
         </w:rPr>
         <w:t xml:space="preserve"> Tab 1 hiển thị bảng tỉ lệ theo lớp kèm dòng chú thích nêu rõ chênh lệch giữa các lớp không có ý nghĩa thống kê. Đây là lựa chọn có chủ đích: một bảng số liệu được sắp xếp luôn tạo cảm giác có thứ hạng, và chú thích này ngăn người dùng rút ra kết luận sai từ dữ liệu nhiễu.</w:t>
       </w:r>
+      <w:bookmarkStart w:id="45" w:name="_Toc237780437"/>
     </w:p>
     <w:p>
       <w:pPr>
@@ -17451,16 +17662,90 @@
       <w:r>
         <w:rPr>
           <w:rFonts w:ascii="Times New Roman" w:hAnsi="Times New Roman" w:cs="Times New Roman"/>
-          <w:i/>
-        </w:rPr>
-        <w:t>[HÌNH 8 — Ảnh chụp màn hình dashboard]</w:t>
+          <w:noProof/>
+        </w:rPr>
+        <w:drawing>
+          <wp:inline distT="0" distB="0" distL="0" distR="0" wp14:anchorId="6E868959" wp14:editId="362F94D6">
+            <wp:extent cx="6120130" cy="4371340"/>
+            <wp:effectExtent l="0" t="0" r="0" b="0"/>
+            <wp:docPr id="15" name="Picture 15"/>
+            <wp:cNvGraphicFramePr>
+              <a:graphicFrameLocks xmlns:a="http://schemas.openxmlformats.org/drawingml/2006/main" noChangeAspect="1"/>
+            </wp:cNvGraphicFramePr>
+            <a:graphic xmlns:a="http://schemas.openxmlformats.org/drawingml/2006/main">
+              <a:graphicData uri="http://schemas.openxmlformats.org/drawingml/2006/picture">
+                <pic:pic xmlns:pic="http://schemas.openxmlformats.org/drawingml/2006/picture">
+                  <pic:nvPicPr>
+                    <pic:cNvPr id="1" name=""/>
+                    <pic:cNvPicPr/>
+                  </pic:nvPicPr>
+                  <pic:blipFill>
+                    <a:blip r:embed="rId16"/>
+                    <a:stretch>
+                      <a:fillRect/>
+                    </a:stretch>
+                  </pic:blipFill>
+                  <pic:spPr>
+                    <a:xfrm>
+                      <a:off x="0" y="0"/>
+                      <a:ext cx="6120130" cy="4371340"/>
+                    </a:xfrm>
+                    <a:prstGeom prst="rect">
+                      <a:avLst/>
+                    </a:prstGeom>
+                  </pic:spPr>
+                </pic:pic>
+              </a:graphicData>
+            </a:graphic>
+          </wp:inline>
+        </w:drawing>
       </w:r>
     </w:p>
     <w:p>
       <w:pPr>
         <w:pStyle w:val="Heading2"/>
       </w:pPr>
-      <w:bookmarkStart w:id="45" w:name="_Toc237780437"/>
+      <w:r>
+        <w:rPr>
+          <w:noProof/>
+        </w:rPr>
+        <w:lastRenderedPageBreak/>
+        <w:drawing>
+          <wp:inline distT="0" distB="0" distL="0" distR="0" wp14:anchorId="632FF842" wp14:editId="75AF5467">
+            <wp:extent cx="6120130" cy="3112770"/>
+            <wp:effectExtent l="0" t="0" r="0" b="0"/>
+            <wp:docPr id="14" name="Picture 14"/>
+            <wp:cNvGraphicFramePr>
+              <a:graphicFrameLocks xmlns:a="http://schemas.openxmlformats.org/drawingml/2006/main" noChangeAspect="1"/>
+            </wp:cNvGraphicFramePr>
+            <a:graphic xmlns:a="http://schemas.openxmlformats.org/drawingml/2006/main">
+              <a:graphicData uri="http://schemas.openxmlformats.org/drawingml/2006/picture">
+                <pic:pic xmlns:pic="http://schemas.openxmlformats.org/drawingml/2006/picture">
+                  <pic:nvPicPr>
+                    <pic:cNvPr id="1" name=""/>
+                    <pic:cNvPicPr/>
+                  </pic:nvPicPr>
+                  <pic:blipFill>
+                    <a:blip r:embed="rId17"/>
+                    <a:stretch>
+                      <a:fillRect/>
+                    </a:stretch>
+                  </pic:blipFill>
+                  <pic:spPr>
+                    <a:xfrm>
+                      <a:off x="0" y="0"/>
+                      <a:ext cx="6120130" cy="3112770"/>
+                    </a:xfrm>
+                    <a:prstGeom prst="rect">
+                      <a:avLst/>
+                    </a:prstGeom>
+                  </pic:spPr>
+                </pic:pic>
+              </a:graphicData>
+            </a:graphic>
+          </wp:inline>
+        </w:drawing>
+      </w:r>
       <w:r>
         <w:t>5.3. Pipeline điều phối và cấu hình hệ thống</w:t>
       </w:r>
@@ -17768,7 +18053,14 @@
               <w:rPr>
                 <w:rFonts w:ascii="Times New Roman" w:hAnsi="Times New Roman" w:cs="Times New Roman"/>
               </w:rPr>
-              <w:t>Đa hình cấp sự kiện (bắt buộc)</w:t>
+              <w:t xml:space="preserve">Đa hình cấp sự </w:t>
+            </w:r>
+            <w:r>
+              <w:rPr>
+                <w:rFonts w:ascii="Times New Roman" w:hAnsi="Times New Roman" w:cs="Times New Roman"/>
+              </w:rPr>
+              <w:lastRenderedPageBreak/>
+              <w:t>kiện (bắt buộc)</w:t>
             </w:r>
           </w:p>
         </w:tc>
@@ -17791,7 +18083,15 @@
               <w:rPr>
                 <w:rFonts w:ascii="Times New Roman" w:hAnsi="Times New Roman" w:cs="Times New Roman"/>
               </w:rPr>
-              <w:t>club.events["E1"].get_attendance_weight()</w:t>
+              <w:lastRenderedPageBreak/>
+              <w:t>club.events["E1"].</w:t>
+            </w:r>
+            <w:r>
+              <w:rPr>
+                <w:rFonts w:ascii="Times New Roman" w:hAnsi="Times New Roman" w:cs="Times New Roman"/>
+              </w:rPr>
+              <w:lastRenderedPageBreak/>
+              <w:t>get_attendance_weight()</w:t>
             </w:r>
           </w:p>
         </w:tc>
@@ -17814,6 +18114,7 @@
               <w:rPr>
                 <w:rFonts w:ascii="Times New Roman" w:hAnsi="Times New Roman" w:cs="Times New Roman"/>
               </w:rPr>
+              <w:lastRenderedPageBreak/>
               <w:t>1.5</w:t>
             </w:r>
           </w:p>
@@ -18099,7 +18400,6 @@
               <w:rPr>
                 <w:rFonts w:ascii="Times New Roman" w:hAnsi="Times New Roman" w:cs="Times New Roman"/>
               </w:rPr>
-              <w:lastRenderedPageBreak/>
               <w:t>TC-OOP-04</w:t>
             </w:r>
           </w:p>
@@ -18801,6 +19101,7 @@
       </w:pPr>
       <w:bookmarkStart w:id="50" w:name="_Toc237780442"/>
       <w:r>
+        <w:lastRenderedPageBreak/>
         <w:t>CHƯƠNG 7: KẾT LUẬN</w:t>
       </w:r>
       <w:bookmarkEnd w:id="50"/>
@@ -18869,7 +19170,6 @@
           <w:rFonts w:ascii="Times New Roman" w:hAnsi="Times New Roman" w:cs="Times New Roman"/>
           <w:b/>
         </w:rPr>
-        <w:lastRenderedPageBreak/>
         <w:t>CLO3 — Trực quan hóa dữ liệu.</w:t>
       </w:r>
       <w:r>
@@ -19097,6 +19397,7 @@
           <w:rFonts w:ascii="Times New Roman" w:hAnsi="Times New Roman" w:cs="Times New Roman"/>
           <w:b/>
         </w:rPr>
+        <w:lastRenderedPageBreak/>
         <w:t>Hạn chế kỹ thuật.</w:t>
       </w:r>
     </w:p>
@@ -19181,14 +19482,7 @@
         <w:rPr>
           <w:rFonts w:ascii="Times New Roman" w:hAnsi="Times New Roman" w:cs="Times New Roman"/>
         </w:rPr>
-        <w:t xml:space="preserve"> Dự án từng triển khai module phân tích đồ thị đồng tham gia (src/analysis/network.py), biểu diễn hai thành viên có cạnh nối nếu cùng dự một sự kiện. Module này bị loại vì trong bối cảnh câu lạc bộ có nhiều sự kiện bắt buộc, hầu hết các cặp thành viên đều từng gặp nhau, khiến đồ thị gần như đầy đủ và không mang thông tin phân biệt. Bản đồ nhiệt điểm </w:t>
-      </w:r>
-      <w:r>
-        <w:rPr>
-          <w:rFonts w:ascii="Times New Roman" w:hAnsi="Times New Roman" w:cs="Times New Roman"/>
-        </w:rPr>
-        <w:lastRenderedPageBreak/>
-        <w:t>danh (mục 5.1.5) được xây dựng để thay thế.</w:t>
+        <w:t xml:space="preserve"> Dự án từng triển khai module phân tích đồ thị đồng tham gia (src/analysis/network.py), biểu diễn hai thành viên có cạnh nối nếu cùng dự một sự kiện. Module này bị loại vì trong bối cảnh câu lạc bộ có nhiều sự kiện bắt buộc, hầu hết các cặp thành viên đều từng gặp nhau, khiến đồ thị gần như đầy đủ và không mang thông tin phân biệt. Bản đồ nhiệt điểm danh (mục 5.1.5) được xây dựng để thay thế.</w:t>
       </w:r>
     </w:p>
     <w:p>
@@ -19525,7 +19819,14 @@
               <w:rPr>
                 <w:rFonts w:ascii="Times New Roman" w:hAnsi="Times New Roman" w:cs="Times New Roman"/>
               </w:rPr>
-              <w:t>statistic = 1.4340, p = 0.8383 — không có ý nghĩa thống kê</w:t>
+              <w:t xml:space="preserve">statistic = 1.4340, p = 0.8383 — không có ý </w:t>
+            </w:r>
+            <w:r>
+              <w:rPr>
+                <w:rFonts w:ascii="Times New Roman" w:hAnsi="Times New Roman" w:cs="Times New Roman"/>
+              </w:rPr>
+              <w:lastRenderedPageBreak/>
+              <w:t>nghĩa thống kê</w:t>
             </w:r>
           </w:p>
         </w:tc>
@@ -19550,6 +19851,7 @@
               <w:rPr>
                 <w:rFonts w:ascii="Times New Roman" w:hAnsi="Times New Roman" w:cs="Times New Roman"/>
               </w:rPr>
+              <w:lastRenderedPageBreak/>
               <w:t>Chi-square (bắt buộc vs tự chọn)</w:t>
             </w:r>
           </w:p>
@@ -20119,8 +20421,37 @@
         <w:t>python -m src.db.sql_loader</w:t>
       </w:r>
     </w:p>
+    <w:p>
+      <w:pPr>
+        <w:pStyle w:val="Heading1"/>
+        <w:rPr>
+          <w:lang w:val="en-US"/>
+        </w:rPr>
+      </w:pPr>
+      <w:r>
+        <w:rPr>
+          <w:lang w:val="en-US"/>
+        </w:rPr>
+        <w:t xml:space="preserve">MÃ NGUỒN </w:t>
+      </w:r>
+    </w:p>
+    <w:p>
+      <w:pPr>
+        <w:rPr>
+          <w:lang w:val="en-US"/>
+        </w:rPr>
+      </w:pPr>
+      <w:hyperlink r:id="rId18" w:history="1">
+        <w:r>
+          <w:rPr>
+            <w:rStyle w:val="Hyperlink"/>
+          </w:rPr>
+          <w:t>Kousujo/python-club-da-manager</w:t>
+        </w:r>
+      </w:hyperlink>
+    </w:p>
     <w:sectPr>
-      <w:footerReference w:type="default" r:id="rId10"/>
+      <w:footerReference w:type="default" r:id="rId19"/>
       <w:pgSz w:w="11906" w:h="16838"/>
       <w:pgMar w:top="1134" w:right="1134" w:bottom="1134" w:left="1134" w:header="720" w:footer="720" w:gutter="0"/>
       <w:pgBorders w:zOrder="back" w:display="firstPage">
@@ -23108,7 +23439,6 @@
   <w:style w:type="character" w:default="1" w:styleId="DefaultParagraphFont">
     <w:name w:val="Default Paragraph Font"/>
     <w:uiPriority w:val="1"/>
-    <w:semiHidden/>
     <w:unhideWhenUsed/>
   </w:style>
   <w:style w:type="table" w:default="1" w:styleId="TableNormal">

</xml_diff>

<commit_message>
fix: cap nhat bao cao
</commit_message>
<xml_diff>
--- a/report/doc/Bao_cao_cuoi_ky_python_DA.docx
+++ b/report/doc/Bao_cao_cuoi_ky_python_DA.docx
@@ -4576,7 +4576,7 @@
       </w:pPr>
       <w:bookmarkStart w:id="6" w:name="_Toc237780398"/>
       <w:r>
-        <w:t>1.2. Mục tiêu dự án</w:t>
+        <w:t>1.2 Mục tiêu dự án</w:t>
       </w:r>
       <w:bookmarkEnd w:id="6"/>
     </w:p>
@@ -4705,7 +4705,7 @@
       </w:pPr>
       <w:bookmarkStart w:id="7" w:name="_Toc237780399"/>
       <w:r>
-        <w:t>1.3. Ma trận đáp ứng chuẩn đầu ra (Rubric R05)</w:t>
+        <w:t>1.3 Ma trận đáp ứng chuẩn đầu ra (Rubric R05)</w:t>
       </w:r>
       <w:bookmarkEnd w:id="7"/>
     </w:p>
@@ -5332,7 +5332,7 @@
       </w:pPr>
       <w:bookmarkStart w:id="8" w:name="_Toc237780400"/>
       <w:r>
-        <w:t>1.4. Đặc tả tập dữ liệu</w:t>
+        <w:t>1.4 Đặc tả tập dữ liệu</w:t>
       </w:r>
       <w:bookmarkEnd w:id="8"/>
     </w:p>
@@ -5713,7 +5713,7 @@
       </w:pPr>
       <w:bookmarkStart w:id="9" w:name="_Toc237780401"/>
       <w:r>
-        <w:t>1.5. Kiến trúc phân tầng hệ thống</w:t>
+        <w:t>1.5 Kiến trúc phân tầng hệ thống</w:t>
       </w:r>
       <w:bookmarkEnd w:id="9"/>
     </w:p>
@@ -6078,12 +6078,21 @@
     <w:p>
       <w:pPr>
         <w:pStyle w:val="Heading3"/>
+        <w:rPr>
+          <w:lang w:val="en-US"/>
+        </w:rPr>
       </w:pPr>
       <w:bookmarkStart w:id="12" w:name="_Toc237780404"/>
       <w:r>
         <w:t>1.6.2 Bảng phân công</w:t>
       </w:r>
       <w:bookmarkEnd w:id="12"/>
+      <w:r>
+        <w:rPr>
+          <w:lang w:val="en-US"/>
+        </w:rPr>
+        <w:t xml:space="preserve"> theo kế hoạch ban đầu</w:t>
+      </w:r>
     </w:p>
     <w:tbl>
       <w:tblPr>
@@ -6099,11 +6108,11 @@
         <w:tblLook w:val="04A0" w:firstRow="1" w:lastRow="0" w:firstColumn="1" w:lastColumn="0" w:noHBand="0" w:noVBand="1"/>
       </w:tblPr>
       <w:tblGrid>
-        <w:gridCol w:w="1925"/>
-        <w:gridCol w:w="1926"/>
-        <w:gridCol w:w="1925"/>
-        <w:gridCol w:w="1926"/>
-        <w:gridCol w:w="1926"/>
+        <w:gridCol w:w="1440"/>
+        <w:gridCol w:w="1440"/>
+        <w:gridCol w:w="3600"/>
+        <w:gridCol w:w="2340"/>
+        <w:gridCol w:w="808"/>
       </w:tblGrid>
       <w:tr>
         <w:trPr>
@@ -6111,7 +6120,7 @@
         </w:trPr>
         <w:tc>
           <w:tcPr>
-            <w:tcW w:w="1925" w:type="dxa"/>
+            <w:tcW w:w="1440" w:type="dxa"/>
             <w:tcBorders>
               <w:top w:val="single" w:sz="4" w:space="0" w:color="000000"/>
               <w:left w:val="single" w:sz="4" w:space="0" w:color="000000"/>
@@ -6130,7 +6139,7 @@
         </w:tc>
         <w:tc>
           <w:tcPr>
-            <w:tcW w:w="1926" w:type="dxa"/>
+            <w:tcW w:w="1440" w:type="dxa"/>
             <w:tcBorders>
               <w:top w:val="single" w:sz="4" w:space="0" w:color="000000"/>
               <w:left w:val="single" w:sz="4" w:space="0" w:color="000000"/>
@@ -6149,7 +6158,7 @@
         </w:tc>
         <w:tc>
           <w:tcPr>
-            <w:tcW w:w="1925" w:type="dxa"/>
+            <w:tcW w:w="3600" w:type="dxa"/>
             <w:tcBorders>
               <w:top w:val="single" w:sz="4" w:space="0" w:color="000000"/>
               <w:left w:val="single" w:sz="4" w:space="0" w:color="000000"/>
@@ -6168,7 +6177,7 @@
         </w:tc>
         <w:tc>
           <w:tcPr>
-            <w:tcW w:w="1926" w:type="dxa"/>
+            <w:tcW w:w="2340" w:type="dxa"/>
             <w:tcBorders>
               <w:top w:val="single" w:sz="4" w:space="0" w:color="000000"/>
               <w:left w:val="single" w:sz="4" w:space="0" w:color="000000"/>
@@ -6187,7 +6196,7 @@
         </w:tc>
         <w:tc>
           <w:tcPr>
-            <w:tcW w:w="1926" w:type="dxa"/>
+            <w:tcW w:w="808" w:type="dxa"/>
             <w:tcBorders>
               <w:top w:val="single" w:sz="4" w:space="0" w:color="000000"/>
               <w:left w:val="single" w:sz="4" w:space="0" w:color="000000"/>
@@ -6209,7 +6218,7 @@
       <w:tr>
         <w:tc>
           <w:tcPr>
-            <w:tcW w:w="1925" w:type="dxa"/>
+            <w:tcW w:w="1440" w:type="dxa"/>
             <w:tcBorders>
               <w:left w:val="single" w:sz="4" w:space="0" w:color="000000"/>
               <w:bottom w:val="single" w:sz="4" w:space="0" w:color="000000"/>
@@ -6229,7 +6238,7 @@
         </w:tc>
         <w:tc>
           <w:tcPr>
-            <w:tcW w:w="1926" w:type="dxa"/>
+            <w:tcW w:w="1440" w:type="dxa"/>
             <w:tcBorders>
               <w:left w:val="single" w:sz="4" w:space="0" w:color="000000"/>
               <w:bottom w:val="single" w:sz="4" w:space="0" w:color="000000"/>
@@ -6250,7 +6259,7 @@
         </w:tc>
         <w:tc>
           <w:tcPr>
-            <w:tcW w:w="1925" w:type="dxa"/>
+            <w:tcW w:w="3600" w:type="dxa"/>
             <w:tcBorders>
               <w:left w:val="single" w:sz="4" w:space="0" w:color="000000"/>
               <w:bottom w:val="single" w:sz="4" w:space="0" w:color="000000"/>
@@ -6303,7 +6312,7 @@
         </w:tc>
         <w:tc>
           <w:tcPr>
-            <w:tcW w:w="1926" w:type="dxa"/>
+            <w:tcW w:w="2340" w:type="dxa"/>
             <w:tcBorders>
               <w:left w:val="single" w:sz="4" w:space="0" w:color="000000"/>
               <w:bottom w:val="single" w:sz="4" w:space="0" w:color="000000"/>
@@ -6362,7 +6371,7 @@
         </w:tc>
         <w:tc>
           <w:tcPr>
-            <w:tcW w:w="1926" w:type="dxa"/>
+            <w:tcW w:w="808" w:type="dxa"/>
             <w:tcBorders>
               <w:left w:val="single" w:sz="4" w:space="0" w:color="000000"/>
               <w:bottom w:val="single" w:sz="4" w:space="0" w:color="000000"/>
@@ -6382,7 +6391,7 @@
       <w:tr>
         <w:tc>
           <w:tcPr>
-            <w:tcW w:w="1925" w:type="dxa"/>
+            <w:tcW w:w="1440" w:type="dxa"/>
             <w:tcBorders>
               <w:left w:val="single" w:sz="4" w:space="0" w:color="000000"/>
               <w:bottom w:val="single" w:sz="4" w:space="0" w:color="000000"/>
@@ -6402,7 +6411,7 @@
         </w:tc>
         <w:tc>
           <w:tcPr>
-            <w:tcW w:w="1926" w:type="dxa"/>
+            <w:tcW w:w="1440" w:type="dxa"/>
             <w:tcBorders>
               <w:left w:val="single" w:sz="4" w:space="0" w:color="000000"/>
               <w:bottom w:val="single" w:sz="4" w:space="0" w:color="000000"/>
@@ -6423,7 +6432,7 @@
         </w:tc>
         <w:tc>
           <w:tcPr>
-            <w:tcW w:w="1925" w:type="dxa"/>
+            <w:tcW w:w="3600" w:type="dxa"/>
             <w:tcBorders>
               <w:left w:val="single" w:sz="4" w:space="0" w:color="000000"/>
               <w:bottom w:val="single" w:sz="4" w:space="0" w:color="000000"/>
@@ -6449,7 +6458,7 @@
         </w:tc>
         <w:tc>
           <w:tcPr>
-            <w:tcW w:w="1926" w:type="dxa"/>
+            <w:tcW w:w="2340" w:type="dxa"/>
             <w:tcBorders>
               <w:left w:val="single" w:sz="4" w:space="0" w:color="000000"/>
               <w:bottom w:val="single" w:sz="4" w:space="0" w:color="000000"/>
@@ -6487,7 +6496,7 @@
         </w:tc>
         <w:tc>
           <w:tcPr>
-            <w:tcW w:w="1926" w:type="dxa"/>
+            <w:tcW w:w="808" w:type="dxa"/>
             <w:tcBorders>
               <w:left w:val="single" w:sz="4" w:space="0" w:color="000000"/>
               <w:bottom w:val="single" w:sz="4" w:space="0" w:color="000000"/>
@@ -6507,7 +6516,7 @@
       <w:tr>
         <w:tc>
           <w:tcPr>
-            <w:tcW w:w="1925" w:type="dxa"/>
+            <w:tcW w:w="1440" w:type="dxa"/>
             <w:tcBorders>
               <w:left w:val="single" w:sz="4" w:space="0" w:color="000000"/>
               <w:bottom w:val="single" w:sz="4" w:space="0" w:color="000000"/>
@@ -6527,7 +6536,7 @@
         </w:tc>
         <w:tc>
           <w:tcPr>
-            <w:tcW w:w="1926" w:type="dxa"/>
+            <w:tcW w:w="1440" w:type="dxa"/>
             <w:tcBorders>
               <w:left w:val="single" w:sz="4" w:space="0" w:color="000000"/>
               <w:bottom w:val="single" w:sz="4" w:space="0" w:color="000000"/>
@@ -6551,28 +6560,24 @@
         </w:tc>
         <w:tc>
           <w:tcPr>
-            <w:tcW w:w="1925" w:type="dxa"/>
-            <w:tcBorders>
-              <w:left w:val="single" w:sz="4" w:space="0" w:color="000000"/>
-              <w:bottom w:val="single" w:sz="4" w:space="0" w:color="000000"/>
-            </w:tcBorders>
-          </w:tcPr>
-          <w:p>
-            <w:pPr>
-              <w:pStyle w:val="TableContents"/>
-            </w:pPr>
-            <w:r>
-              <w:t xml:space="preserve">Hồi quy tuyến tính xu hướng tăng trưởng; chuẩn hóa z-score và phân loại bách phân vị; thuật toán nguy cơ ngừng tham gia; ba kiểm định giả thuyết; thuật toán </w:t>
-            </w:r>
-            <w:r>
-              <w:lastRenderedPageBreak/>
-              <w:t>sức giữ chân của sự kiện; kết xuất sáu biểu đồ Matplotlib</w:t>
-            </w:r>
-          </w:p>
-        </w:tc>
-        <w:tc>
-          <w:tcPr>
-            <w:tcW w:w="1926" w:type="dxa"/>
+            <w:tcW w:w="3600" w:type="dxa"/>
+            <w:tcBorders>
+              <w:left w:val="single" w:sz="4" w:space="0" w:color="000000"/>
+              <w:bottom w:val="single" w:sz="4" w:space="0" w:color="000000"/>
+            </w:tcBorders>
+          </w:tcPr>
+          <w:p>
+            <w:pPr>
+              <w:pStyle w:val="TableContents"/>
+            </w:pPr>
+            <w:r>
+              <w:t>Hồi quy tuyến tính xu hướng tăng trưởng; chuẩn hóa z-score và phân loại bách phân vị; thuật toán nguy cơ ngừng tham gia; ba kiểm định giả thuyết; thuật toán sức giữ chân của sự kiện; kết xuất sáu biểu đồ Matplotlib</w:t>
+            </w:r>
+          </w:p>
+        </w:tc>
+        <w:tc>
+          <w:tcPr>
+            <w:tcW w:w="2340" w:type="dxa"/>
             <w:tcBorders>
               <w:left w:val="single" w:sz="4" w:space="0" w:color="000000"/>
               <w:bottom w:val="single" w:sz="4" w:space="0" w:color="000000"/>
@@ -6586,7 +6591,6 @@
               <w:rPr>
                 <w:rFonts w:ascii="Liberation Mono" w:hAnsi="Liberation Mono"/>
               </w:rPr>
-              <w:lastRenderedPageBreak/>
               <w:t>src/analysis/stats.py</w:t>
             </w:r>
             <w:r>
@@ -6602,7 +6606,7 @@
         </w:tc>
         <w:tc>
           <w:tcPr>
-            <w:tcW w:w="1926" w:type="dxa"/>
+            <w:tcW w:w="808" w:type="dxa"/>
             <w:tcBorders>
               <w:left w:val="single" w:sz="4" w:space="0" w:color="000000"/>
               <w:bottom w:val="single" w:sz="4" w:space="0" w:color="000000"/>
@@ -6622,7 +6626,7 @@
       <w:tr>
         <w:tc>
           <w:tcPr>
-            <w:tcW w:w="1925" w:type="dxa"/>
+            <w:tcW w:w="1440" w:type="dxa"/>
             <w:tcBorders>
               <w:left w:val="single" w:sz="4" w:space="0" w:color="000000"/>
               <w:bottom w:val="single" w:sz="4" w:space="0" w:color="000000"/>
@@ -6638,11 +6642,27 @@
               </w:rPr>
               <w:t>4. Tầng mở rộng (SQL Server + Streamlit)</w:t>
             </w:r>
-          </w:p>
-        </w:tc>
-        <w:tc>
-          <w:tcPr>
-            <w:tcW w:w="1926" w:type="dxa"/>
+            <w:r>
+              <w:rPr>
+                <w:b/>
+              </w:rPr>
+              <w:t xml:space="preserve"> và</w:t>
+            </w:r>
+            <w:r>
+              <w:t xml:space="preserve"> </w:t>
+            </w:r>
+            <w:r>
+              <w:rPr>
+                <w:b/>
+                <w:bCs/>
+              </w:rPr>
+              <w:t>Tích hợp hệ thống</w:t>
+            </w:r>
+          </w:p>
+        </w:tc>
+        <w:tc>
+          <w:tcPr>
+            <w:tcW w:w="1440" w:type="dxa"/>
             <w:tcBorders>
               <w:left w:val="single" w:sz="4" w:space="0" w:color="000000"/>
               <w:bottom w:val="single" w:sz="4" w:space="0" w:color="000000"/>
@@ -6659,7 +6679,7 @@
         </w:tc>
         <w:tc>
           <w:tcPr>
-            <w:tcW w:w="1925" w:type="dxa"/>
+            <w:tcW w:w="3600" w:type="dxa"/>
             <w:tcBorders>
               <w:left w:val="single" w:sz="4" w:space="0" w:color="000000"/>
               <w:bottom w:val="single" w:sz="4" w:space="0" w:color="000000"/>
@@ -6672,11 +6692,22 @@
             <w:r>
               <w:t>Thiết kế lược đồ quan hệ với ràng buộc khóa ngoại và ràng buộc duy nhất; nạp dữ liệu qua SQLAlchemy với truy vấn tham số hóa; bốn truy vấn đối chiếu (JOIN, GROUP BY, window function); xây dựng dashboard Streamlit sáu tab</w:t>
             </w:r>
-          </w:p>
-        </w:tc>
-        <w:tc>
-          <w:tcPr>
-            <w:tcW w:w="1926" w:type="dxa"/>
+            <w:r>
+              <w:t>,</w:t>
+            </w:r>
+          </w:p>
+          <w:p>
+            <w:pPr>
+              <w:pStyle w:val="TableContents"/>
+            </w:pPr>
+            <w:r>
+              <w:t>Ghép bốn tầng thành pipeline hoàn chỉnh, xử lý xung đột giao diện giữa các tầng</w:t>
+            </w:r>
+          </w:p>
+        </w:tc>
+        <w:tc>
+          <w:tcPr>
+            <w:tcW w:w="2340" w:type="dxa"/>
             <w:tcBorders>
               <w:left w:val="single" w:sz="4" w:space="0" w:color="000000"/>
               <w:bottom w:val="single" w:sz="4" w:space="0" w:color="000000"/>
@@ -6719,11 +6750,23 @@
               </w:rPr>
               <w:t>dashboard.py</w:t>
             </w:r>
-          </w:p>
-        </w:tc>
-        <w:tc>
-          <w:tcPr>
-            <w:tcW w:w="1926" w:type="dxa"/>
+            <w:r>
+              <w:rPr>
+                <w:rFonts w:ascii="Liberation Mono" w:hAnsi="Liberation Mono"/>
+              </w:rPr>
+              <w:t xml:space="preserve">, </w:t>
+            </w:r>
+            <w:r>
+              <w:rPr>
+                <w:rFonts w:ascii="Liberation Mono" w:hAnsi="Liberation Mono"/>
+              </w:rPr>
+              <w:t>main.py</w:t>
+            </w:r>
+          </w:p>
+        </w:tc>
+        <w:tc>
+          <w:tcPr>
+            <w:tcW w:w="808" w:type="dxa"/>
             <w:tcBorders>
               <w:left w:val="single" w:sz="4" w:space="0" w:color="000000"/>
               <w:bottom w:val="single" w:sz="4" w:space="0" w:color="000000"/>
@@ -6749,10 +6792,46 @@
     <w:p>
       <w:pPr>
         <w:pStyle w:val="Heading3"/>
+        <w:rPr>
+          <w:lang w:val="en-US"/>
+        </w:rPr>
       </w:pPr>
       <w:bookmarkStart w:id="13" w:name="_Toc237780405"/>
       <w:r>
-        <w:t>1.6.3 Phần công việc chung của cả nhóm</w:t>
+        <w:t>1.6.3 Thực tế triển khai</w:t>
+      </w:r>
+    </w:p>
+    <w:p>
+      <w:r>
+        <w:lastRenderedPageBreak/>
+        <w:t>Trong quá trình thực hiện, do chênh lệch về nền tảng lập trình giữa các thành viên, khối lượng công việc không phân bổ đúng như kế hoạch ban đầu. Thành viên phụ trách tầng mở rộng đã đảm nhận thêm phần lớn công việc lập trình ở ba hạng mục còn lại, đồng thời giữ vai trò thiết kế kiến trúc, định nghĩa giao diện giữa các tầng và quản lý mã nguồn trên GitHub. Điều này được phản ánh trong bảng tỷ lệ đóng góp ở mục 1.6.5.</w:t>
+      </w:r>
+    </w:p>
+    <w:p>
+      <w:pPr>
+        <w:rPr>
+          <w:lang w:val="en-US"/>
+        </w:rPr>
+      </w:pPr>
+      <w:r>
+        <w:t>Cách tổ chức mã nguồn theo bốn tầng có giao diện rõ ràng ở mục 1.6.1 vẫn giữ nguyên giá trị: nó cho phép các hạng mục được phát triển và kiểm thử độc lập, và là cơ sở để một thành viên có thể tiếp quản hạng mục của thành viên khác mà không phải viết lại từ đầu.</w:t>
+      </w:r>
+    </w:p>
+    <w:p>
+      <w:pPr>
+        <w:pStyle w:val="Heading3"/>
+      </w:pPr>
+      <w:r>
+        <w:t>1.6.</w:t>
+      </w:r>
+      <w:r>
+        <w:rPr>
+          <w:lang w:val="en-US"/>
+        </w:rPr>
+        <w:t>4</w:t>
+      </w:r>
+      <w:r>
+        <w:t xml:space="preserve"> Phần công việc chung của cả nhóm</w:t>
       </w:r>
       <w:bookmarkEnd w:id="13"/>
     </w:p>
@@ -6761,7 +6840,13 @@
         <w:pStyle w:val="BodyText"/>
       </w:pPr>
       <w:r>
-        <w:t>Bốn hạng mục dưới đây do cả nhóm cùng thực hiện, không quy về một cá nhân:</w:t>
+        <w:t>B</w:t>
+      </w:r>
+      <w:r>
+        <w:t>a</w:t>
+      </w:r>
+      <w:r>
+        <w:t xml:space="preserve"> hạng mục dưới đây do cả nhóm cùng thực hiện, không quy về một cá nhân:</w:t>
       </w:r>
     </w:p>
     <w:tbl>
@@ -6788,7 +6873,7 @@
         </w:trPr>
         <w:tc>
           <w:tcPr>
-            <w:tcW w:w="3212" w:type="dxa"/>
+            <w:tcW w:w="3208" w:type="dxa"/>
             <w:tcBorders>
               <w:top w:val="single" w:sz="4" w:space="0" w:color="000000"/>
               <w:left w:val="single" w:sz="4" w:space="0" w:color="000000"/>
@@ -6807,7 +6892,7 @@
         </w:tc>
         <w:tc>
           <w:tcPr>
-            <w:tcW w:w="3213" w:type="dxa"/>
+            <w:tcW w:w="3210" w:type="dxa"/>
             <w:tcBorders>
               <w:top w:val="single" w:sz="4" w:space="0" w:color="000000"/>
               <w:left w:val="single" w:sz="4" w:space="0" w:color="000000"/>
@@ -6826,7 +6911,7 @@
         </w:tc>
         <w:tc>
           <w:tcPr>
-            <w:tcW w:w="3213" w:type="dxa"/>
+            <w:tcW w:w="3210" w:type="dxa"/>
             <w:tcBorders>
               <w:top w:val="single" w:sz="4" w:space="0" w:color="000000"/>
               <w:left w:val="single" w:sz="4" w:space="0" w:color="000000"/>
@@ -6848,7 +6933,7 @@
       <w:tr>
         <w:tc>
           <w:tcPr>
-            <w:tcW w:w="3212" w:type="dxa"/>
+            <w:tcW w:w="3208" w:type="dxa"/>
             <w:tcBorders>
               <w:left w:val="single" w:sz="4" w:space="0" w:color="000000"/>
               <w:bottom w:val="single" w:sz="4" w:space="0" w:color="000000"/>
@@ -6865,7 +6950,7 @@
         </w:tc>
         <w:tc>
           <w:tcPr>
-            <w:tcW w:w="3213" w:type="dxa"/>
+            <w:tcW w:w="3210" w:type="dxa"/>
             <w:tcBorders>
               <w:left w:val="single" w:sz="4" w:space="0" w:color="000000"/>
               <w:bottom w:val="single" w:sz="4" w:space="0" w:color="000000"/>
@@ -6882,7 +6967,7 @@
         </w:tc>
         <w:tc>
           <w:tcPr>
-            <w:tcW w:w="3213" w:type="dxa"/>
+            <w:tcW w:w="3210" w:type="dxa"/>
             <w:tcBorders>
               <w:left w:val="single" w:sz="4" w:space="0" w:color="000000"/>
               <w:bottom w:val="single" w:sz="4" w:space="0" w:color="000000"/>
@@ -6902,7 +6987,7 @@
       <w:tr>
         <w:tc>
           <w:tcPr>
-            <w:tcW w:w="3212" w:type="dxa"/>
+            <w:tcW w:w="3208" w:type="dxa"/>
             <w:tcBorders>
               <w:left w:val="single" w:sz="4" w:space="0" w:color="000000"/>
               <w:bottom w:val="single" w:sz="4" w:space="0" w:color="000000"/>
@@ -6919,7 +7004,7 @@
         </w:tc>
         <w:tc>
           <w:tcPr>
-            <w:tcW w:w="3213" w:type="dxa"/>
+            <w:tcW w:w="3210" w:type="dxa"/>
             <w:tcBorders>
               <w:left w:val="single" w:sz="4" w:space="0" w:color="000000"/>
               <w:bottom w:val="single" w:sz="4" w:space="0" w:color="000000"/>
@@ -6936,7 +7021,7 @@
         </w:tc>
         <w:tc>
           <w:tcPr>
-            <w:tcW w:w="3213" w:type="dxa"/>
+            <w:tcW w:w="3210" w:type="dxa"/>
             <w:tcBorders>
               <w:left w:val="single" w:sz="4" w:space="0" w:color="000000"/>
               <w:bottom w:val="single" w:sz="4" w:space="0" w:color="000000"/>
@@ -6968,64 +7053,7 @@
       <w:tr>
         <w:tc>
           <w:tcPr>
-            <w:tcW w:w="3212" w:type="dxa"/>
-            <w:tcBorders>
-              <w:left w:val="single" w:sz="4" w:space="0" w:color="000000"/>
-              <w:bottom w:val="single" w:sz="4" w:space="0" w:color="000000"/>
-            </w:tcBorders>
-          </w:tcPr>
-          <w:p>
-            <w:pPr>
-              <w:pStyle w:val="TableContents"/>
-            </w:pPr>
-            <w:r>
-              <w:t>Tích hợp hệ thống</w:t>
-            </w:r>
-          </w:p>
-        </w:tc>
-        <w:tc>
-          <w:tcPr>
-            <w:tcW w:w="3213" w:type="dxa"/>
-            <w:tcBorders>
-              <w:left w:val="single" w:sz="4" w:space="0" w:color="000000"/>
-              <w:bottom w:val="single" w:sz="4" w:space="0" w:color="000000"/>
-            </w:tcBorders>
-          </w:tcPr>
-          <w:p>
-            <w:pPr>
-              <w:pStyle w:val="TableContents"/>
-            </w:pPr>
-            <w:r>
-              <w:t>Ghép bốn tầng thành pipeline hoàn chỉnh, xử lý xung đột giao diện giữa các tầng</w:t>
-            </w:r>
-          </w:p>
-        </w:tc>
-        <w:tc>
-          <w:tcPr>
-            <w:tcW w:w="3213" w:type="dxa"/>
-            <w:tcBorders>
-              <w:left w:val="single" w:sz="4" w:space="0" w:color="000000"/>
-              <w:bottom w:val="single" w:sz="4" w:space="0" w:color="000000"/>
-              <w:right w:val="single" w:sz="4" w:space="0" w:color="000000"/>
-            </w:tcBorders>
-          </w:tcPr>
-          <w:p>
-            <w:pPr>
-              <w:pStyle w:val="TableContents"/>
-            </w:pPr>
-            <w:r>
-              <w:rPr>
-                <w:rFonts w:ascii="Liberation Mono" w:hAnsi="Liberation Mono"/>
-              </w:rPr>
-              <w:t>main.py</w:t>
-            </w:r>
-          </w:p>
-        </w:tc>
-      </w:tr>
-      <w:tr>
-        <w:tc>
-          <w:tcPr>
-            <w:tcW w:w="3212" w:type="dxa"/>
+            <w:tcW w:w="3208" w:type="dxa"/>
             <w:tcBorders>
               <w:left w:val="single" w:sz="4" w:space="0" w:color="000000"/>
               <w:bottom w:val="single" w:sz="4" w:space="0" w:color="000000"/>
@@ -7042,24 +7070,24 @@
         </w:tc>
         <w:tc>
           <w:tcPr>
-            <w:tcW w:w="3213" w:type="dxa"/>
-            <w:tcBorders>
-              <w:left w:val="single" w:sz="4" w:space="0" w:color="000000"/>
-              <w:bottom w:val="single" w:sz="4" w:space="0" w:color="000000"/>
-            </w:tcBorders>
-          </w:tcPr>
-          <w:p>
-            <w:pPr>
-              <w:pStyle w:val="TableContents"/>
-            </w:pPr>
-            <w:r>
-              <w:t>Chuẩn bị slide và trình bày; mỗi thành viên trình bày phần mình phụ trách</w:t>
-            </w:r>
-          </w:p>
-        </w:tc>
-        <w:tc>
-          <w:tcPr>
-            <w:tcW w:w="3213" w:type="dxa"/>
+            <w:tcW w:w="3210" w:type="dxa"/>
+            <w:tcBorders>
+              <w:left w:val="single" w:sz="4" w:space="0" w:color="000000"/>
+              <w:bottom w:val="single" w:sz="4" w:space="0" w:color="000000"/>
+            </w:tcBorders>
+          </w:tcPr>
+          <w:p>
+            <w:pPr>
+              <w:pStyle w:val="TableContents"/>
+            </w:pPr>
+            <w:r>
+              <w:t>mỗi thành viên trình bày phần mình phụ trách</w:t>
+            </w:r>
+          </w:p>
+        </w:tc>
+        <w:tc>
+          <w:tcPr>
+            <w:tcW w:w="3210" w:type="dxa"/>
             <w:tcBorders>
               <w:left w:val="single" w:sz="4" w:space="0" w:color="000000"/>
               <w:bottom w:val="single" w:sz="4" w:space="0" w:color="000000"/>
@@ -7088,13 +7116,22 @@
       </w:pPr>
       <w:bookmarkStart w:id="14" w:name="_Toc237780406"/>
       <w:r>
-        <w:t>1.6.4 Bảng tỷ lệ đóng góp</w:t>
+        <w:t>1.6.</w:t>
+      </w:r>
+      <w:r>
+        <w:rPr>
+          <w:lang w:val="en-US"/>
+        </w:rPr>
+        <w:t>5</w:t>
+      </w:r>
+      <w:r>
+        <w:t xml:space="preserve"> Bảng tỷ lệ đóng góp</w:t>
       </w:r>
       <w:bookmarkEnd w:id="14"/>
     </w:p>
     <w:tbl>
       <w:tblPr>
-        <w:tblW w:w="5000" w:type="pct"/>
+        <w:tblW w:w="5068" w:type="pct"/>
         <w:tblInd w:w="-5" w:type="dxa"/>
         <w:tblLayout w:type="fixed"/>
         <w:tblCellMar>
@@ -7106,8 +7143,8 @@
         <w:tblLook w:val="04A0" w:firstRow="1" w:lastRow="0" w:firstColumn="1" w:lastColumn="0" w:noHBand="0" w:noVBand="1"/>
       </w:tblPr>
       <w:tblGrid>
-        <w:gridCol w:w="1925"/>
         <w:gridCol w:w="1926"/>
+        <w:gridCol w:w="2056"/>
         <w:gridCol w:w="1925"/>
         <w:gridCol w:w="1926"/>
         <w:gridCol w:w="1926"/>
@@ -7131,14 +7168,13 @@
               <w:jc w:val="left"/>
             </w:pPr>
             <w:r>
-              <w:lastRenderedPageBreak/>
               <w:t>Thành viên</w:t>
             </w:r>
           </w:p>
         </w:tc>
         <w:tc>
           <w:tcPr>
-            <w:tcW w:w="1926" w:type="dxa"/>
+            <w:tcW w:w="2056" w:type="dxa"/>
             <w:tcBorders>
               <w:top w:val="single" w:sz="4" w:space="0" w:color="000000"/>
               <w:left w:val="single" w:sz="4" w:space="0" w:color="000000"/>
@@ -7238,7 +7274,7 @@
         </w:tc>
         <w:tc>
           <w:tcPr>
-            <w:tcW w:w="1926" w:type="dxa"/>
+            <w:tcW w:w="2056" w:type="dxa"/>
             <w:tcBorders>
               <w:left w:val="single" w:sz="4" w:space="0" w:color="000000"/>
               <w:bottom w:val="single" w:sz="4" w:space="0" w:color="000000"/>
@@ -7330,7 +7366,7 @@
         </w:tc>
         <w:tc>
           <w:tcPr>
-            <w:tcW w:w="1926" w:type="dxa"/>
+            <w:tcW w:w="2056" w:type="dxa"/>
             <w:tcBorders>
               <w:left w:val="single" w:sz="4" w:space="0" w:color="000000"/>
               <w:bottom w:val="single" w:sz="4" w:space="0" w:color="000000"/>
@@ -7422,7 +7458,7 @@
         </w:tc>
         <w:tc>
           <w:tcPr>
-            <w:tcW w:w="1926" w:type="dxa"/>
+            <w:tcW w:w="2056" w:type="dxa"/>
             <w:tcBorders>
               <w:left w:val="single" w:sz="4" w:space="0" w:color="000000"/>
               <w:bottom w:val="single" w:sz="4" w:space="0" w:color="000000"/>
@@ -7510,6 +7546,43 @@
         </w:tc>
         <w:tc>
           <w:tcPr>
+            <w:tcW w:w="2056" w:type="dxa"/>
+            <w:tcBorders>
+              <w:left w:val="single" w:sz="4" w:space="0" w:color="000000"/>
+              <w:bottom w:val="single" w:sz="4" w:space="0" w:color="000000"/>
+            </w:tcBorders>
+          </w:tcPr>
+          <w:p>
+            <w:pPr>
+              <w:pStyle w:val="TableContents"/>
+            </w:pPr>
+            <w:r>
+              <w:rPr>
+                <w:lang w:val="vi-VN"/>
+              </w:rPr>
+              <w:t>Tầng mở rộng; kiến trúc và tích hợp toàn hệ thống; quản lý mã nguồn.</w:t>
+            </w:r>
+          </w:p>
+        </w:tc>
+        <w:tc>
+          <w:tcPr>
+            <w:tcW w:w="1925" w:type="dxa"/>
+            <w:tcBorders>
+              <w:left w:val="single" w:sz="4" w:space="0" w:color="000000"/>
+              <w:bottom w:val="single" w:sz="4" w:space="0" w:color="000000"/>
+            </w:tcBorders>
+          </w:tcPr>
+          <w:p>
+            <w:pPr>
+              <w:pStyle w:val="TableContents"/>
+            </w:pPr>
+            <w:r>
+              <w:t>Báo cáo, kiểm thử, tích hợp, thuyết trình</w:t>
+            </w:r>
+          </w:p>
+        </w:tc>
+        <w:tc>
+          <w:tcPr>
             <w:tcW w:w="1926" w:type="dxa"/>
             <w:tcBorders>
               <w:left w:val="single" w:sz="4" w:space="0" w:color="000000"/>
@@ -7521,41 +7594,7 @@
               <w:pStyle w:val="TableContents"/>
             </w:pPr>
             <w:r>
-              <w:t>Tầng mở rộng SQL Server và Streamlit</w:t>
-            </w:r>
-          </w:p>
-        </w:tc>
-        <w:tc>
-          <w:tcPr>
-            <w:tcW w:w="1925" w:type="dxa"/>
-            <w:tcBorders>
-              <w:left w:val="single" w:sz="4" w:space="0" w:color="000000"/>
-              <w:bottom w:val="single" w:sz="4" w:space="0" w:color="000000"/>
-            </w:tcBorders>
-          </w:tcPr>
-          <w:p>
-            <w:pPr>
-              <w:pStyle w:val="TableContents"/>
-            </w:pPr>
-            <w:r>
-              <w:t>Báo cáo, kiểm thử, tích hợp, thuyết trình</w:t>
-            </w:r>
-          </w:p>
-        </w:tc>
-        <w:tc>
-          <w:tcPr>
-            <w:tcW w:w="1926" w:type="dxa"/>
-            <w:tcBorders>
-              <w:left w:val="single" w:sz="4" w:space="0" w:color="000000"/>
-              <w:bottom w:val="single" w:sz="4" w:space="0" w:color="000000"/>
-            </w:tcBorders>
-          </w:tcPr>
-          <w:p>
-            <w:pPr>
-              <w:pStyle w:val="TableContents"/>
-            </w:pPr>
-            <w:r>
-              <w:t>35</w:t>
+              <w:t>40</w:t>
             </w:r>
             <w:r>
               <w:t>%</w:t>
@@ -7595,7 +7634,7 @@
         </w:tc>
         <w:tc>
           <w:tcPr>
-            <w:tcW w:w="1926" w:type="dxa"/>
+            <w:tcW w:w="2056" w:type="dxa"/>
             <w:tcBorders>
               <w:left w:val="single" w:sz="4" w:space="0" w:color="000000"/>
               <w:bottom w:val="single" w:sz="4" w:space="0" w:color="000000"/>
@@ -7680,24 +7719,7 @@
     <w:p>
       <w:pPr>
         <w:pStyle w:val="BodyText"/>
-        <w:rPr>
-          <w:rFonts w:ascii="Times New Roman" w:hAnsi="Times New Roman" w:cs="Times New Roman"/>
-        </w:rPr>
-      </w:pPr>
-    </w:p>
-    <w:p>
-      <w:pPr>
-        <w:pStyle w:val="HorizontalLine"/>
-        <w:rPr>
-          <w:rFonts w:ascii="Times New Roman" w:hAnsi="Times New Roman" w:cs="Times New Roman"/>
-        </w:rPr>
-      </w:pPr>
-      <w:r>
-        <w:rPr>
-          <w:rFonts w:ascii="Times New Roman" w:hAnsi="Times New Roman" w:cs="Times New Roman"/>
-        </w:rPr>
-        <w:t>t</w:t>
-      </w:r>
+      </w:pPr>
     </w:p>
     <w:p>
       <w:pPr>
@@ -7718,7 +7740,7 @@
       </w:pPr>
       <w:bookmarkStart w:id="16" w:name="_Toc237780408"/>
       <w:r>
-        <w:t>2.1. Sơ đồ lớp</w:t>
+        <w:t>2.1 Sơ đồ lớp</w:t>
       </w:r>
       <w:bookmarkEnd w:id="16"/>
     </w:p>
@@ -7778,6 +7800,55 @@
     </w:p>
     <w:p>
       <w:pPr>
+        <w:rPr>
+          <w:i/>
+          <w:iCs/>
+          <w:sz w:val="22"/>
+          <w:szCs w:val="22"/>
+          <w:lang w:val="en-US"/>
+        </w:rPr>
+      </w:pPr>
+      <w:r>
+        <w:rPr>
+          <w:i/>
+          <w:iCs/>
+          <w:sz w:val="22"/>
+          <w:szCs w:val="22"/>
+          <w:lang w:val="en-US"/>
+        </w:rPr>
+        <w:t xml:space="preserve">Hình 1 - </w:t>
+      </w:r>
+      <w:r>
+        <w:rPr>
+          <w:i/>
+          <w:iCs/>
+          <w:sz w:val="22"/>
+          <w:szCs w:val="22"/>
+        </w:rPr>
+        <w:t xml:space="preserve">Sơ đồ lớp UML. Tam giác rỗng biểu diễn quan hệ kế thừa, hình thoi đặc biểu diễn quan hệ tổng hợp; phương thức đánh dấu </w:t>
+      </w:r>
+      <w:r>
+        <w:rPr>
+          <w:rFonts w:ascii="Segoe UI Symbol" w:hAnsi="Segoe UI Symbol" w:cs="Segoe UI Symbol"/>
+          <w:i/>
+          <w:iCs/>
+          <w:sz w:val="22"/>
+          <w:szCs w:val="22"/>
+        </w:rPr>
+        <w:t>★</w:t>
+      </w:r>
+      <w:r>
+        <w:rPr>
+          <w:i/>
+          <w:iCs/>
+          <w:sz w:val="22"/>
+          <w:szCs w:val="22"/>
+        </w:rPr>
+        <w:t xml:space="preserve"> là phương thức được ghi đè.</w:t>
+      </w:r>
+    </w:p>
+    <w:p>
+      <w:pPr>
         <w:pStyle w:val="BodyText"/>
         <w:rPr>
           <w:rFonts w:ascii="Times New Roman" w:hAnsi="Times New Roman" w:cs="Times New Roman"/>
@@ -7787,7 +7858,6 @@
         <w:rPr>
           <w:rFonts w:ascii="Times New Roman" w:hAnsi="Times New Roman" w:cs="Times New Roman"/>
         </w:rPr>
-        <w:lastRenderedPageBreak/>
         <w:t>Hệ thống gồm hai nhánh kế thừa độc lập và một lớp điều phối trung tâm:</w:t>
       </w:r>
     </w:p>
@@ -8029,7 +8099,14 @@
               <w:rPr>
                 <w:rFonts w:ascii="Times New Roman" w:hAnsi="Times New Roman" w:cs="Times New Roman"/>
               </w:rPr>
-              <w:t>Thêm thuộc tính position; ghi đè get_score_multiplier()</w:t>
+              <w:t xml:space="preserve">Thêm thuộc tính position; ghi </w:t>
+            </w:r>
+            <w:r>
+              <w:rPr>
+                <w:rFonts w:ascii="Times New Roman" w:hAnsi="Times New Roman" w:cs="Times New Roman"/>
+              </w:rPr>
+              <w:lastRenderedPageBreak/>
+              <w:t>đè get_score_multiplier()</w:t>
             </w:r>
           </w:p>
         </w:tc>
@@ -8054,6 +8131,7 @@
               <w:rPr>
                 <w:rFonts w:ascii="Times New Roman" w:hAnsi="Times New Roman" w:cs="Times New Roman"/>
               </w:rPr>
+              <w:lastRenderedPageBreak/>
               <w:t>Event</w:t>
             </w:r>
           </w:p>
@@ -8337,7 +8415,7 @@
       </w:pPr>
       <w:bookmarkStart w:id="17" w:name="_Toc237780409"/>
       <w:r>
-        <w:t>2.2. Đóng gói và bảo vệ trạng thái nội bộ</w:t>
+        <w:t>2.2 Đóng gói và bảo vệ trạng thái nội bộ</w:t>
       </w:r>
       <w:bookmarkEnd w:id="17"/>
     </w:p>
@@ -8713,7 +8791,7 @@
       </w:pPr>
       <w:bookmarkStart w:id="18" w:name="_Toc237780410"/>
       <w:r>
-        <w:t>2.3. Quan hệ kế thừa</w:t>
+        <w:t>2.3 Quan hệ kế thừa</w:t>
       </w:r>
       <w:bookmarkEnd w:id="18"/>
     </w:p>
@@ -8793,7 +8871,7 @@
       </w:pPr>
       <w:bookmarkStart w:id="19" w:name="_Toc237780411"/>
       <w:r>
-        <w:t>2.4. Đa hình kép trong đánh giá gắn kết</w:t>
+        <w:t>2.4 Đa hình kép trong đánh giá gắn kết</w:t>
       </w:r>
       <w:bookmarkEnd w:id="19"/>
     </w:p>
@@ -8875,7 +8953,6 @@
               <w:rPr>
                 <w:rFonts w:ascii="Times New Roman" w:hAnsi="Times New Roman" w:cs="Times New Roman"/>
               </w:rPr>
-              <w:lastRenderedPageBreak/>
               <w:t>Lớp</w:t>
             </w:r>
           </w:p>
@@ -9071,7 +9148,14 @@
               <w:rPr>
                 <w:rFonts w:ascii="Times New Roman" w:hAnsi="Times New Roman" w:cs="Times New Roman"/>
               </w:rPr>
-              <w:t>Khuyến khích tham dự sự kiện trọng điểm</w:t>
+              <w:t xml:space="preserve">Khuyến khích tham dự sự kiện </w:t>
+            </w:r>
+            <w:r>
+              <w:rPr>
+                <w:rFonts w:ascii="Times New Roman" w:hAnsi="Times New Roman" w:cs="Times New Roman"/>
+              </w:rPr>
+              <w:lastRenderedPageBreak/>
+              <w:t>trọng điểm</w:t>
             </w:r>
           </w:p>
         </w:tc>
@@ -9096,6 +9180,7 @@
               <w:rPr>
                 <w:rFonts w:ascii="Times New Roman" w:hAnsi="Times New Roman" w:cs="Times New Roman"/>
               </w:rPr>
+              <w:lastRenderedPageBreak/>
               <w:t>OptionalEvent</w:t>
             </w:r>
           </w:p>
@@ -9498,7 +9583,7 @@
       </w:pPr>
       <w:bookmarkStart w:id="20" w:name="_Toc237780412"/>
       <w:r>
-        <w:t>2.5. Quan hệ tổng hợp và tối ưu hiệu năng tại lớp điều phối</w:t>
+        <w:t>2.5 Quan hệ tổng hợp và tối ưu hiệu năng tại lớp điều phối</w:t>
       </w:r>
       <w:bookmarkEnd w:id="20"/>
     </w:p>
@@ -9578,7 +9663,7 @@
       </w:pPr>
       <w:bookmarkStart w:id="21" w:name="_Toc237780413"/>
       <w:r>
-        <w:t>2.6. Cây phân cấp ngoại lệ nghiệp vụ</w:t>
+        <w:t>2.6 Cây phân cấp ngoại lệ nghiệp vụ</w:t>
       </w:r>
       <w:bookmarkEnd w:id="21"/>
     </w:p>
@@ -9613,7 +9698,6 @@
           <w:sz w:val="24"/>
           <w:szCs w:val="24"/>
         </w:rPr>
-        <w:lastRenderedPageBreak/>
         <w:t>Exception</w:t>
       </w:r>
       <w:r>
@@ -9650,6 +9734,14 @@
           <w:szCs w:val="24"/>
         </w:rPr>
         <w:br/>
+      </w:r>
+      <w:r>
+        <w:rPr>
+          <w:rFonts w:ascii="Times New Roman" w:hAnsi="Times New Roman" w:cs="Times New Roman"/>
+          <w:sz w:val="24"/>
+          <w:szCs w:val="24"/>
+        </w:rPr>
+        <w:lastRenderedPageBreak/>
         <w:t xml:space="preserve">    └── DuplicateAttendanceError(member_id, event_id)</w:t>
       </w:r>
     </w:p>
@@ -9669,7 +9761,7 @@
     </w:p>
     <w:p>
       <w:pPr>
-        <w:pStyle w:val="HorizontalLine"/>
+        <w:pStyle w:val="BodyText"/>
         <w:rPr>
           <w:rFonts w:ascii="Times New Roman" w:hAnsi="Times New Roman" w:cs="Times New Roman"/>
         </w:rPr>
@@ -9691,7 +9783,16 @@
       </w:pPr>
       <w:bookmarkStart w:id="23" w:name="_Toc237780415"/>
       <w:r>
-        <w:t>3.1. Quy trình ETL và khả năng chịu lỗi</w:t>
+        <w:t>3.1</w:t>
+      </w:r>
+      <w:r>
+        <w:rPr>
+          <w:lang w:val="en-US"/>
+        </w:rPr>
+        <w:t xml:space="preserve"> </w:t>
+      </w:r>
+      <w:r>
+        <w:t>Quy trình ETL và khả năng chịu lỗi</w:t>
       </w:r>
       <w:bookmarkEnd w:id="23"/>
     </w:p>
@@ -9825,7 +9926,7 @@
       </w:pPr>
       <w:bookmarkStart w:id="24" w:name="_Toc237780416"/>
       <w:r>
-        <w:t>3.2. Lược đồ cơ sở dữ liệu quan hệ</w:t>
+        <w:t>3.2 Lược đồ cơ sở dữ liệu quan hệ</w:t>
       </w:r>
       <w:bookmarkEnd w:id="24"/>
     </w:p>
@@ -9922,6 +10023,7 @@
           <w:szCs w:val="24"/>
         </w:rPr>
         <w:br/>
+        <w:t xml:space="preserve">    class_name NVARCHAR(50)  NULL,</w:t>
       </w:r>
       <w:r>
         <w:rPr>
@@ -9929,8 +10031,8 @@
           <w:sz w:val="24"/>
           <w:szCs w:val="24"/>
         </w:rPr>
-        <w:lastRenderedPageBreak/>
-        <w:t xml:space="preserve">    class_name NVARCHAR(50)  NULL,</w:t>
+        <w:br/>
+        <w:t xml:space="preserve">    join_date  DATE          NOT NULL,</w:t>
       </w:r>
       <w:r>
         <w:rPr>
@@ -9939,7 +10041,7 @@
           <w:szCs w:val="24"/>
         </w:rPr>
         <w:br/>
-        <w:t xml:space="preserve">    join_date  DATE          NOT NULL,</w:t>
+        <w:t xml:space="preserve">    role       VARCHAR(20)   NOT NULL,</w:t>
       </w:r>
       <w:r>
         <w:rPr>
@@ -9948,7 +10050,7 @@
           <w:szCs w:val="24"/>
         </w:rPr>
         <w:br/>
-        <w:t xml:space="preserve">    role       VARCHAR(20)   NOT NULL,</w:t>
+        <w:t xml:space="preserve">    position   NVARCHAR(50)  NULL</w:t>
       </w:r>
       <w:r>
         <w:rPr>
@@ -9957,7 +10059,6 @@
           <w:szCs w:val="24"/>
         </w:rPr>
         <w:br/>
-        <w:t xml:space="preserve">    position   NVARCHAR(50)  NULL</w:t>
       </w:r>
       <w:r>
         <w:rPr>
@@ -9965,6 +10066,77 @@
           <w:sz w:val="24"/>
           <w:szCs w:val="24"/>
         </w:rPr>
+        <w:lastRenderedPageBreak/>
+        <w:t>);</w:t>
+      </w:r>
+      <w:r>
+        <w:rPr>
+          <w:rFonts w:ascii="Times New Roman" w:hAnsi="Times New Roman" w:cs="Times New Roman"/>
+          <w:sz w:val="24"/>
+          <w:szCs w:val="24"/>
+        </w:rPr>
+        <w:br/>
+      </w:r>
+      <w:r>
+        <w:rPr>
+          <w:rFonts w:ascii="Times New Roman" w:hAnsi="Times New Roman" w:cs="Times New Roman"/>
+          <w:sz w:val="24"/>
+          <w:szCs w:val="24"/>
+        </w:rPr>
+        <w:br/>
+        <w:t>CREATE TABLE dbo.Events (</w:t>
+      </w:r>
+      <w:r>
+        <w:rPr>
+          <w:rFonts w:ascii="Times New Roman" w:hAnsi="Times New Roman" w:cs="Times New Roman"/>
+          <w:sz w:val="24"/>
+          <w:szCs w:val="24"/>
+        </w:rPr>
+        <w:br/>
+        <w:t xml:space="preserve">    event_id   VARCHAR(20)   NOT NULL PRIMARY KEY,</w:t>
+      </w:r>
+      <w:r>
+        <w:rPr>
+          <w:rFonts w:ascii="Times New Roman" w:hAnsi="Times New Roman" w:cs="Times New Roman"/>
+          <w:sz w:val="24"/>
+          <w:szCs w:val="24"/>
+        </w:rPr>
+        <w:br/>
+        <w:t xml:space="preserve">    name       NVARCHAR(200) NOT NULL,</w:t>
+      </w:r>
+      <w:r>
+        <w:rPr>
+          <w:rFonts w:ascii="Times New Roman" w:hAnsi="Times New Roman" w:cs="Times New Roman"/>
+          <w:sz w:val="24"/>
+          <w:szCs w:val="24"/>
+        </w:rPr>
+        <w:br/>
+        <w:t xml:space="preserve">    date       DATE          NOT NULL,</w:t>
+      </w:r>
+      <w:r>
+        <w:rPr>
+          <w:rFonts w:ascii="Times New Roman" w:hAnsi="Times New Roman" w:cs="Times New Roman"/>
+          <w:sz w:val="24"/>
+          <w:szCs w:val="24"/>
+        </w:rPr>
+        <w:br/>
+        <w:t xml:space="preserve">    category   NVARCHAR(50)  NULL,</w:t>
+      </w:r>
+      <w:r>
+        <w:rPr>
+          <w:rFonts w:ascii="Times New Roman" w:hAnsi="Times New Roman" w:cs="Times New Roman"/>
+          <w:sz w:val="24"/>
+          <w:szCs w:val="24"/>
+        </w:rPr>
+        <w:br/>
+        <w:t xml:space="preserve">    event_type VARCHAR(20)   NOT NULL</w:t>
+      </w:r>
+      <w:r>
+        <w:rPr>
+          <w:rFonts w:ascii="Times New Roman" w:hAnsi="Times New Roman" w:cs="Times New Roman"/>
+          <w:sz w:val="24"/>
+          <w:szCs w:val="24"/>
+        </w:rPr>
         <w:br/>
         <w:t>);</w:t>
       </w:r>
@@ -9983,7 +10155,7 @@
           <w:szCs w:val="24"/>
         </w:rPr>
         <w:br/>
-        <w:t>CREATE TABLE dbo.Events (</w:t>
+        <w:t>CREATE TABLE dbo.Attendance (</w:t>
       </w:r>
       <w:r>
         <w:rPr>
@@ -9992,7 +10164,7 @@
           <w:szCs w:val="24"/>
         </w:rPr>
         <w:br/>
-        <w:t xml:space="preserve">    event_id   VARCHAR(20)   NOT NULL PRIMARY KEY,</w:t>
+        <w:t xml:space="preserve">    id           INT IDENTITY(1,1) PRIMARY KEY,</w:t>
       </w:r>
       <w:r>
         <w:rPr>
@@ -10001,7 +10173,7 @@
           <w:szCs w:val="24"/>
         </w:rPr>
         <w:br/>
-        <w:t xml:space="preserve">    name       NVARCHAR(200) NOT NULL,</w:t>
+        <w:t xml:space="preserve">    member_id    VARCHAR(20) NOT NULL REFERENCES dbo.Members(member_id),</w:t>
       </w:r>
       <w:r>
         <w:rPr>
@@ -10010,7 +10182,7 @@
           <w:szCs w:val="24"/>
         </w:rPr>
         <w:br/>
-        <w:t xml:space="preserve">    date       DATE          NOT NULL,</w:t>
+        <w:t xml:space="preserve">    event_id     VARCHAR(20) NOT NULL REFERENCES dbo.Events(event_id),</w:t>
       </w:r>
       <w:r>
         <w:rPr>
@@ -10019,7 +10191,7 @@
           <w:szCs w:val="24"/>
         </w:rPr>
         <w:br/>
-        <w:t xml:space="preserve">    category   NVARCHAR(50)  NULL,</w:t>
+        <w:t xml:space="preserve">    checkin_time DATETIME2   NOT NULL,</w:t>
       </w:r>
       <w:r>
         <w:rPr>
@@ -10028,7 +10200,7 @@
           <w:szCs w:val="24"/>
         </w:rPr>
         <w:br/>
-        <w:t xml:space="preserve">    event_type VARCHAR(20)   NOT NULL</w:t>
+        <w:t xml:space="preserve">    CONSTRAINT UQ_member_event UNIQUE (member_id, event_id)</w:t>
       </w:r>
       <w:r>
         <w:rPr>
@@ -10039,77 +10211,6 @@
         <w:br/>
         <w:t>);</w:t>
       </w:r>
-      <w:r>
-        <w:rPr>
-          <w:rFonts w:ascii="Times New Roman" w:hAnsi="Times New Roman" w:cs="Times New Roman"/>
-          <w:sz w:val="24"/>
-          <w:szCs w:val="24"/>
-        </w:rPr>
-        <w:br/>
-      </w:r>
-      <w:r>
-        <w:rPr>
-          <w:rFonts w:ascii="Times New Roman" w:hAnsi="Times New Roman" w:cs="Times New Roman"/>
-          <w:sz w:val="24"/>
-          <w:szCs w:val="24"/>
-        </w:rPr>
-        <w:br/>
-        <w:t>CREATE TABLE dbo.Attendance (</w:t>
-      </w:r>
-      <w:r>
-        <w:rPr>
-          <w:rFonts w:ascii="Times New Roman" w:hAnsi="Times New Roman" w:cs="Times New Roman"/>
-          <w:sz w:val="24"/>
-          <w:szCs w:val="24"/>
-        </w:rPr>
-        <w:br/>
-        <w:t xml:space="preserve">    id           INT IDENTITY(1,1) PRIMARY KEY,</w:t>
-      </w:r>
-      <w:r>
-        <w:rPr>
-          <w:rFonts w:ascii="Times New Roman" w:hAnsi="Times New Roman" w:cs="Times New Roman"/>
-          <w:sz w:val="24"/>
-          <w:szCs w:val="24"/>
-        </w:rPr>
-        <w:br/>
-        <w:t xml:space="preserve">    member_id    VARCHAR(20) NOT NULL REFERENCES dbo.Members(member_id),</w:t>
-      </w:r>
-      <w:r>
-        <w:rPr>
-          <w:rFonts w:ascii="Times New Roman" w:hAnsi="Times New Roman" w:cs="Times New Roman"/>
-          <w:sz w:val="24"/>
-          <w:szCs w:val="24"/>
-        </w:rPr>
-        <w:br/>
-        <w:t xml:space="preserve">    event_id     VARCHAR(20) NOT NULL REFERENCES dbo.Events(event_id),</w:t>
-      </w:r>
-      <w:r>
-        <w:rPr>
-          <w:rFonts w:ascii="Times New Roman" w:hAnsi="Times New Roman" w:cs="Times New Roman"/>
-          <w:sz w:val="24"/>
-          <w:szCs w:val="24"/>
-        </w:rPr>
-        <w:br/>
-        <w:t xml:space="preserve">    checkin_time DATETIME2   NOT NULL,</w:t>
-      </w:r>
-      <w:r>
-        <w:rPr>
-          <w:rFonts w:ascii="Times New Roman" w:hAnsi="Times New Roman" w:cs="Times New Roman"/>
-          <w:sz w:val="24"/>
-          <w:szCs w:val="24"/>
-        </w:rPr>
-        <w:br/>
-        <w:t xml:space="preserve">    CONSTRAINT UQ_member_event UNIQUE (member_id, event_id)</w:t>
-      </w:r>
-      <w:r>
-        <w:rPr>
-          <w:rFonts w:ascii="Times New Roman" w:hAnsi="Times New Roman" w:cs="Times New Roman"/>
-          <w:sz w:val="24"/>
-          <w:szCs w:val="24"/>
-        </w:rPr>
-        <w:br/>
-        <w:t>);</w:t>
-      </w:r>
     </w:p>
     <w:p>
       <w:pPr>
@@ -10131,7 +10232,7 @@
       </w:pPr>
       <w:bookmarkStart w:id="25" w:name="_Toc237780417"/>
       <w:r>
-        <w:t>3.3. Nạp dữ liệu và truy vấn đối chiếu</w:t>
+        <w:t>3.3 Nạp dữ liệu và truy vấn đối chiếu</w:t>
       </w:r>
       <w:bookmarkEnd w:id="25"/>
     </w:p>
@@ -10296,6 +10397,7 @@
           <w:szCs w:val="24"/>
         </w:rPr>
         <w:br/>
+        <w:t xml:space="preserve">        ), 0)</w:t>
       </w:r>
       <w:r>
         <w:rPr>
@@ -10303,8 +10405,8 @@
           <w:sz w:val="24"/>
           <w:szCs w:val="24"/>
         </w:rPr>
-        <w:lastRenderedPageBreak/>
-        <w:t xml:space="preserve">        ), 0)</w:t>
+        <w:br/>
+        <w:t xml:space="preserve">        * CASE WHEN m.role = 'officer' THEN 1.2 ELSE 1.0 END</w:t>
       </w:r>
       <w:r>
         <w:rPr>
@@ -10313,7 +10415,7 @@
           <w:szCs w:val="24"/>
         </w:rPr>
         <w:br/>
-        <w:t xml:space="preserve">        * CASE WHEN m.role = 'officer' THEN 1.2 ELSE 1.0 END</w:t>
+        <w:t xml:space="preserve">            AS engagement_score</w:t>
       </w:r>
       <w:r>
         <w:rPr>
@@ -10322,7 +10424,7 @@
           <w:szCs w:val="24"/>
         </w:rPr>
         <w:br/>
-        <w:t xml:space="preserve">            AS engagement_score</w:t>
+        <w:t xml:space="preserve">    FROM dbo.Members m</w:t>
       </w:r>
       <w:r>
         <w:rPr>
@@ -10331,7 +10433,6 @@
           <w:szCs w:val="24"/>
         </w:rPr>
         <w:br/>
-        <w:t xml:space="preserve">    FROM dbo.Members m</w:t>
       </w:r>
       <w:r>
         <w:rPr>
@@ -10339,7 +10440,7 @@
           <w:sz w:val="24"/>
           <w:szCs w:val="24"/>
         </w:rPr>
-        <w:br/>
+        <w:lastRenderedPageBreak/>
         <w:t xml:space="preserve">    LEFT JOIN dbo.Attendance a ON a.member_id = m.member_id</w:t>
       </w:r>
       <w:r>
@@ -10483,7 +10584,7 @@
     </w:p>
     <w:p>
       <w:pPr>
-        <w:pStyle w:val="HorizontalLine"/>
+        <w:pStyle w:val="BodyText"/>
         <w:rPr>
           <w:rFonts w:ascii="Times New Roman" w:hAnsi="Times New Roman" w:cs="Times New Roman"/>
         </w:rPr>
@@ -10519,7 +10620,7 @@
       </w:pPr>
       <w:bookmarkStart w:id="27" w:name="_Toc237780419"/>
       <w:r>
-        <w:t>4.1. Hồi quy tuyến tính xu hướng tăng trưởng</w:t>
+        <w:t>4.1 Hồi quy tuyến tính xu hướng tăng trưởng</w:t>
       </w:r>
       <w:bookmarkEnd w:id="27"/>
     </w:p>
@@ -10642,7 +10743,6 @@
               <w:rPr>
                 <w:rFonts w:ascii="Times New Roman" w:hAnsi="Times New Roman" w:cs="Times New Roman"/>
               </w:rPr>
-              <w:lastRenderedPageBreak/>
               <w:t>Đại lượng</w:t>
             </w:r>
           </w:p>
@@ -10792,6 +10892,7 @@
               <w:rPr>
                 <w:rFonts w:ascii="Times New Roman" w:hAnsi="Times New Roman" w:cs="Times New Roman"/>
               </w:rPr>
+              <w:lastRenderedPageBreak/>
               <w:t>Hệ số xác định R²</w:t>
             </w:r>
           </w:p>
@@ -10915,23 +11016,20 @@
     </w:p>
     <w:p>
       <w:pPr>
-        <w:pStyle w:val="Heading2"/>
-      </w:pPr>
-      <w:bookmarkStart w:id="28" w:name="_Toc237780420"/>
-      <w:r>
-        <w:rPr>
-          <w:rFonts w:eastAsia="AR PL SungtiL GB"/>
-          <w:b w:val="0"/>
-          <w:bCs w:val="0"/>
+        <w:pStyle w:val="BodyText"/>
+        <w:rPr>
+          <w:rFonts w:ascii="Times New Roman" w:hAnsi="Times New Roman" w:cs="Times New Roman"/>
+        </w:rPr>
+      </w:pPr>
+      <w:r>
+        <w:rPr>
+          <w:b/>
+          <w:bCs/>
           <w:i/>
           <w:noProof/>
-          <w:color w:val="auto"/>
-          <w:sz w:val="24"/>
-          <w:szCs w:val="24"/>
-          <w:lang w:val="en-US" w:eastAsia="zh-CN" w:bidi="hi-IN"/>
         </w:rPr>
         <w:drawing>
-          <wp:inline distT="0" distB="0" distL="0" distR="0" wp14:anchorId="070B752C" wp14:editId="3A864BE1">
+          <wp:inline distT="0" distB="0" distL="0" distR="0" wp14:anchorId="2FB54AE6" wp14:editId="3EE93C76">
             <wp:extent cx="6120130" cy="3825240"/>
             <wp:effectExtent l="0" t="0" r="0" b="3810"/>
             <wp:docPr id="1" name="Picture 1"/>
@@ -10966,8 +11064,14 @@
           </wp:inline>
         </w:drawing>
       </w:r>
-      <w:r>
-        <w:t>4.2. Chuẩn hóa z-score và phân loại bách phân vị</w:t>
+    </w:p>
+    <w:p>
+      <w:pPr>
+        <w:pStyle w:val="Heading2"/>
+      </w:pPr>
+      <w:bookmarkStart w:id="28" w:name="_Toc237780420"/>
+      <w:r>
+        <w:t>4.2 Chuẩn hóa z-score và phân loại bách phân vị</w:t>
       </w:r>
       <w:bookmarkEnd w:id="28"/>
     </w:p>
@@ -11354,7 +11458,14 @@
         <w:rPr>
           <w:rFonts w:ascii="Times New Roman" w:hAnsi="Times New Roman" w:cs="Times New Roman"/>
         </w:rPr>
-        <w:t>Thành viên dẫn đầu là M002 Hoang Cong Bao (Ban chủ nhiệm) với điểm 14.52 và z = 1.864. Đáng chú ý, hai thành viên thường M006 và M020 đạt 14.40 điểm dù không có hệ số nhân vai trò — họ tham gia 11/12 sự kiện, nhiều hơn Ban chủ nhiệm.</w:t>
+        <w:t xml:space="preserve">Thành viên dẫn đầu là M002 Hoang Cong Bao (Ban chủ nhiệm) với điểm 14.52 và z = 1.864. Đáng </w:t>
+      </w:r>
+      <w:r>
+        <w:rPr>
+          <w:rFonts w:ascii="Times New Roman" w:hAnsi="Times New Roman" w:cs="Times New Roman"/>
+        </w:rPr>
+        <w:lastRenderedPageBreak/>
+        <w:t>chú ý, hai thành viên thường M006 và M020 đạt 14.40 điểm dù không có hệ số nhân vai trò — họ tham gia 11/12 sự kiện, nhiều hơn Ban chủ nhiệm.</w:t>
       </w:r>
     </w:p>
     <w:p>
@@ -11363,7 +11474,7 @@
       </w:pPr>
       <w:bookmarkStart w:id="29" w:name="_Toc237780421"/>
       <w:r>
-        <w:t>4.3. Thuật toán ước lượng nguy cơ ngừng tham gia</w:t>
+        <w:t>4.3 Thuật toán ước lượng nguy cơ ngừng tham gia</w:t>
       </w:r>
       <w:bookmarkEnd w:id="29"/>
     </w:p>
@@ -12314,24 +12425,21 @@
     </w:p>
     <w:p>
       <w:pPr>
-        <w:pStyle w:val="Heading2"/>
-      </w:pPr>
-      <w:bookmarkStart w:id="30" w:name="_Toc237780422"/>
-      <w:r>
-        <w:rPr>
-          <w:rFonts w:eastAsia="AR PL SungtiL GB"/>
-          <w:b w:val="0"/>
-          <w:bCs w:val="0"/>
+        <w:pStyle w:val="BodyText"/>
+        <w:rPr>
+          <w:rFonts w:ascii="Times New Roman" w:hAnsi="Times New Roman" w:cs="Times New Roman"/>
+        </w:rPr>
+      </w:pPr>
+      <w:r>
+        <w:rPr>
+          <w:b/>
+          <w:bCs/>
           <w:i/>
           <w:noProof/>
-          <w:color w:val="auto"/>
-          <w:sz w:val="24"/>
-          <w:szCs w:val="24"/>
-          <w:lang w:val="en-US" w:eastAsia="zh-CN" w:bidi="hi-IN"/>
         </w:rPr>
         <w:lastRenderedPageBreak/>
         <w:drawing>
-          <wp:inline distT="0" distB="0" distL="0" distR="0" wp14:anchorId="4F90A7C9" wp14:editId="269DAA37">
+          <wp:inline distT="0" distB="0" distL="0" distR="0" wp14:anchorId="79A394F6" wp14:editId="118DD8B8">
             <wp:extent cx="6120130" cy="3825240"/>
             <wp:effectExtent l="0" t="0" r="0" b="3810"/>
             <wp:docPr id="5" name="Picture 5"/>
@@ -12366,8 +12474,14 @@
           </wp:inline>
         </w:drawing>
       </w:r>
-      <w:r>
-        <w:t>4.4. Kiểm định giả thuyết thống kê</w:t>
+    </w:p>
+    <w:p>
+      <w:pPr>
+        <w:pStyle w:val="Heading2"/>
+      </w:pPr>
+      <w:bookmarkStart w:id="30" w:name="_Toc237780422"/>
+      <w:r>
+        <w:t>4.4 Kiểm định giả thuyết thống kê</w:t>
       </w:r>
       <w:bookmarkEnd w:id="30"/>
     </w:p>
@@ -13545,7 +13659,7 @@
       </w:pPr>
       <w:bookmarkStart w:id="34" w:name="_Toc237780426"/>
       <w:r>
-        <w:t>4.5. Thuật toán đánh giá sức giữ chân của sự kiện</w:t>
+        <w:t>4.5 Thuật toán đánh giá sức giữ chân của sự kiện</w:t>
       </w:r>
       <w:bookmarkEnd w:id="34"/>
     </w:p>
@@ -15929,23 +16043,20 @@
     </w:p>
     <w:p>
       <w:pPr>
-        <w:pStyle w:val="Heading2"/>
-      </w:pPr>
-      <w:bookmarkStart w:id="35" w:name="_Toc237780427"/>
-      <w:r>
-        <w:rPr>
-          <w:rFonts w:eastAsia="AR PL SungtiL GB"/>
-          <w:b w:val="0"/>
-          <w:bCs w:val="0"/>
+        <w:pStyle w:val="BodyText"/>
+        <w:rPr>
+          <w:rFonts w:ascii="Times New Roman" w:hAnsi="Times New Roman" w:cs="Times New Roman"/>
+        </w:rPr>
+      </w:pPr>
+      <w:r>
+        <w:rPr>
+          <w:b/>
+          <w:bCs/>
           <w:i/>
           <w:noProof/>
-          <w:color w:val="auto"/>
-          <w:sz w:val="24"/>
-          <w:szCs w:val="24"/>
-          <w:lang w:val="en-US" w:eastAsia="zh-CN" w:bidi="hi-IN"/>
         </w:rPr>
         <w:drawing>
-          <wp:inline distT="0" distB="0" distL="0" distR="0" wp14:anchorId="342E6CE6" wp14:editId="2BA11354">
+          <wp:inline distT="0" distB="0" distL="0" distR="0" wp14:anchorId="4BAFECC9" wp14:editId="1B98137C">
             <wp:extent cx="6120130" cy="4079875"/>
             <wp:effectExtent l="0" t="0" r="0" b="0"/>
             <wp:docPr id="7" name="Picture 7"/>
@@ -15980,8 +16091,14 @@
           </wp:inline>
         </w:drawing>
       </w:r>
-      <w:r>
-        <w:t>4.6. Tổng hợp phát hiện</w:t>
+    </w:p>
+    <w:p>
+      <w:pPr>
+        <w:pStyle w:val="Heading2"/>
+      </w:pPr>
+      <w:bookmarkStart w:id="35" w:name="_Toc237780427"/>
+      <w:r>
+        <w:t>4.6 Tổng hợp phát hiện</w:t>
       </w:r>
       <w:bookmarkEnd w:id="35"/>
     </w:p>
@@ -16525,7 +16642,7 @@
     </w:p>
     <w:p>
       <w:pPr>
-        <w:pStyle w:val="HorizontalLine"/>
+        <w:pStyle w:val="BodyText"/>
         <w:rPr>
           <w:rFonts w:ascii="Times New Roman" w:hAnsi="Times New Roman" w:cs="Times New Roman"/>
         </w:rPr>
@@ -16547,7 +16664,7 @@
       </w:pPr>
       <w:bookmarkStart w:id="37" w:name="_Toc237780429"/>
       <w:r>
-        <w:t>5.1. Hệ thống sáu biểu đồ Matplotlib</w:t>
+        <w:t>5.1 Hệ thống sáu biểu đồ Matplotlib</w:t>
       </w:r>
       <w:bookmarkEnd w:id="37"/>
     </w:p>
@@ -16562,7 +16679,14 @@
         <w:rPr>
           <w:rFonts w:ascii="Times New Roman" w:hAnsi="Times New Roman" w:cs="Times New Roman"/>
         </w:rPr>
-        <w:t>Toàn bộ biểu đồ được kết xuất tại src/visualization/charts.py với độ phân giải 150 dpi, lưu vào report/figures/.</w:t>
+        <w:t xml:space="preserve">Toàn bộ biểu đồ được kết xuất tại src/visualization/charts.py với độ phân giải 150 dpi, lưu vào </w:t>
+      </w:r>
+      <w:r>
+        <w:rPr>
+          <w:rFonts w:ascii="Times New Roman" w:hAnsi="Times New Roman" w:cs="Times New Roman"/>
+        </w:rPr>
+        <w:lastRenderedPageBreak/>
+        <w:t>report/figures/.</w:t>
       </w:r>
     </w:p>
     <w:p>
@@ -16571,8 +16695,7 @@
       </w:pPr>
       <w:bookmarkStart w:id="38" w:name="_Toc237780430"/>
       <w:r>
-        <w:lastRenderedPageBreak/>
-        <w:t>5.1.1. Tỉ lệ tham gia theo sự kiện</w:t>
+        <w:t>5.1.1 Tỉ lệ tham gia theo sự kiện</w:t>
       </w:r>
       <w:bookmarkEnd w:id="38"/>
     </w:p>
@@ -16620,23 +16743,20 @@
     </w:p>
     <w:p>
       <w:pPr>
-        <w:pStyle w:val="Heading3"/>
-      </w:pPr>
-      <w:bookmarkStart w:id="39" w:name="_Toc237780431"/>
-      <w:r>
-        <w:rPr>
-          <w:rFonts w:eastAsia="AR PL SungtiL GB"/>
-          <w:b w:val="0"/>
-          <w:bCs w:val="0"/>
+        <w:pStyle w:val="BodyText"/>
+        <w:rPr>
+          <w:rFonts w:ascii="Times New Roman" w:hAnsi="Times New Roman" w:cs="Times New Roman"/>
+        </w:rPr>
+      </w:pPr>
+      <w:r>
+        <w:rPr>
+          <w:b/>
+          <w:bCs/>
           <w:i/>
           <w:noProof/>
-          <w:color w:val="auto"/>
-          <w:sz w:val="24"/>
-          <w:szCs w:val="24"/>
-          <w:lang w:val="en-US" w:eastAsia="zh-CN" w:bidi="hi-IN"/>
         </w:rPr>
         <w:drawing>
-          <wp:inline distT="0" distB="0" distL="0" distR="0" wp14:anchorId="37DD1AE6" wp14:editId="73BAFCB8">
+          <wp:inline distT="0" distB="0" distL="0" distR="0" wp14:anchorId="3692C89B" wp14:editId="49674EC6">
             <wp:extent cx="6120130" cy="3825240"/>
             <wp:effectExtent l="0" t="0" r="0" b="3810"/>
             <wp:docPr id="9" name="Picture 9"/>
@@ -16671,8 +16791,14 @@
           </wp:inline>
         </w:drawing>
       </w:r>
-      <w:r>
-        <w:t>5.1.2. Tăng trưởng thành viên và đường xu hướng</w:t>
+    </w:p>
+    <w:p>
+      <w:pPr>
+        <w:pStyle w:val="Heading3"/>
+      </w:pPr>
+      <w:bookmarkStart w:id="39" w:name="_Toc237780431"/>
+      <w:r>
+        <w:t>5.1.2 Tăng trưởng thành viên và đường xu hướng</w:t>
       </w:r>
       <w:bookmarkEnd w:id="39"/>
     </w:p>
@@ -16720,6 +16846,16 @@
     </w:p>
     <w:p>
       <w:pPr>
+        <w:pStyle w:val="Heading3"/>
+      </w:pPr>
+      <w:bookmarkStart w:id="40" w:name="_Toc237780432"/>
+      <w:r>
+        <w:t>5.1.3 Xếp hạng thành viên tích cực</w:t>
+      </w:r>
+      <w:bookmarkEnd w:id="40"/>
+    </w:p>
+    <w:p>
+      <w:pPr>
         <w:pStyle w:val="BodyText"/>
         <w:rPr>
           <w:rFonts w:ascii="Times New Roman" w:hAnsi="Times New Roman" w:cs="Times New Roman"/>
@@ -16728,48 +16864,16 @@
       <w:r>
         <w:rPr>
           <w:rFonts w:ascii="Times New Roman" w:hAnsi="Times New Roman" w:cs="Times New Roman"/>
-          <w:i/>
-        </w:rPr>
-        <w:t xml:space="preserve">[HÌNH </w:t>
-      </w:r>
-      <w:r>
-        <w:rPr>
-          <w:rFonts w:ascii="Times New Roman" w:hAnsi="Times New Roman" w:cs="Times New Roman"/>
-          <w:i/>
-        </w:rPr>
-        <w:t>2</w:t>
-      </w:r>
-      <w:r>
-        <w:rPr>
-          <w:rFonts w:ascii="Times New Roman" w:hAnsi="Times New Roman" w:cs="Times New Roman"/>
-          <w:i/>
-        </w:rPr>
-        <w:t xml:space="preserve"> đã dẫn ở mục 4.</w:t>
-      </w:r>
-      <w:r>
-        <w:rPr>
-          <w:rFonts w:ascii="Times New Roman" w:hAnsi="Times New Roman" w:cs="Times New Roman"/>
-          <w:i/>
-        </w:rPr>
-        <w:t>1</w:t>
-      </w:r>
-      <w:r>
-        <w:rPr>
-          <w:rFonts w:ascii="Times New Roman" w:hAnsi="Times New Roman" w:cs="Times New Roman"/>
-          <w:i/>
-        </w:rPr>
-        <w:t>]</w:t>
-      </w:r>
-    </w:p>
-    <w:p>
-      <w:pPr>
-        <w:pStyle w:val="Heading3"/>
-      </w:pPr>
-      <w:bookmarkStart w:id="40" w:name="_Toc237780432"/>
-      <w:r>
-        <w:t>5.1.3. Xếp hạng thành viên tích cực</w:t>
-      </w:r>
-      <w:bookmarkEnd w:id="40"/>
+          <w:b/>
+        </w:rPr>
+        <w:t>Kỹ thuật:</w:t>
+      </w:r>
+      <w:r>
+        <w:rPr>
+          <w:rFonts w:ascii="Times New Roman" w:hAnsi="Times New Roman" w:cs="Times New Roman"/>
+        </w:rPr>
+        <w:t xml:space="preserve"> biểu đồ thanh ngang (ax.barh), mã màu phân biệt Ban chủ nhiệm và thành viên thường.</w:t>
+      </w:r>
     </w:p>
     <w:p>
       <w:pPr>
@@ -16783,13 +16887,20 @@
           <w:rFonts w:ascii="Times New Roman" w:hAnsi="Times New Roman" w:cs="Times New Roman"/>
           <w:b/>
         </w:rPr>
-        <w:t>Kỹ thuật:</w:t>
-      </w:r>
-      <w:r>
-        <w:rPr>
-          <w:rFonts w:ascii="Times New Roman" w:hAnsi="Times New Roman" w:cs="Times New Roman"/>
-        </w:rPr>
-        <w:t xml:space="preserve"> biểu đồ thanh ngang (ax.barh), mã màu phân biệt Ban chủ nhiệm và thành viên thường.</w:t>
+        <w:t>Nhận xét:</w:t>
+      </w:r>
+      <w:r>
+        <w:rPr>
+          <w:rFonts w:ascii="Times New Roman" w:hAnsi="Times New Roman" w:cs="Times New Roman"/>
+        </w:rPr>
+        <w:t xml:space="preserve"> M002 Hoang Cong Bao dẫn đầu với 14.52 điểm, đạt được nhờ tham gia 9/12 sự kiện kết hợp hệ số vai trò 1.2. Tuy nhiên hai vị trí kế tiếp thuộc về M006 Le Kim Kien và M020 Pham Huu Trang — cả hai là thành viên thường, đạt 14.40 điểm nhờ tham gia 11/12 sự kiện. Khoảng cách chỉ </w:t>
+      </w:r>
+      <w:r>
+        <w:rPr>
+          <w:rFonts w:ascii="Times New Roman" w:hAnsi="Times New Roman" w:cs="Times New Roman"/>
+        </w:rPr>
+        <w:lastRenderedPageBreak/>
+        <w:t>0.12 điểm cho thấy hệ số vai trò không tạo lợi thế áp đảo, và thành viên thường hoàn toàn có thể vượt lên bằng mức độ chuyên cần.</w:t>
       </w:r>
     </w:p>
     <w:p>
@@ -16801,44 +16912,13 @@
       </w:pPr>
       <w:r>
         <w:rPr>
-          <w:rFonts w:ascii="Times New Roman" w:hAnsi="Times New Roman" w:cs="Times New Roman"/>
           <w:b/>
-        </w:rPr>
-        <w:t>Nhận xét:</w:t>
-      </w:r>
-      <w:r>
-        <w:rPr>
-          <w:rFonts w:ascii="Times New Roman" w:hAnsi="Times New Roman" w:cs="Times New Roman"/>
-        </w:rPr>
-        <w:t xml:space="preserve"> M002 Hoang Cong Bao dẫn đầu với 14.52 điểm, đạt được nhờ tham gia 9/12 sự kiện kết hợp hệ số vai trò 1.2. Tuy nhiên hai vị trí kế tiếp thuộc về M006 Le Kim Kien và M020 Pham Huu Trang — cả hai là thành viên thường, đạt 14.40 điểm nhờ tham gia 11/12 sự kiện. Khoảng cách chỉ 0.12 điểm cho thấy hệ số vai trò không tạo lợi thế áp đảo, và thành viên thường hoàn toàn có thể </w:t>
-      </w:r>
-      <w:r>
-        <w:rPr>
-          <w:rFonts w:ascii="Times New Roman" w:hAnsi="Times New Roman" w:cs="Times New Roman"/>
-        </w:rPr>
-        <w:lastRenderedPageBreak/>
-        <w:t>vượt lên bằng mức độ chuyên cần.</w:t>
-      </w:r>
-    </w:p>
-    <w:p>
-      <w:pPr>
-        <w:pStyle w:val="Heading3"/>
-      </w:pPr>
-      <w:bookmarkStart w:id="41" w:name="_Toc237780433"/>
-      <w:r>
-        <w:rPr>
-          <w:rFonts w:eastAsia="AR PL SungtiL GB"/>
-          <w:b w:val="0"/>
-          <w:bCs w:val="0"/>
+          <w:bCs/>
           <w:i/>
           <w:noProof/>
-          <w:color w:val="auto"/>
-          <w:sz w:val="24"/>
-          <w:szCs w:val="24"/>
-          <w:lang w:val="en-US" w:eastAsia="zh-CN" w:bidi="hi-IN"/>
         </w:rPr>
         <w:drawing>
-          <wp:inline distT="0" distB="0" distL="0" distR="0" wp14:anchorId="403770C3" wp14:editId="344BCC69">
+          <wp:inline distT="0" distB="0" distL="0" distR="0" wp14:anchorId="02E21949" wp14:editId="090F3C82">
             <wp:extent cx="6120130" cy="3825240"/>
             <wp:effectExtent l="0" t="0" r="0" b="3810"/>
             <wp:docPr id="11" name="Picture 11"/>
@@ -16873,8 +16953,14 @@
           </wp:inline>
         </w:drawing>
       </w:r>
-      <w:r>
-        <w:t>5.1.4. Cảnh báo nguy cơ ngừng tham gia</w:t>
+    </w:p>
+    <w:p>
+      <w:pPr>
+        <w:pStyle w:val="Heading3"/>
+      </w:pPr>
+      <w:bookmarkStart w:id="41" w:name="_Toc237780433"/>
+      <w:r>
+        <w:t>5.1.4 Cảnh báo nguy cơ ngừng tham gia</w:t>
       </w:r>
       <w:bookmarkEnd w:id="41"/>
     </w:p>
@@ -16917,22 +17003,37 @@
         <w:rPr>
           <w:rFonts w:ascii="Times New Roman" w:hAnsi="Times New Roman" w:cs="Times New Roman"/>
         </w:rPr>
-        <w:t xml:space="preserve"> 5 cá nhân vượt ngưỡng cảnh báo. Biểu đồ cho thấy phân bố churn_score khá liên tục, không có khoảng trống rõ rệt giữa nhóm nguy cơ cao và nhóm bình thường — nghĩa là ngưỡng z = 1.0 là một lựa chọn quy ước, và các thành viên ngay dưới ngưỡng (như M022 với score 0.770) cũng đáng được theo dõi.</w:t>
-      </w:r>
-    </w:p>
-    <w:p>
-      <w:pPr>
-        <w:pStyle w:val="BodyText"/>
-        <w:rPr>
-          <w:rFonts w:ascii="Times New Roman" w:hAnsi="Times New Roman" w:cs="Times New Roman"/>
-        </w:rPr>
-      </w:pPr>
-      <w:r>
-        <w:rPr>
-          <w:rFonts w:ascii="Times New Roman" w:hAnsi="Times New Roman" w:cs="Times New Roman"/>
-          <w:i/>
-        </w:rPr>
-        <w:t>[HÌNH 3 đã dẫn ở mục 4.3]</w:t>
+        <w:t xml:space="preserve"> 5 cá nhân vượt ngưỡng cảnh báo. Biểu đồ cho thấy phân bố churn_score khá liên tục, không có khoảng trống rõ rệt giữa nhóm nguy cơ cao và nhóm bình thường — nghĩa là ngưỡng z = 1.0 là một lựa chọn quy ước, và các thành viên ngay dưới ngưỡng (như M022 với score 0.770) cũng đáng được theo dõi</w:t>
+      </w:r>
+      <w:r>
+        <w:rPr>
+          <w:rFonts w:ascii="Times New Roman" w:hAnsi="Times New Roman" w:cs="Times New Roman"/>
+        </w:rPr>
+        <w:t xml:space="preserve"> </w:t>
+      </w:r>
+      <w:r>
+        <w:rPr>
+          <w:rFonts w:ascii="Times New Roman" w:hAnsi="Times New Roman" w:cs="Times New Roman"/>
+        </w:rPr>
+        <w:t xml:space="preserve">(xem </w:t>
+      </w:r>
+      <w:r>
+        <w:rPr>
+          <w:rFonts w:ascii="Times New Roman" w:hAnsi="Times New Roman" w:cs="Times New Roman"/>
+        </w:rPr>
+        <w:t>mục 4.3</w:t>
+      </w:r>
+      <w:r>
+        <w:rPr>
+          <w:rFonts w:ascii="Times New Roman" w:hAnsi="Times New Roman" w:cs="Times New Roman"/>
+        </w:rPr>
+        <w:t>)</w:t>
+      </w:r>
+      <w:r>
+        <w:rPr>
+          <w:rFonts w:ascii="Times New Roman" w:hAnsi="Times New Roman" w:cs="Times New Roman"/>
+        </w:rPr>
+        <w:t>.</w:t>
       </w:r>
     </w:p>
     <w:p>
@@ -16941,7 +17042,7 @@
       </w:pPr>
       <w:bookmarkStart w:id="42" w:name="_Toc237780434"/>
       <w:r>
-        <w:t>5.1.5. Bản đồ nhiệt điểm danh hai chiều</w:t>
+        <w:t>5.1.5 Bản đồ nhiệt điểm danh hai chiều</w:t>
       </w:r>
       <w:bookmarkEnd w:id="42"/>
     </w:p>
@@ -17094,24 +17195,20 @@
     </w:p>
     <w:p>
       <w:pPr>
-        <w:pStyle w:val="Heading3"/>
-        <w:ind w:left="720"/>
-      </w:pPr>
-      <w:bookmarkStart w:id="43" w:name="_Toc237780435"/>
-      <w:r>
-        <w:rPr>
-          <w:rFonts w:eastAsia="AR PL SungtiL GB"/>
-          <w:b w:val="0"/>
-          <w:bCs w:val="0"/>
+        <w:pStyle w:val="BodyText"/>
+        <w:rPr>
+          <w:rFonts w:ascii="Times New Roman" w:hAnsi="Times New Roman" w:cs="Times New Roman"/>
+        </w:rPr>
+      </w:pPr>
+      <w:r>
+        <w:rPr>
+          <w:b/>
+          <w:bCs/>
           <w:i/>
           <w:noProof/>
-          <w:color w:val="auto"/>
-          <w:sz w:val="24"/>
-          <w:szCs w:val="24"/>
-          <w:lang w:val="en-US" w:eastAsia="zh-CN" w:bidi="hi-IN"/>
         </w:rPr>
         <w:drawing>
-          <wp:inline distT="0" distB="0" distL="0" distR="0" wp14:anchorId="273D777E" wp14:editId="5B805E37">
+          <wp:inline distT="0" distB="0" distL="0" distR="0" wp14:anchorId="26D3A15A" wp14:editId="463F7236">
             <wp:extent cx="6120130" cy="4895850"/>
             <wp:effectExtent l="0" t="0" r="0" b="0"/>
             <wp:docPr id="12" name="Picture 12"/>
@@ -17146,6 +17243,12 @@
           </wp:inline>
         </w:drawing>
       </w:r>
+    </w:p>
+    <w:p>
+      <w:pPr>
+        <w:pStyle w:val="Heading3"/>
+      </w:pPr>
+      <w:bookmarkStart w:id="43" w:name="_Toc237780435"/>
       <w:r>
         <w:t>5.1.6. Sức giữ chân của sự kiện</w:t>
       </w:r>
@@ -17195,26 +17298,11 @@
     </w:p>
     <w:p>
       <w:pPr>
-        <w:pStyle w:val="BodyText"/>
-        <w:rPr>
-          <w:rFonts w:ascii="Times New Roman" w:hAnsi="Times New Roman" w:cs="Times New Roman"/>
-        </w:rPr>
-      </w:pPr>
-      <w:r>
-        <w:rPr>
-          <w:rFonts w:ascii="Times New Roman" w:hAnsi="Times New Roman" w:cs="Times New Roman"/>
-          <w:i/>
-        </w:rPr>
-        <w:t>[HÌNH 4 đã dẫn ở mục 4.5]</w:t>
-      </w:r>
-    </w:p>
-    <w:p>
-      <w:pPr>
         <w:pStyle w:val="Heading2"/>
       </w:pPr>
       <w:bookmarkStart w:id="44" w:name="_Toc237780436"/>
       <w:r>
-        <w:t>5.2. Dashboard web tương tác</w:t>
+        <w:t>5.2 Dashboard web tương tác</w:t>
       </w:r>
       <w:bookmarkEnd w:id="44"/>
     </w:p>
@@ -17665,7 +17753,7 @@
           <w:noProof/>
         </w:rPr>
         <w:drawing>
-          <wp:inline distT="0" distB="0" distL="0" distR="0" wp14:anchorId="6E868959" wp14:editId="362F94D6">
+          <wp:inline distT="0" distB="0" distL="0" distR="0" wp14:anchorId="73C050CA" wp14:editId="5C32BAC4">
             <wp:extent cx="6120130" cy="4371340"/>
             <wp:effectExtent l="0" t="0" r="0" b="0"/>
             <wp:docPr id="15" name="Picture 15"/>
@@ -17703,7 +17791,10 @@
     </w:p>
     <w:p>
       <w:pPr>
-        <w:pStyle w:val="Heading2"/>
+        <w:pStyle w:val="BodyText"/>
+        <w:rPr>
+          <w:rFonts w:ascii="Times New Roman" w:hAnsi="Times New Roman" w:cs="Times New Roman"/>
+        </w:rPr>
       </w:pPr>
       <w:r>
         <w:rPr>
@@ -17711,7 +17802,7 @@
         </w:rPr>
         <w:lastRenderedPageBreak/>
         <w:drawing>
-          <wp:inline distT="0" distB="0" distL="0" distR="0" wp14:anchorId="632FF842" wp14:editId="75AF5467">
+          <wp:inline distT="0" distB="0" distL="0" distR="0" wp14:anchorId="705D025D" wp14:editId="2B65A961">
             <wp:extent cx="6120130" cy="3112770"/>
             <wp:effectExtent l="0" t="0" r="0" b="0"/>
             <wp:docPr id="14" name="Picture 14"/>
@@ -17746,8 +17837,21 @@
           </wp:inline>
         </w:drawing>
       </w:r>
-      <w:r>
-        <w:t>5.3. Pipeline điều phối và cấu hình hệ thống</w:t>
+    </w:p>
+    <w:p>
+      <w:pPr>
+        <w:pStyle w:val="BodyText"/>
+        <w:rPr>
+          <w:rFonts w:ascii="Times New Roman" w:hAnsi="Times New Roman" w:cs="Times New Roman"/>
+        </w:rPr>
+      </w:pPr>
+    </w:p>
+    <w:p>
+      <w:pPr>
+        <w:pStyle w:val="Heading2"/>
+      </w:pPr>
+      <w:r>
+        <w:t>5.3 Pipeline điều phối và cấu hình hệ thống</w:t>
       </w:r>
       <w:bookmarkEnd w:id="45"/>
     </w:p>
@@ -17795,7 +17899,7 @@
     </w:p>
     <w:p>
       <w:pPr>
-        <w:pStyle w:val="HorizontalLine"/>
+        <w:pStyle w:val="BodyText"/>
         <w:rPr>
           <w:rFonts w:ascii="Times New Roman" w:hAnsi="Times New Roman" w:cs="Times New Roman"/>
         </w:rPr>
@@ -17817,7 +17921,7 @@
       </w:pPr>
       <w:bookmarkStart w:id="47" w:name="_Toc237780439"/>
       <w:r>
-        <w:t>6.1. Thiết kế bộ kiểm thử</w:t>
+        <w:t>6.1 Thiết kế bộ kiểm thử</w:t>
       </w:r>
       <w:bookmarkEnd w:id="47"/>
     </w:p>
@@ -17855,7 +17959,8 @@
       </w:pPr>
       <w:bookmarkStart w:id="48" w:name="_Toc237780440"/>
       <w:r>
-        <w:t>6.2. Đặc tả các ca kiểm thử</w:t>
+        <w:lastRenderedPageBreak/>
+        <w:t>6.2 Đặc tả các ca kiểm thử</w:t>
       </w:r>
       <w:bookmarkEnd w:id="48"/>
     </w:p>
@@ -18053,14 +18158,7 @@
               <w:rPr>
                 <w:rFonts w:ascii="Times New Roman" w:hAnsi="Times New Roman" w:cs="Times New Roman"/>
               </w:rPr>
-              <w:t xml:space="preserve">Đa hình cấp sự </w:t>
-            </w:r>
-            <w:r>
-              <w:rPr>
-                <w:rFonts w:ascii="Times New Roman" w:hAnsi="Times New Roman" w:cs="Times New Roman"/>
-              </w:rPr>
-              <w:lastRenderedPageBreak/>
-              <w:t>kiện (bắt buộc)</w:t>
+              <w:t>Đa hình cấp sự kiện (bắt buộc)</w:t>
             </w:r>
           </w:p>
         </w:tc>
@@ -18083,15 +18181,7 @@
               <w:rPr>
                 <w:rFonts w:ascii="Times New Roman" w:hAnsi="Times New Roman" w:cs="Times New Roman"/>
               </w:rPr>
-              <w:lastRenderedPageBreak/>
-              <w:t>club.events["E1"].</w:t>
-            </w:r>
-            <w:r>
-              <w:rPr>
-                <w:rFonts w:ascii="Times New Roman" w:hAnsi="Times New Roman" w:cs="Times New Roman"/>
-              </w:rPr>
-              <w:lastRenderedPageBreak/>
-              <w:t>get_attendance_weight()</w:t>
+              <w:t>club.events["E1"].get_attendance_weight()</w:t>
             </w:r>
           </w:p>
         </w:tc>
@@ -18114,7 +18204,6 @@
               <w:rPr>
                 <w:rFonts w:ascii="Times New Roman" w:hAnsi="Times New Roman" w:cs="Times New Roman"/>
               </w:rPr>
-              <w:lastRenderedPageBreak/>
               <w:t>1.5</w:t>
             </w:r>
           </w:p>
@@ -18999,7 +19088,7 @@
       </w:pPr>
       <w:bookmarkStart w:id="49" w:name="_Toc237780441"/>
       <w:r>
-        <w:t>6.3. Tích hợp liên tục với GitHub Actions</w:t>
+        <w:t>6.3 Tích hợp liên tục với GitHub Actions</w:t>
       </w:r>
       <w:bookmarkEnd w:id="49"/>
     </w:p>
@@ -19089,14 +19178,6 @@
     </w:p>
     <w:p>
       <w:pPr>
-        <w:pStyle w:val="HorizontalLine"/>
-        <w:rPr>
-          <w:rFonts w:ascii="Times New Roman" w:hAnsi="Times New Roman" w:cs="Times New Roman"/>
-        </w:rPr>
-      </w:pPr>
-    </w:p>
-    <w:p>
-      <w:pPr>
         <w:pStyle w:val="Heading1"/>
       </w:pPr>
       <w:bookmarkStart w:id="50" w:name="_Toc237780442"/>
@@ -19112,7 +19193,7 @@
       </w:pPr>
       <w:bookmarkStart w:id="51" w:name="_Toc237780443"/>
       <w:r>
-        <w:t>7.1. Đối chiếu yêu cầu và kết quả thực hiện</w:t>
+        <w:t>7.1 Đối chiếu yêu cầu và kết quả thực hiện</w:t>
       </w:r>
       <w:bookmarkEnd w:id="51"/>
     </w:p>
@@ -19227,7 +19308,7 @@
       </w:pPr>
       <w:bookmarkStart w:id="52" w:name="_Toc237780444"/>
       <w:r>
-        <w:t>7.2. Hạn chế</w:t>
+        <w:t>7.2 Hạn chế</w:t>
       </w:r>
       <w:bookmarkEnd w:id="52"/>
     </w:p>
@@ -19491,7 +19572,7 @@
       </w:pPr>
       <w:bookmarkStart w:id="53" w:name="_Toc237780445"/>
       <w:r>
-        <w:t>7.3. Hướng phát triển</w:t>
+        <w:t>7.3 Hướng phát triển</w:t>
       </w:r>
       <w:bookmarkEnd w:id="53"/>
     </w:p>
@@ -19637,7 +19718,10 @@
     </w:p>
     <w:p>
       <w:pPr>
-        <w:pStyle w:val="HorizontalLine"/>
+        <w:pStyle w:val="BodyText"/>
+        <w:tabs>
+          <w:tab w:val="left" w:pos="709"/>
+        </w:tabs>
         <w:rPr>
           <w:rFonts w:ascii="Times New Roman" w:hAnsi="Times New Roman" w:cs="Times New Roman"/>
         </w:rPr>
@@ -19851,7 +19935,6 @@
               <w:rPr>
                 <w:rFonts w:ascii="Times New Roman" w:hAnsi="Times New Roman" w:cs="Times New Roman"/>
               </w:rPr>
-              <w:lastRenderedPageBreak/>
               <w:t>Chi-square (bắt buộc vs tự chọn)</w:t>
             </w:r>
           </w:p>

</xml_diff>

<commit_message>
docs: update dashboard description and enhance report details on data filtering and analysis
</commit_message>
<xml_diff>
--- a/report/doc/Bao_cao_cuoi_ky_python_DA.docx
+++ b/report/doc/Bao_cao_cuoi_ky_python_DA.docx
@@ -6754,13 +6754,7 @@
               <w:rPr>
                 <w:rFonts w:ascii="Liberation Mono" w:hAnsi="Liberation Mono"/>
               </w:rPr>
-              <w:t xml:space="preserve">, </w:t>
-            </w:r>
-            <w:r>
-              <w:rPr>
-                <w:rFonts w:ascii="Liberation Mono" w:hAnsi="Liberation Mono"/>
-              </w:rPr>
-              <w:t>main.py</w:t>
+              <w:t>, main.py</w:t>
             </w:r>
           </w:p>
         </w:tc>
@@ -17015,19 +17009,7 @@
         <w:rPr>
           <w:rFonts w:ascii="Times New Roman" w:hAnsi="Times New Roman" w:cs="Times New Roman"/>
         </w:rPr>
-        <w:t xml:space="preserve">(xem </w:t>
-      </w:r>
-      <w:r>
-        <w:rPr>
-          <w:rFonts w:ascii="Times New Roman" w:hAnsi="Times New Roman" w:cs="Times New Roman"/>
-        </w:rPr>
-        <w:t>mục 4.3</w:t>
-      </w:r>
-      <w:r>
-        <w:rPr>
-          <w:rFonts w:ascii="Times New Roman" w:hAnsi="Times New Roman" w:cs="Times New Roman"/>
-        </w:rPr>
-        <w:t>)</w:t>
+        <w:t>(xem mục 4.3)</w:t>
       </w:r>
       <w:r>
         <w:rPr>
@@ -17310,15 +17292,165 @@
       <w:pPr>
         <w:pStyle w:val="BodyText"/>
         <w:rPr>
-          <w:rFonts w:ascii="Times New Roman" w:hAnsi="Times New Roman" w:cs="Times New Roman"/>
-        </w:rPr>
-      </w:pPr>
-      <w:r>
-        <w:rPr>
-          <w:rFonts w:ascii="Times New Roman" w:hAnsi="Times New Roman" w:cs="Times New Roman"/>
-        </w:rPr>
-        <w:t>Ứng dụng dashboard.py được phát triển trên Streamlit, tổ chức thành 6 tab:</w:t>
-      </w:r>
+          <w:lang w:val="vi-VN"/>
+        </w:rPr>
+      </w:pPr>
+      <w:r>
+        <w:rPr>
+          <w:lang w:val="vi-VN"/>
+        </w:rPr>
+        <w:t>Ứng dụng dashboard.py được phát triển trên Streamlit. Khác với việc trình bày lại kết quả đã tính sẵn, dashboard cho phép người dùng định hình lại tập dữ liệu phân tích ngay trong giao diện.</w:t>
+      </w:r>
+    </w:p>
+    <w:p>
+      <w:pPr>
+        <w:pStyle w:val="BodyText"/>
+        <w:rPr>
+          <w:lang w:val="vi-VN"/>
+        </w:rPr>
+      </w:pPr>
+      <w:r>
+        <w:rPr>
+          <w:b/>
+          <w:bCs/>
+          <w:lang w:val="vi-VN"/>
+        </w:rPr>
+        <w:t>Bộ lọc dữ liệu.</w:t>
+      </w:r>
+      <w:r>
+        <w:rPr>
+          <w:lang w:val="vi-VN"/>
+        </w:rPr>
+        <w:t xml:space="preserve"> Thanh bên cung cấp bốn bộ lọc: lớp, vai trò, loại sự kiện và khoảng thời gian. Khi người dùng thay đổi bộ lọc, hệ thống </w:t>
+      </w:r>
+      <w:r>
+        <w:rPr>
+          <w:b/>
+          <w:bCs/>
+          <w:lang w:val="vi-VN"/>
+        </w:rPr>
+        <w:t>dựng lại một đối tượng Club thu gọn</w:t>
+      </w:r>
+      <w:r>
+        <w:rPr>
+          <w:lang w:val="vi-VN"/>
+        </w:rPr>
+        <w:t xml:space="preserve"> chỉ gồm các thành viên và sự kiện được chọn, rồi tính lại toàn bộ phân tích trên tập đó. Do vậy tỉ lệ tham gia, hệ số hồi quy, điểm nguy cơ rời bỏ và cả ba giá trị p đều thay đổi theo bộ lọc, chứ không chỉ ẩn bớt dòng hiển thị.</w:t>
+      </w:r>
+    </w:p>
+    <w:p>
+      <w:pPr>
+        <w:pStyle w:val="BodyText"/>
+        <w:rPr>
+          <w:lang w:val="vi-VN"/>
+        </w:rPr>
+      </w:pPr>
+      <w:r>
+        <w:rPr>
+          <w:lang w:val="vi-VN"/>
+        </w:rPr>
+        <w:t xml:space="preserve">Đáng chú ý, hàm dựng lại này chỉ sử dụng giao diện công khai của lớp Club — các property chỉ đọc members, events, attendance cùng ba phương thức add_member(), add_event(), check_in(). Đây là minh chứng thực tế cho thiết kế đóng gói ở mục 2.2: toàn bộ hệ thống có thể được tái dựng từ bên </w:t>
+      </w:r>
+      <w:r>
+        <w:rPr>
+          <w:lang w:val="vi-VN"/>
+        </w:rPr>
+        <w:lastRenderedPageBreak/>
+        <w:t>ngoài mà không cần truy cập bất kỳ thuộc tính nội bộ nào.</w:t>
+      </w:r>
+    </w:p>
+    <w:p>
+      <w:pPr>
+        <w:pStyle w:val="BodyText"/>
+        <w:rPr>
+          <w:lang w:val="vi-VN"/>
+        </w:rPr>
+      </w:pPr>
+      <w:r>
+        <w:rPr>
+          <w:b/>
+          <w:bCs/>
+          <w:lang w:val="vi-VN"/>
+        </w:rPr>
+        <w:t>Hàng chỉ số tổng quan.</w:t>
+      </w:r>
+      <w:r>
+        <w:rPr>
+          <w:lang w:val="vi-VN"/>
+        </w:rPr>
+        <w:t xml:space="preserve"> Bốn ô chỉ số ở đầu trang hiển thị số thành viên, số sự kiện, tỉ lệ tham gia trung bình và số thành viên thuộc nhóm nguy cơ cao, kèm mức chênh lệch so với toàn bộ dữ liệu.</w:t>
+      </w:r>
+    </w:p>
+    <w:p>
+      <w:pPr>
+        <w:pStyle w:val="BodyText"/>
+        <w:rPr>
+          <w:lang w:val="vi-VN"/>
+        </w:rPr>
+      </w:pPr>
+      <w:r>
+        <w:rPr>
+          <w:b/>
+          <w:bCs/>
+          <w:lang w:val="vi-VN"/>
+        </w:rPr>
+        <w:t>Cảnh báo cỡ mẫu.</w:t>
+      </w:r>
+      <w:r>
+        <w:rPr>
+          <w:lang w:val="vi-VN"/>
+        </w:rPr>
+        <w:t xml:space="preserve"> Vì bộ dữ liệu chỉ có 30 thành viên, việc lọc quá hẹp sẽ khiến z-score và các kiểm định giả thuyết mất ý nghĩa. Khi tập sau lọc còn dưới 12 thành viên hoặc dưới 6 sự kiện, giao diện hiển thị cảnh báo ở đầu trang và ghi chú nhắc lại tại ba tab thống kê. Các kiểm định không đủ điều kiện chạy (ví dụ chi-square khi chỉ còn một loại sự kiện) trả về thông báo giải thích thay vì báo lỗi.</w:t>
+      </w:r>
+    </w:p>
+    <w:p>
+      <w:pPr>
+        <w:pStyle w:val="BodyText"/>
+        <w:rPr>
+          <w:lang w:val="vi-VN"/>
+        </w:rPr>
+      </w:pPr>
+      <w:r>
+        <w:rPr>
+          <w:b/>
+          <w:bCs/>
+          <w:lang w:val="vi-VN"/>
+        </w:rPr>
+        <w:t>Trình bày kết quả kiểm định.</w:t>
+      </w:r>
+      <w:r>
+        <w:rPr>
+          <w:lang w:val="vi-VN"/>
+        </w:rPr>
+        <w:t xml:space="preserve"> Ba kiểm định ở tab 6 được hiển thị dưới dạng thẻ chỉ số kèm nhãn kết luận phân biệt theo màu, thay vì dữ liệu thô, giúp người dùng không có nền tảng thống kê vẫn đọc được kết quả.</w:t>
+      </w:r>
+    </w:p>
+    <w:p>
+      <w:pPr>
+        <w:pStyle w:val="BodyText"/>
+      </w:pPr>
+      <w:r>
+        <w:rPr>
+          <w:b/>
+          <w:bCs/>
+          <w:lang w:val="vi-VN"/>
+        </w:rPr>
+        <w:t>Tối ưu hiệu năng.</w:t>
+      </w:r>
+      <w:r>
+        <w:rPr>
+          <w:lang w:val="vi-VN"/>
+        </w:rPr>
+        <w:t xml:space="preserve"> Đối tượng Club gốc được nạp qua @st.cache_resource nên tệp CSV chỉ đọc một lần cho toàn phiên làm việc. Các biểu đồ Matplotlib được giải phóng sau mỗi lần vẽ (clear_figure=True), tránh tích lũy bộ nhớ khi người dùng thao tác liên tục với bộ lọc.</w:t>
+      </w:r>
+    </w:p>
+    <w:p>
+      <w:pPr>
+        <w:pStyle w:val="BodyText"/>
+        <w:rPr>
+          <w:lang w:val="vi-VN"/>
+        </w:rPr>
+      </w:pPr>
     </w:p>
     <w:tbl>
       <w:tblPr>
@@ -17609,7 +17741,6 @@
               <w:rPr>
                 <w:rFonts w:ascii="Times New Roman" w:hAnsi="Times New Roman" w:cs="Times New Roman"/>
               </w:rPr>
-              <w:lastRenderedPageBreak/>
               <w:t>5. Bản đồ nhiệt</w:t>
             </w:r>
           </w:p>
@@ -17704,59 +17835,17 @@
           <w:rFonts w:ascii="Times New Roman" w:hAnsi="Times New Roman" w:cs="Times New Roman"/>
         </w:rPr>
       </w:pPr>
-      <w:r>
-        <w:rPr>
-          <w:rFonts w:ascii="Times New Roman" w:hAnsi="Times New Roman" w:cs="Times New Roman"/>
-          <w:b/>
-        </w:rPr>
-        <w:t>Tối ưu hiệu năng.</w:t>
-      </w:r>
-      <w:r>
-        <w:rPr>
-          <w:rFonts w:ascii="Times New Roman" w:hAnsi="Times New Roman" w:cs="Times New Roman"/>
-        </w:rPr>
-        <w:t xml:space="preserve"> Đối tượng Club được nạp qua hàm có decorator @st.cache_resource, nhờ vậy ứng dụng không đọc lại tệp CSV mỗi khi người dùng thay đổi bộ lọc tương tác.</w:t>
-      </w:r>
-    </w:p>
-    <w:p>
-      <w:pPr>
-        <w:pStyle w:val="BodyText"/>
-        <w:rPr>
-          <w:rFonts w:ascii="Times New Roman" w:hAnsi="Times New Roman" w:cs="Times New Roman"/>
-        </w:rPr>
-      </w:pPr>
-      <w:r>
-        <w:rPr>
-          <w:rFonts w:ascii="Times New Roman" w:hAnsi="Times New Roman" w:cs="Times New Roman"/>
-          <w:b/>
-        </w:rPr>
-        <w:t>Ghi chú thiết kế.</w:t>
-      </w:r>
-      <w:r>
-        <w:rPr>
-          <w:rFonts w:ascii="Times New Roman" w:hAnsi="Times New Roman" w:cs="Times New Roman"/>
-        </w:rPr>
-        <w:t xml:space="preserve"> Tab 1 hiển thị bảng tỉ lệ theo lớp kèm dòng chú thích nêu rõ chênh lệch giữa các lớp không có ý nghĩa thống kê. Đây là lựa chọn có chủ đích: một bảng số liệu được sắp xếp luôn tạo cảm giác có thứ hạng, và chú thích này ngăn người dùng rút ra kết luận sai từ dữ liệu nhiễu.</w:t>
-      </w:r>
       <w:bookmarkStart w:id="45" w:name="_Toc237780437"/>
-    </w:p>
-    <w:p>
-      <w:pPr>
-        <w:pStyle w:val="BodyText"/>
-        <w:rPr>
-          <w:rFonts w:ascii="Times New Roman" w:hAnsi="Times New Roman" w:cs="Times New Roman"/>
-        </w:rPr>
-      </w:pPr>
-      <w:r>
-        <w:rPr>
-          <w:rFonts w:ascii="Times New Roman" w:hAnsi="Times New Roman" w:cs="Times New Roman"/>
-          <w:noProof/>
-        </w:rPr>
+      <w:r>
+        <w:rPr>
+          <w:rFonts w:ascii="Times New Roman" w:hAnsi="Times New Roman" w:cs="Times New Roman"/>
+        </w:rPr>
+        <w:lastRenderedPageBreak/>
         <w:drawing>
-          <wp:inline distT="0" distB="0" distL="0" distR="0" wp14:anchorId="73C050CA" wp14:editId="5C32BAC4">
-            <wp:extent cx="6120130" cy="4371340"/>
-            <wp:effectExtent l="0" t="0" r="0" b="0"/>
-            <wp:docPr id="15" name="Picture 15"/>
+          <wp:inline distT="0" distB="0" distL="0" distR="0" wp14:anchorId="51827C6B" wp14:editId="36151AD1">
+            <wp:extent cx="6120130" cy="3077845"/>
+            <wp:effectExtent l="0" t="0" r="0" b="8255"/>
+            <wp:docPr id="3" name="Picture 3"/>
             <wp:cNvGraphicFramePr>
               <a:graphicFrameLocks xmlns:a="http://schemas.openxmlformats.org/drawingml/2006/main" noChangeAspect="1"/>
             </wp:cNvGraphicFramePr>
@@ -17776,56 +17865,7 @@
                   <pic:spPr>
                     <a:xfrm>
                       <a:off x="0" y="0"/>
-                      <a:ext cx="6120130" cy="4371340"/>
-                    </a:xfrm>
-                    <a:prstGeom prst="rect">
-                      <a:avLst/>
-                    </a:prstGeom>
-                  </pic:spPr>
-                </pic:pic>
-              </a:graphicData>
-            </a:graphic>
-          </wp:inline>
-        </w:drawing>
-      </w:r>
-    </w:p>
-    <w:p>
-      <w:pPr>
-        <w:pStyle w:val="BodyText"/>
-        <w:rPr>
-          <w:rFonts w:ascii="Times New Roman" w:hAnsi="Times New Roman" w:cs="Times New Roman"/>
-        </w:rPr>
-      </w:pPr>
-      <w:r>
-        <w:rPr>
-          <w:noProof/>
-        </w:rPr>
-        <w:lastRenderedPageBreak/>
-        <w:drawing>
-          <wp:inline distT="0" distB="0" distL="0" distR="0" wp14:anchorId="705D025D" wp14:editId="2B65A961">
-            <wp:extent cx="6120130" cy="3112770"/>
-            <wp:effectExtent l="0" t="0" r="0" b="0"/>
-            <wp:docPr id="14" name="Picture 14"/>
-            <wp:cNvGraphicFramePr>
-              <a:graphicFrameLocks xmlns:a="http://schemas.openxmlformats.org/drawingml/2006/main" noChangeAspect="1"/>
-            </wp:cNvGraphicFramePr>
-            <a:graphic xmlns:a="http://schemas.openxmlformats.org/drawingml/2006/main">
-              <a:graphicData uri="http://schemas.openxmlformats.org/drawingml/2006/picture">
-                <pic:pic xmlns:pic="http://schemas.openxmlformats.org/drawingml/2006/picture">
-                  <pic:nvPicPr>
-                    <pic:cNvPr id="1" name=""/>
-                    <pic:cNvPicPr/>
-                  </pic:nvPicPr>
-                  <pic:blipFill>
-                    <a:blip r:embed="rId17"/>
-                    <a:stretch>
-                      <a:fillRect/>
-                    </a:stretch>
-                  </pic:blipFill>
-                  <pic:spPr>
-                    <a:xfrm>
-                      <a:off x="0" y="0"/>
-                      <a:ext cx="6120130" cy="3112770"/>
+                      <a:ext cx="6120130" cy="3077845"/>
                     </a:xfrm>
                     <a:prstGeom prst="rect">
                       <a:avLst/>
@@ -19299,7 +19339,27 @@
         <w:rPr>
           <w:rFonts w:ascii="Times New Roman" w:hAnsi="Times New Roman" w:cs="Times New Roman"/>
         </w:rPr>
-        <w:t> Dashboard Streamlit 6 tab (mục 5.2), bộ kiểm thử 8 ca với CI tự động (chương 6), báo cáo này.</w:t>
+        <w:t xml:space="preserve"> Dashboard Streamlit 6 tab </w:t>
+      </w:r>
+      <w:r>
+        <w:rPr>
+          <w:rFonts w:ascii="Times New Roman" w:hAnsi="Times New Roman" w:cs="Times New Roman"/>
+          <w:lang w:val="vi-VN"/>
+        </w:rPr>
+        <w:t>với bộ lọc tương tác tái tính toàn bộ phân tích qua giao diện công khai của lớp Club</w:t>
+      </w:r>
+      <w:r>
+        <w:rPr>
+          <w:rFonts w:ascii="Times New Roman" w:hAnsi="Times New Roman" w:cs="Times New Roman"/>
+          <w:lang w:val="vi-VN"/>
+        </w:rPr>
+        <w:t xml:space="preserve"> </w:t>
+      </w:r>
+      <w:r>
+        <w:rPr>
+          <w:rFonts w:ascii="Times New Roman" w:hAnsi="Times New Roman" w:cs="Times New Roman"/>
+        </w:rPr>
+        <w:t>(mục 5.2), bộ kiểm thử 8 ca với CI tự động (chương 6), báo cáo này.</w:t>
       </w:r>
     </w:p>
     <w:p>
@@ -19463,7 +19523,14 @@
         <w:rPr>
           <w:rFonts w:ascii="Times New Roman" w:hAnsi="Times New Roman" w:cs="Times New Roman"/>
         </w:rPr>
-        <w:t>Nhóm nguy cơ trong phân tích sức giữ chân chỉ gồm 7–8 người tại mỗi thời điểm, khiến các chỉ số retention_lift có sai số lớn.</w:t>
+        <w:t xml:space="preserve">Nhóm nguy cơ trong phân tích sức giữ chân chỉ gồm 7–8 người tại mỗi thời điểm, khiến các </w:t>
+      </w:r>
+      <w:r>
+        <w:rPr>
+          <w:rFonts w:ascii="Times New Roman" w:hAnsi="Times New Roman" w:cs="Times New Roman"/>
+        </w:rPr>
+        <w:lastRenderedPageBreak/>
+        <w:t>chỉ số retention_lift có sai số lớn.</w:t>
       </w:r>
     </w:p>
     <w:p>
@@ -19478,7 +19545,6 @@
           <w:rFonts w:ascii="Times New Roman" w:hAnsi="Times New Roman" w:cs="Times New Roman"/>
           <w:b/>
         </w:rPr>
-        <w:lastRenderedPageBreak/>
         <w:t>Hạn chế kỹ thuật.</w:t>
       </w:r>
     </w:p>
@@ -19854,7 +19920,14 @@
               <w:rPr>
                 <w:rFonts w:ascii="Times New Roman" w:hAnsi="Times New Roman" w:cs="Times New Roman"/>
               </w:rPr>
-              <w:t>β₁ = 0.211 thành viên/ngày, r = 0.909, R² = 0.827, p &lt; 0.001</w:t>
+              <w:t xml:space="preserve">β₁ = 0.211 thành viên/ngày, r = 0.909, R² = </w:t>
+            </w:r>
+            <w:r>
+              <w:rPr>
+                <w:rFonts w:ascii="Times New Roman" w:hAnsi="Times New Roman" w:cs="Times New Roman"/>
+              </w:rPr>
+              <w:lastRenderedPageBreak/>
+              <w:t>0.827, p &lt; 0.001</w:t>
             </w:r>
           </w:p>
         </w:tc>
@@ -19879,6 +19952,7 @@
               <w:rPr>
                 <w:rFonts w:ascii="Times New Roman" w:hAnsi="Times New Roman" w:cs="Times New Roman"/>
               </w:rPr>
+              <w:lastRenderedPageBreak/>
               <w:t>Kruskal–Wallis (theo lớp)</w:t>
             </w:r>
           </w:p>
@@ -19903,14 +19977,7 @@
               <w:rPr>
                 <w:rFonts w:ascii="Times New Roman" w:hAnsi="Times New Roman" w:cs="Times New Roman"/>
               </w:rPr>
-              <w:t xml:space="preserve">statistic = 1.4340, p = 0.8383 — không có ý </w:t>
-            </w:r>
-            <w:r>
-              <w:rPr>
-                <w:rFonts w:ascii="Times New Roman" w:hAnsi="Times New Roman" w:cs="Times New Roman"/>
-              </w:rPr>
-              <w:lastRenderedPageBreak/>
-              <w:t>nghĩa thống kê</w:t>
+              <w:t>statistic = 1.4340, p = 0.8383 — không có ý nghĩa thống kê</w:t>
             </w:r>
           </w:p>
         </w:tc>
@@ -20524,7 +20591,7 @@
           <w:lang w:val="en-US"/>
         </w:rPr>
       </w:pPr>
-      <w:hyperlink r:id="rId18" w:history="1">
+      <w:hyperlink r:id="rId17" w:history="1">
         <w:r>
           <w:rPr>
             <w:rStyle w:val="Hyperlink"/>
@@ -20534,7 +20601,7 @@
       </w:hyperlink>
     </w:p>
     <w:sectPr>
-      <w:footerReference w:type="default" r:id="rId19"/>
+      <w:footerReference w:type="default" r:id="rId18"/>
       <w:pgSz w:w="11906" w:h="16838"/>
       <w:pgMar w:top="1134" w:right="1134" w:bottom="1134" w:left="1134" w:header="720" w:footer="720" w:gutter="0"/>
       <w:pgBorders w:zOrder="back" w:display="firstPage">

</xml_diff>